<commit_message>
bắt đầu làm quy trình nghiệp vụ
</commit_message>
<xml_diff>
--- a/Document/Expense Tracker SRS.docx
+++ b/Document/Expense Tracker SRS.docx
@@ -1624,6 +1624,846 @@
           </w:p>
         </w:tc>
       </w:tr>
+      <w:tr>
+        <w:tc>
+          <w:tcPr>
+            <w:tcW w:w="4675" w:type="dxa"/>
+          </w:tcPr>
+          <w:p>
+            <w:pPr>
+              <w:tabs>
+                <w:tab w:val="left" w:pos="1632"/>
+              </w:tabs>
+              <w:rPr>
+                <w:rFonts w:ascii="Arial" w:hAnsi="Arial" w:cs="Arial"/>
+                <w:sz w:val="28"/>
+                <w:szCs w:val="28"/>
+              </w:rPr>
+            </w:pPr>
+            <w:r>
+              <w:rPr>
+                <w:rFonts w:ascii="Arial" w:hAnsi="Arial" w:cs="Arial"/>
+                <w:sz w:val="28"/>
+                <w:szCs w:val="28"/>
+              </w:rPr>
+              <w:t>BP</w:t>
+            </w:r>
+          </w:p>
+        </w:tc>
+        <w:tc>
+          <w:tcPr>
+            <w:tcW w:w="4675" w:type="dxa"/>
+          </w:tcPr>
+          <w:p>
+            <w:pPr>
+              <w:rPr>
+                <w:rFonts w:ascii="Arial" w:hAnsi="Arial" w:cs="Arial"/>
+                <w:sz w:val="28"/>
+                <w:szCs w:val="28"/>
+              </w:rPr>
+            </w:pPr>
+            <w:r>
+              <w:rPr>
+                <w:rFonts w:ascii="Arial" w:hAnsi="Arial" w:cs="Arial"/>
+                <w:sz w:val="28"/>
+                <w:szCs w:val="28"/>
+              </w:rPr>
+              <w:t>Đại diện cho “Business Process”. Mang ý nghĩa Quy trình nghiệp vụ.</w:t>
+            </w:r>
+          </w:p>
+        </w:tc>
+      </w:tr>
+      <w:tr>
+        <w:tc>
+          <w:tcPr>
+            <w:tcW w:w="4675" w:type="dxa"/>
+          </w:tcPr>
+          <w:p>
+            <w:pPr>
+              <w:tabs>
+                <w:tab w:val="left" w:pos="1632"/>
+              </w:tabs>
+              <w:rPr>
+                <w:rFonts w:ascii="Arial" w:hAnsi="Arial" w:cs="Arial"/>
+                <w:sz w:val="28"/>
+                <w:szCs w:val="28"/>
+              </w:rPr>
+            </w:pPr>
+            <w:r>
+              <w:rPr>
+                <w:rFonts w:ascii="Arial" w:hAnsi="Arial" w:cs="Arial"/>
+                <w:sz w:val="28"/>
+                <w:szCs w:val="28"/>
+              </w:rPr>
+              <w:t>BP-ACC-&lt;num&gt;</w:t>
+            </w:r>
+          </w:p>
+        </w:tc>
+        <w:tc>
+          <w:tcPr>
+            <w:tcW w:w="4675" w:type="dxa"/>
+          </w:tcPr>
+          <w:p>
+            <w:pPr>
+              <w:rPr>
+                <w:rFonts w:ascii="Arial" w:hAnsi="Arial" w:cs="Arial"/>
+                <w:sz w:val="28"/>
+                <w:szCs w:val="28"/>
+              </w:rPr>
+            </w:pPr>
+            <w:r>
+              <w:rPr>
+                <w:rFonts w:ascii="Arial" w:hAnsi="Arial" w:cs="Arial"/>
+                <w:sz w:val="28"/>
+                <w:szCs w:val="28"/>
+              </w:rPr>
+              <w:t>Đại diện cho các quy trình nghiệp vụ liên quan đến tài khoản</w:t>
+            </w:r>
+            <w:r>
+              <w:rPr>
+                <w:rFonts w:ascii="Arial" w:hAnsi="Arial" w:cs="Arial"/>
+                <w:sz w:val="28"/>
+                <w:szCs w:val="28"/>
+              </w:rPr>
+              <w:t>.</w:t>
+            </w:r>
+          </w:p>
+        </w:tc>
+      </w:tr>
+      <w:tr>
+        <w:tc>
+          <w:tcPr>
+            <w:tcW w:w="4675" w:type="dxa"/>
+          </w:tcPr>
+          <w:p>
+            <w:pPr>
+              <w:tabs>
+                <w:tab w:val="left" w:pos="1632"/>
+              </w:tabs>
+              <w:rPr>
+                <w:rFonts w:ascii="Arial" w:hAnsi="Arial" w:cs="Arial"/>
+                <w:sz w:val="28"/>
+                <w:szCs w:val="28"/>
+              </w:rPr>
+            </w:pPr>
+            <w:r>
+              <w:rPr>
+                <w:rFonts w:ascii="Arial" w:hAnsi="Arial" w:cs="Arial"/>
+                <w:sz w:val="28"/>
+                <w:szCs w:val="28"/>
+              </w:rPr>
+              <w:t>BP-ET-&lt;num&gt;</w:t>
+            </w:r>
+          </w:p>
+        </w:tc>
+        <w:tc>
+          <w:tcPr>
+            <w:tcW w:w="4675" w:type="dxa"/>
+          </w:tcPr>
+          <w:p>
+            <w:pPr>
+              <w:rPr>
+                <w:rFonts w:ascii="Arial" w:hAnsi="Arial" w:cs="Arial"/>
+                <w:sz w:val="28"/>
+                <w:szCs w:val="28"/>
+              </w:rPr>
+            </w:pPr>
+            <w:r>
+              <w:rPr>
+                <w:rFonts w:ascii="Arial" w:hAnsi="Arial" w:cs="Arial"/>
+                <w:sz w:val="28"/>
+                <w:szCs w:val="28"/>
+              </w:rPr>
+              <w:t>Đại diện cho các quy trình nghiệp vụ liên quan đến Quản Lý Chi Tiêu</w:t>
+            </w:r>
+          </w:p>
+        </w:tc>
+      </w:tr>
+      <w:tr>
+        <w:tc>
+          <w:tcPr>
+            <w:tcW w:w="4675" w:type="dxa"/>
+          </w:tcPr>
+          <w:p>
+            <w:pPr>
+              <w:tabs>
+                <w:tab w:val="left" w:pos="1632"/>
+              </w:tabs>
+              <w:rPr>
+                <w:rFonts w:ascii="Arial" w:hAnsi="Arial" w:cs="Arial"/>
+                <w:sz w:val="28"/>
+                <w:szCs w:val="28"/>
+              </w:rPr>
+            </w:pPr>
+            <w:r>
+              <w:rPr>
+                <w:rFonts w:ascii="Arial" w:hAnsi="Arial" w:cs="Arial"/>
+                <w:sz w:val="28"/>
+                <w:szCs w:val="28"/>
+              </w:rPr>
+              <w:t>BP-CATE</w:t>
+            </w:r>
+            <w:r>
+              <w:rPr>
+                <w:rFonts w:ascii="Arial" w:hAnsi="Arial" w:cs="Arial"/>
+                <w:sz w:val="28"/>
+                <w:szCs w:val="28"/>
+              </w:rPr>
+              <w:t>-&lt;num&gt;</w:t>
+            </w:r>
+          </w:p>
+        </w:tc>
+        <w:tc>
+          <w:tcPr>
+            <w:tcW w:w="4675" w:type="dxa"/>
+          </w:tcPr>
+          <w:p>
+            <w:pPr>
+              <w:rPr>
+                <w:rFonts w:ascii="Arial" w:hAnsi="Arial" w:cs="Arial"/>
+                <w:sz w:val="28"/>
+                <w:szCs w:val="28"/>
+              </w:rPr>
+            </w:pPr>
+            <w:r>
+              <w:rPr>
+                <w:rFonts w:ascii="Arial" w:hAnsi="Arial" w:cs="Arial"/>
+                <w:sz w:val="28"/>
+                <w:szCs w:val="28"/>
+              </w:rPr>
+              <w:t>Đại diện cho các quy trình nghiệp vụ liên quan đến Quản Lý Danh Mục Chi Tiêu</w:t>
+            </w:r>
+          </w:p>
+        </w:tc>
+      </w:tr>
+      <w:tr>
+        <w:tc>
+          <w:tcPr>
+            <w:tcW w:w="4675" w:type="dxa"/>
+          </w:tcPr>
+          <w:p>
+            <w:pPr>
+              <w:tabs>
+                <w:tab w:val="left" w:pos="1632"/>
+              </w:tabs>
+              <w:rPr>
+                <w:rFonts w:ascii="Arial" w:hAnsi="Arial" w:cs="Arial"/>
+                <w:sz w:val="28"/>
+                <w:szCs w:val="28"/>
+              </w:rPr>
+            </w:pPr>
+            <w:r>
+              <w:rPr>
+                <w:rFonts w:ascii="Arial" w:hAnsi="Arial" w:cs="Arial"/>
+                <w:sz w:val="28"/>
+                <w:szCs w:val="28"/>
+              </w:rPr>
+              <w:t>BP-IT</w:t>
+            </w:r>
+            <w:r>
+              <w:rPr>
+                <w:rFonts w:ascii="Arial" w:hAnsi="Arial" w:cs="Arial"/>
+                <w:sz w:val="28"/>
+                <w:szCs w:val="28"/>
+              </w:rPr>
+              <w:t>-&lt;num&gt;</w:t>
+            </w:r>
+          </w:p>
+        </w:tc>
+        <w:tc>
+          <w:tcPr>
+            <w:tcW w:w="4675" w:type="dxa"/>
+          </w:tcPr>
+          <w:p>
+            <w:pPr>
+              <w:rPr>
+                <w:rFonts w:ascii="Arial" w:hAnsi="Arial" w:cs="Arial"/>
+                <w:sz w:val="28"/>
+                <w:szCs w:val="28"/>
+              </w:rPr>
+            </w:pPr>
+            <w:r>
+              <w:rPr>
+                <w:rFonts w:ascii="Arial" w:hAnsi="Arial" w:cs="Arial"/>
+                <w:sz w:val="28"/>
+                <w:szCs w:val="28"/>
+              </w:rPr>
+              <w:t xml:space="preserve">Đại diện cho </w:t>
+            </w:r>
+            <w:r>
+              <w:rPr>
+                <w:rFonts w:ascii="Arial" w:hAnsi="Arial" w:cs="Arial"/>
+                <w:sz w:val="28"/>
+                <w:szCs w:val="28"/>
+              </w:rPr>
+              <w:t>các</w:t>
+            </w:r>
+            <w:r>
+              <w:rPr>
+                <w:rFonts w:ascii="Arial" w:hAnsi="Arial" w:cs="Arial"/>
+                <w:sz w:val="28"/>
+                <w:szCs w:val="28"/>
+              </w:rPr>
+              <w:t xml:space="preserve"> quy trình nghiệp vụ liên quan đến Quản Lý Thu Nhập</w:t>
+            </w:r>
+          </w:p>
+        </w:tc>
+      </w:tr>
+      <w:tr>
+        <w:tc>
+          <w:tcPr>
+            <w:tcW w:w="4675" w:type="dxa"/>
+          </w:tcPr>
+          <w:p>
+            <w:pPr>
+              <w:tabs>
+                <w:tab w:val="left" w:pos="1632"/>
+              </w:tabs>
+              <w:rPr>
+                <w:rFonts w:ascii="Arial" w:hAnsi="Arial" w:cs="Arial"/>
+                <w:sz w:val="28"/>
+                <w:szCs w:val="28"/>
+              </w:rPr>
+            </w:pPr>
+            <w:r>
+              <w:rPr>
+                <w:rFonts w:ascii="Arial" w:hAnsi="Arial" w:cs="Arial"/>
+                <w:sz w:val="28"/>
+                <w:szCs w:val="28"/>
+              </w:rPr>
+              <w:t>BP-CA</w:t>
+            </w:r>
+            <w:r>
+              <w:rPr>
+                <w:rFonts w:ascii="Arial" w:hAnsi="Arial" w:cs="Arial"/>
+                <w:sz w:val="28"/>
+                <w:szCs w:val="28"/>
+              </w:rPr>
+              <w:t>TI</w:t>
+            </w:r>
+            <w:r>
+              <w:rPr>
+                <w:rFonts w:ascii="Arial" w:hAnsi="Arial" w:cs="Arial"/>
+                <w:sz w:val="28"/>
+                <w:szCs w:val="28"/>
+              </w:rPr>
+              <w:t>-&lt;num&gt;</w:t>
+            </w:r>
+          </w:p>
+        </w:tc>
+        <w:tc>
+          <w:tcPr>
+            <w:tcW w:w="4675" w:type="dxa"/>
+          </w:tcPr>
+          <w:p>
+            <w:pPr>
+              <w:rPr>
+                <w:rFonts w:ascii="Arial" w:hAnsi="Arial" w:cs="Arial"/>
+                <w:sz w:val="28"/>
+                <w:szCs w:val="28"/>
+              </w:rPr>
+            </w:pPr>
+            <w:r>
+              <w:rPr>
+                <w:rFonts w:ascii="Arial" w:hAnsi="Arial" w:cs="Arial"/>
+                <w:sz w:val="28"/>
+                <w:szCs w:val="28"/>
+              </w:rPr>
+              <w:t>Đại diện cho các quy trình nghiệp vụ liên quan đến Quản Lý Danh Mục Thu Nhập</w:t>
+            </w:r>
+          </w:p>
+        </w:tc>
+      </w:tr>
+      <w:tr>
+        <w:tc>
+          <w:tcPr>
+            <w:tcW w:w="4675" w:type="dxa"/>
+          </w:tcPr>
+          <w:p>
+            <w:pPr>
+              <w:tabs>
+                <w:tab w:val="left" w:pos="1632"/>
+              </w:tabs>
+              <w:rPr>
+                <w:rFonts w:ascii="Arial" w:hAnsi="Arial" w:cs="Arial"/>
+                <w:sz w:val="28"/>
+                <w:szCs w:val="28"/>
+              </w:rPr>
+            </w:pPr>
+            <w:r>
+              <w:rPr>
+                <w:rFonts w:ascii="Arial" w:hAnsi="Arial" w:cs="Arial"/>
+                <w:sz w:val="28"/>
+                <w:szCs w:val="28"/>
+              </w:rPr>
+              <w:lastRenderedPageBreak/>
+              <w:t>BP-SM</w:t>
+            </w:r>
+            <w:r>
+              <w:rPr>
+                <w:rFonts w:ascii="Arial" w:hAnsi="Arial" w:cs="Arial"/>
+                <w:sz w:val="28"/>
+                <w:szCs w:val="28"/>
+              </w:rPr>
+              <w:t>-&lt;num&gt;</w:t>
+            </w:r>
+          </w:p>
+        </w:tc>
+        <w:tc>
+          <w:tcPr>
+            <w:tcW w:w="4675" w:type="dxa"/>
+          </w:tcPr>
+          <w:p>
+            <w:pPr>
+              <w:rPr>
+                <w:rFonts w:ascii="Arial" w:hAnsi="Arial" w:cs="Arial"/>
+                <w:sz w:val="28"/>
+                <w:szCs w:val="28"/>
+              </w:rPr>
+            </w:pPr>
+            <w:r>
+              <w:rPr>
+                <w:rFonts w:ascii="Arial" w:hAnsi="Arial" w:cs="Arial"/>
+                <w:sz w:val="28"/>
+                <w:szCs w:val="28"/>
+              </w:rPr>
+              <w:t>Đại diện cho các quy trình nghiệp vụ liên quan đến Quản Lý Nguồn Tiền</w:t>
+            </w:r>
+          </w:p>
+        </w:tc>
+      </w:tr>
+      <w:tr>
+        <w:tc>
+          <w:tcPr>
+            <w:tcW w:w="4675" w:type="dxa"/>
+          </w:tcPr>
+          <w:p>
+            <w:pPr>
+              <w:tabs>
+                <w:tab w:val="left" w:pos="1632"/>
+              </w:tabs>
+              <w:rPr>
+                <w:rFonts w:ascii="Arial" w:hAnsi="Arial" w:cs="Arial"/>
+                <w:sz w:val="28"/>
+                <w:szCs w:val="28"/>
+              </w:rPr>
+            </w:pPr>
+            <w:r>
+              <w:rPr>
+                <w:rFonts w:ascii="Arial" w:hAnsi="Arial" w:cs="Arial"/>
+                <w:sz w:val="28"/>
+                <w:szCs w:val="28"/>
+              </w:rPr>
+              <w:t>BP-TF</w:t>
+            </w:r>
+            <w:r>
+              <w:rPr>
+                <w:rFonts w:ascii="Arial" w:hAnsi="Arial" w:cs="Arial"/>
+                <w:sz w:val="28"/>
+                <w:szCs w:val="28"/>
+              </w:rPr>
+              <w:t>-&lt;num&gt;</w:t>
+            </w:r>
+          </w:p>
+        </w:tc>
+        <w:tc>
+          <w:tcPr>
+            <w:tcW w:w="4675" w:type="dxa"/>
+          </w:tcPr>
+          <w:p>
+            <w:pPr>
+              <w:rPr>
+                <w:rFonts w:ascii="Arial" w:hAnsi="Arial" w:cs="Arial"/>
+                <w:sz w:val="28"/>
+                <w:szCs w:val="28"/>
+              </w:rPr>
+            </w:pPr>
+            <w:r>
+              <w:rPr>
+                <w:rFonts w:ascii="Arial" w:hAnsi="Arial" w:cs="Arial"/>
+                <w:sz w:val="28"/>
+                <w:szCs w:val="28"/>
+              </w:rPr>
+              <w:t>Đại diện cho các quy trình nghiệp vụ liên quan đến Chuyển Tiền Nội Bộ</w:t>
+            </w:r>
+          </w:p>
+        </w:tc>
+      </w:tr>
+      <w:tr>
+        <w:tc>
+          <w:tcPr>
+            <w:tcW w:w="4675" w:type="dxa"/>
+          </w:tcPr>
+          <w:p>
+            <w:pPr>
+              <w:tabs>
+                <w:tab w:val="left" w:pos="1632"/>
+              </w:tabs>
+              <w:rPr>
+                <w:rFonts w:ascii="Arial" w:hAnsi="Arial" w:cs="Arial"/>
+                <w:sz w:val="28"/>
+                <w:szCs w:val="28"/>
+              </w:rPr>
+            </w:pPr>
+            <w:r>
+              <w:rPr>
+                <w:rFonts w:ascii="Arial" w:hAnsi="Arial" w:cs="Arial"/>
+                <w:sz w:val="28"/>
+                <w:szCs w:val="28"/>
+              </w:rPr>
+              <w:t>BP-BUD</w:t>
+            </w:r>
+            <w:r>
+              <w:rPr>
+                <w:rFonts w:ascii="Arial" w:hAnsi="Arial" w:cs="Arial"/>
+                <w:sz w:val="28"/>
+                <w:szCs w:val="28"/>
+              </w:rPr>
+              <w:t>-&lt;num&gt;</w:t>
+            </w:r>
+          </w:p>
+        </w:tc>
+        <w:tc>
+          <w:tcPr>
+            <w:tcW w:w="4675" w:type="dxa"/>
+          </w:tcPr>
+          <w:p>
+            <w:pPr>
+              <w:rPr>
+                <w:rFonts w:ascii="Arial" w:hAnsi="Arial" w:cs="Arial"/>
+                <w:sz w:val="28"/>
+                <w:szCs w:val="28"/>
+              </w:rPr>
+            </w:pPr>
+            <w:r>
+              <w:rPr>
+                <w:rFonts w:ascii="Arial" w:hAnsi="Arial" w:cs="Arial"/>
+                <w:sz w:val="28"/>
+                <w:szCs w:val="28"/>
+              </w:rPr>
+              <w:t>Đại diện cho các quy trình nghiệp vụ liên quan đến Quản Lý Ngân Sách</w:t>
+            </w:r>
+          </w:p>
+        </w:tc>
+      </w:tr>
+      <w:tr>
+        <w:tc>
+          <w:tcPr>
+            <w:tcW w:w="4675" w:type="dxa"/>
+          </w:tcPr>
+          <w:p>
+            <w:pPr>
+              <w:tabs>
+                <w:tab w:val="left" w:pos="1632"/>
+              </w:tabs>
+              <w:rPr>
+                <w:rFonts w:ascii="Arial" w:hAnsi="Arial" w:cs="Arial"/>
+                <w:sz w:val="28"/>
+                <w:szCs w:val="28"/>
+              </w:rPr>
+            </w:pPr>
+            <w:r>
+              <w:rPr>
+                <w:rFonts w:ascii="Arial" w:hAnsi="Arial" w:cs="Arial"/>
+                <w:sz w:val="28"/>
+                <w:szCs w:val="28"/>
+              </w:rPr>
+              <w:t>BP-RE</w:t>
+            </w:r>
+            <w:r>
+              <w:rPr>
+                <w:rFonts w:ascii="Arial" w:hAnsi="Arial" w:cs="Arial"/>
+                <w:sz w:val="28"/>
+                <w:szCs w:val="28"/>
+              </w:rPr>
+              <w:t>-&lt;num&gt;</w:t>
+            </w:r>
+          </w:p>
+        </w:tc>
+        <w:tc>
+          <w:tcPr>
+            <w:tcW w:w="4675" w:type="dxa"/>
+          </w:tcPr>
+          <w:p>
+            <w:pPr>
+              <w:rPr>
+                <w:rFonts w:ascii="Arial" w:hAnsi="Arial" w:cs="Arial"/>
+                <w:sz w:val="28"/>
+                <w:szCs w:val="28"/>
+              </w:rPr>
+            </w:pPr>
+            <w:r>
+              <w:rPr>
+                <w:rFonts w:ascii="Arial" w:hAnsi="Arial" w:cs="Arial"/>
+                <w:sz w:val="28"/>
+                <w:szCs w:val="28"/>
+              </w:rPr>
+              <w:t>Đại diện cho các quy trình nghiệp vụ liên quan đến Quản Lý Chi Phí Cố Định</w:t>
+            </w:r>
+          </w:p>
+        </w:tc>
+      </w:tr>
+      <w:tr>
+        <w:tc>
+          <w:tcPr>
+            <w:tcW w:w="4675" w:type="dxa"/>
+          </w:tcPr>
+          <w:p>
+            <w:pPr>
+              <w:tabs>
+                <w:tab w:val="left" w:pos="1632"/>
+              </w:tabs>
+              <w:rPr>
+                <w:rFonts w:ascii="Arial" w:hAnsi="Arial" w:cs="Arial"/>
+                <w:sz w:val="28"/>
+                <w:szCs w:val="28"/>
+              </w:rPr>
+            </w:pPr>
+            <w:r>
+              <w:rPr>
+                <w:rFonts w:ascii="Arial" w:hAnsi="Arial" w:cs="Arial"/>
+                <w:sz w:val="28"/>
+                <w:szCs w:val="28"/>
+              </w:rPr>
+              <w:t>BP-SRP</w:t>
+            </w:r>
+            <w:r>
+              <w:rPr>
+                <w:rFonts w:ascii="Arial" w:hAnsi="Arial" w:cs="Arial"/>
+                <w:sz w:val="28"/>
+                <w:szCs w:val="28"/>
+              </w:rPr>
+              <w:t>-&lt;num&gt;</w:t>
+            </w:r>
+          </w:p>
+        </w:tc>
+        <w:tc>
+          <w:tcPr>
+            <w:tcW w:w="4675" w:type="dxa"/>
+          </w:tcPr>
+          <w:p>
+            <w:pPr>
+              <w:rPr>
+                <w:rFonts w:ascii="Arial" w:hAnsi="Arial" w:cs="Arial"/>
+                <w:sz w:val="28"/>
+                <w:szCs w:val="28"/>
+              </w:rPr>
+            </w:pPr>
+            <w:r>
+              <w:rPr>
+                <w:rFonts w:ascii="Arial" w:hAnsi="Arial" w:cs="Arial"/>
+                <w:sz w:val="28"/>
+                <w:szCs w:val="28"/>
+              </w:rPr>
+              <w:t>Đại diện cho các quy trình nghiệp vụ liên quan đến Thống Kê và Báo Cáo</w:t>
+            </w:r>
+          </w:p>
+        </w:tc>
+      </w:tr>
+      <w:tr>
+        <w:tc>
+          <w:tcPr>
+            <w:tcW w:w="4675" w:type="dxa"/>
+          </w:tcPr>
+          <w:p>
+            <w:pPr>
+              <w:tabs>
+                <w:tab w:val="left" w:pos="1632"/>
+              </w:tabs>
+              <w:rPr>
+                <w:rFonts w:ascii="Arial" w:hAnsi="Arial" w:cs="Arial"/>
+                <w:sz w:val="28"/>
+                <w:szCs w:val="28"/>
+              </w:rPr>
+            </w:pPr>
+            <w:r>
+              <w:rPr>
+                <w:rFonts w:ascii="Arial" w:hAnsi="Arial" w:cs="Arial"/>
+                <w:sz w:val="28"/>
+                <w:szCs w:val="28"/>
+              </w:rPr>
+              <w:t>BP-BUR</w:t>
+            </w:r>
+            <w:r>
+              <w:rPr>
+                <w:rFonts w:ascii="Arial" w:hAnsi="Arial" w:cs="Arial"/>
+                <w:sz w:val="28"/>
+                <w:szCs w:val="28"/>
+              </w:rPr>
+              <w:t>-&lt;num&gt;</w:t>
+            </w:r>
+          </w:p>
+        </w:tc>
+        <w:tc>
+          <w:tcPr>
+            <w:tcW w:w="4675" w:type="dxa"/>
+          </w:tcPr>
+          <w:p>
+            <w:pPr>
+              <w:rPr>
+                <w:rFonts w:ascii="Arial" w:hAnsi="Arial" w:cs="Arial"/>
+                <w:sz w:val="28"/>
+                <w:szCs w:val="28"/>
+              </w:rPr>
+            </w:pPr>
+            <w:r>
+              <w:rPr>
+                <w:rFonts w:ascii="Arial" w:hAnsi="Arial" w:cs="Arial"/>
+                <w:sz w:val="28"/>
+                <w:szCs w:val="28"/>
+              </w:rPr>
+              <w:t xml:space="preserve">Đại diện cho các quy trình nghiệp vụ liên quan đến Sao Lưu và Khôi Phục </w:t>
+            </w:r>
+          </w:p>
+        </w:tc>
+      </w:tr>
+      <w:tr>
+        <w:tc>
+          <w:tcPr>
+            <w:tcW w:w="4675" w:type="dxa"/>
+          </w:tcPr>
+          <w:p>
+            <w:pPr>
+              <w:tabs>
+                <w:tab w:val="left" w:pos="1632"/>
+              </w:tabs>
+              <w:rPr>
+                <w:rFonts w:ascii="Arial" w:hAnsi="Arial" w:cs="Arial"/>
+                <w:sz w:val="28"/>
+                <w:szCs w:val="28"/>
+              </w:rPr>
+            </w:pPr>
+            <w:r>
+              <w:rPr>
+                <w:rFonts w:ascii="Arial" w:hAnsi="Arial" w:cs="Arial"/>
+                <w:sz w:val="28"/>
+                <w:szCs w:val="28"/>
+              </w:rPr>
+              <w:t>BP-SD</w:t>
+            </w:r>
+            <w:r>
+              <w:rPr>
+                <w:rFonts w:ascii="Arial" w:hAnsi="Arial" w:cs="Arial"/>
+                <w:sz w:val="28"/>
+                <w:szCs w:val="28"/>
+              </w:rPr>
+              <w:t>-&lt;num&gt;</w:t>
+            </w:r>
+          </w:p>
+        </w:tc>
+        <w:tc>
+          <w:tcPr>
+            <w:tcW w:w="4675" w:type="dxa"/>
+          </w:tcPr>
+          <w:p>
+            <w:pPr>
+              <w:rPr>
+                <w:rFonts w:ascii="Arial" w:hAnsi="Arial" w:cs="Arial"/>
+                <w:sz w:val="28"/>
+                <w:szCs w:val="28"/>
+              </w:rPr>
+            </w:pPr>
+            <w:r>
+              <w:rPr>
+                <w:rFonts w:ascii="Arial" w:hAnsi="Arial" w:cs="Arial"/>
+                <w:sz w:val="28"/>
+                <w:szCs w:val="28"/>
+              </w:rPr>
+              <w:t>Đại diện cho các quy trình nghiệp vụ liên quan đến Xóa Mềm</w:t>
+            </w:r>
+          </w:p>
+        </w:tc>
+      </w:tr>
+      <w:tr>
+        <w:tc>
+          <w:tcPr>
+            <w:tcW w:w="4675" w:type="dxa"/>
+          </w:tcPr>
+          <w:p>
+            <w:pPr>
+              <w:tabs>
+                <w:tab w:val="left" w:pos="1632"/>
+              </w:tabs>
+              <w:rPr>
+                <w:rFonts w:ascii="Arial" w:hAnsi="Arial" w:cs="Arial"/>
+                <w:sz w:val="28"/>
+                <w:szCs w:val="28"/>
+              </w:rPr>
+            </w:pPr>
+            <w:r>
+              <w:rPr>
+                <w:rFonts w:ascii="Arial" w:hAnsi="Arial" w:cs="Arial"/>
+                <w:sz w:val="28"/>
+                <w:szCs w:val="28"/>
+              </w:rPr>
+              <w:t>BP-HIS</w:t>
+            </w:r>
+            <w:r>
+              <w:rPr>
+                <w:rFonts w:ascii="Arial" w:hAnsi="Arial" w:cs="Arial"/>
+                <w:sz w:val="28"/>
+                <w:szCs w:val="28"/>
+              </w:rPr>
+              <w:t>-&lt;num&gt;</w:t>
+            </w:r>
+          </w:p>
+        </w:tc>
+        <w:tc>
+          <w:tcPr>
+            <w:tcW w:w="4675" w:type="dxa"/>
+          </w:tcPr>
+          <w:p>
+            <w:pPr>
+              <w:rPr>
+                <w:rFonts w:ascii="Arial" w:hAnsi="Arial" w:cs="Arial"/>
+                <w:sz w:val="28"/>
+                <w:szCs w:val="28"/>
+              </w:rPr>
+            </w:pPr>
+            <w:r>
+              <w:rPr>
+                <w:rFonts w:ascii="Arial" w:hAnsi="Arial" w:cs="Arial"/>
+                <w:sz w:val="28"/>
+                <w:szCs w:val="28"/>
+              </w:rPr>
+              <w:t>Đại diện cho các quy trình nghiệp vụ liên quan đến Lịch Sử Giao Dịch</w:t>
+            </w:r>
+          </w:p>
+        </w:tc>
+      </w:tr>
+      <w:tr>
+        <w:tc>
+          <w:tcPr>
+            <w:tcW w:w="4675" w:type="dxa"/>
+          </w:tcPr>
+          <w:p>
+            <w:pPr>
+              <w:tabs>
+                <w:tab w:val="left" w:pos="1632"/>
+              </w:tabs>
+              <w:rPr>
+                <w:rFonts w:ascii="Arial" w:hAnsi="Arial" w:cs="Arial"/>
+                <w:sz w:val="28"/>
+                <w:szCs w:val="28"/>
+              </w:rPr>
+            </w:pPr>
+          </w:p>
+        </w:tc>
+        <w:tc>
+          <w:tcPr>
+            <w:tcW w:w="4675" w:type="dxa"/>
+          </w:tcPr>
+          <w:p>
+            <w:pPr>
+              <w:rPr>
+                <w:rFonts w:ascii="Arial" w:hAnsi="Arial" w:cs="Arial"/>
+                <w:sz w:val="28"/>
+                <w:szCs w:val="28"/>
+              </w:rPr>
+            </w:pPr>
+          </w:p>
+        </w:tc>
+      </w:tr>
     </w:tbl>
     <w:p>
       <w:pPr>
@@ -7626,23 +8466,7 @@
           <w:sz w:val="28"/>
           <w:szCs w:val="28"/>
         </w:rPr>
-        <w:t xml:space="preserve"> Nếu người dùng chưa đặt tên cho khoản thu nhập, </w:t>
-      </w:r>
-      <w:r>
-        <w:rPr>
-          <w:rFonts w:ascii="Arial" w:hAnsi="Arial" w:cs="Arial"/>
-          <w:sz w:val="28"/>
-          <w:szCs w:val="28"/>
-        </w:rPr>
-        <w:t xml:space="preserve">chương trình sẽ cấp tên “Chi Tiêu Chưa Rõ &lt;Số&gt;”, </w:t>
-      </w:r>
-      <w:r>
-        <w:rPr>
-          <w:rFonts w:ascii="Arial" w:hAnsi="Arial" w:cs="Arial"/>
-          <w:sz w:val="28"/>
-          <w:szCs w:val="28"/>
-        </w:rPr>
-        <w:t>với số tăng dần theo số lượng</w:t>
+        <w:t xml:space="preserve"> Nếu người dùng chưa đặt tên cho khoản thu nhập, chương trình sẽ cấp tên “Chi Tiêu Chưa Rõ &lt;Số&gt;”, với số tăng dần theo số lượng</w:t>
       </w:r>
       <w:r>
         <w:rPr>
@@ -9897,15 +10721,7 @@
           <w:sz w:val="28"/>
           <w:szCs w:val="28"/>
         </w:rPr>
-        <w:t>BR-BUD-</w:t>
-      </w:r>
-      <w:r>
-        <w:rPr>
-          <w:rFonts w:ascii="Arial" w:hAnsi="Arial" w:cs="Arial"/>
-          <w:sz w:val="28"/>
-          <w:szCs w:val="28"/>
-        </w:rPr>
-        <w:t>2. Nếu người dùng không nhập tên ngân sách, chương trình sẽ tự khởi tạo tên theo cấu trúc:</w:t>
+        <w:t>BR-BUD-2. Nếu người dùng không nhập tên ngân sách, chương trình sẽ tự khởi tạo tên theo cấu trúc:</w:t>
       </w:r>
     </w:p>
     <w:p>
@@ -9942,15 +10758,7 @@
           <w:sz w:val="28"/>
           <w:szCs w:val="28"/>
         </w:rPr>
-        <w:t>BR-BUD-</w:t>
-      </w:r>
-      <w:r>
-        <w:rPr>
-          <w:rFonts w:ascii="Arial" w:hAnsi="Arial" w:cs="Arial"/>
-          <w:sz w:val="28"/>
-          <w:szCs w:val="28"/>
-        </w:rPr>
-        <w:t xml:space="preserve">3. </w:t>
+        <w:t xml:space="preserve">BR-BUD-3. </w:t>
       </w:r>
       <w:r>
         <w:rPr>
@@ -9984,15 +10792,7 @@
           <w:sz w:val="28"/>
           <w:szCs w:val="28"/>
         </w:rPr>
-        <w:t>BR-BUD-</w:t>
-      </w:r>
-      <w:r>
-        <w:rPr>
-          <w:rFonts w:ascii="Arial" w:hAnsi="Arial" w:cs="Arial"/>
-          <w:sz w:val="28"/>
-          <w:szCs w:val="28"/>
-        </w:rPr>
-        <w:t xml:space="preserve">4. </w:t>
+        <w:t xml:space="preserve">BR-BUD-4. </w:t>
       </w:r>
       <w:r>
         <w:rPr>
@@ -10026,15 +10826,7 @@
           <w:sz w:val="28"/>
           <w:szCs w:val="28"/>
         </w:rPr>
-        <w:t>BR-BUD-</w:t>
-      </w:r>
-      <w:r>
-        <w:rPr>
-          <w:rFonts w:ascii="Arial" w:hAnsi="Arial" w:cs="Arial"/>
-          <w:sz w:val="28"/>
-          <w:szCs w:val="28"/>
-        </w:rPr>
-        <w:t xml:space="preserve">5. </w:t>
+        <w:t xml:space="preserve">BR-BUD-5. </w:t>
       </w:r>
       <w:r>
         <w:rPr>
@@ -10060,15 +10852,7 @@
           <w:sz w:val="28"/>
           <w:szCs w:val="28"/>
         </w:rPr>
-        <w:t>BR-BUD-</w:t>
-      </w:r>
-      <w:r>
-        <w:rPr>
-          <w:rFonts w:ascii="Arial" w:hAnsi="Arial" w:cs="Arial"/>
-          <w:sz w:val="28"/>
-          <w:szCs w:val="28"/>
-        </w:rPr>
-        <w:t xml:space="preserve">6. </w:t>
+        <w:t xml:space="preserve">BR-BUD-6. </w:t>
       </w:r>
       <w:r>
         <w:rPr>
@@ -10112,15 +10896,7 @@
           <w:sz w:val="28"/>
           <w:szCs w:val="28"/>
         </w:rPr>
-        <w:t>BR-BUD-</w:t>
-      </w:r>
-      <w:r>
-        <w:rPr>
-          <w:rFonts w:ascii="Arial" w:hAnsi="Arial" w:cs="Arial"/>
-          <w:sz w:val="28"/>
-          <w:szCs w:val="28"/>
-        </w:rPr>
-        <w:t xml:space="preserve">7. </w:t>
+        <w:t xml:space="preserve">BR-BUD-7. </w:t>
       </w:r>
       <w:r>
         <w:rPr>
@@ -10277,7 +11053,57 @@
           <w:sz w:val="28"/>
           <w:szCs w:val="28"/>
         </w:rPr>
-        <w:t>BR-BUD-</w:t>
+        <w:t>BR-BUD-1</w:t>
+      </w:r>
+      <w:r>
+        <w:rPr>
+          <w:rFonts w:ascii="Arial" w:hAnsi="Arial" w:cs="Arial"/>
+          <w:sz w:val="28"/>
+          <w:szCs w:val="28"/>
+        </w:rPr>
+        <w:t>0</w:t>
+      </w:r>
+      <w:r>
+        <w:rPr>
+          <w:rFonts w:ascii="Arial" w:hAnsi="Arial" w:cs="Arial"/>
+          <w:sz w:val="28"/>
+          <w:szCs w:val="28"/>
+        </w:rPr>
+        <w:t xml:space="preserve">. </w:t>
+      </w:r>
+      <w:r>
+        <w:rPr>
+          <w:rFonts w:ascii="Arial" w:hAnsi="Arial" w:cs="Arial"/>
+          <w:sz w:val="28"/>
+          <w:szCs w:val="28"/>
+        </w:rPr>
+        <w:t>Người dùng chỉ được phép chỉnh sửa hoặc xóa ngân sách thuộc tài khoản của chính mình</w:t>
+      </w:r>
+      <w:r>
+        <w:rPr>
+          <w:rFonts w:ascii="Arial" w:hAnsi="Arial" w:cs="Arial"/>
+          <w:sz w:val="28"/>
+          <w:szCs w:val="28"/>
+        </w:rPr>
+        <w:t>.</w:t>
+      </w:r>
+    </w:p>
+    <w:p>
+      <w:pPr>
+        <w:ind w:left="720"/>
+        <w:rPr>
+          <w:rFonts w:ascii="Arial" w:hAnsi="Arial" w:cs="Arial"/>
+          <w:sz w:val="28"/>
+          <w:szCs w:val="28"/>
+        </w:rPr>
+      </w:pPr>
+      <w:r>
+        <w:rPr>
+          <w:rFonts w:ascii="Arial" w:hAnsi="Arial" w:cs="Arial"/>
+          <w:sz w:val="28"/>
+          <w:szCs w:val="28"/>
+        </w:rPr>
+        <w:t>BR-BUD-1</w:t>
       </w:r>
       <w:r>
         <w:rPr>
@@ -10293,14 +11119,6 @@
           <w:sz w:val="28"/>
           <w:szCs w:val="28"/>
         </w:rPr>
-        <w:t>0</w:t>
-      </w:r>
-      <w:r>
-        <w:rPr>
-          <w:rFonts w:ascii="Arial" w:hAnsi="Arial" w:cs="Arial"/>
-          <w:sz w:val="28"/>
-          <w:szCs w:val="28"/>
-        </w:rPr>
         <w:t xml:space="preserve">. </w:t>
       </w:r>
       <w:r>
@@ -10309,7 +11127,7 @@
           <w:sz w:val="28"/>
           <w:szCs w:val="28"/>
         </w:rPr>
-        <w:t>Người dùng chỉ được phép chỉnh sửa hoặc xóa ngân sách thuộc tài khoản của chính mình</w:t>
+        <w:t>Người dùng chỉ được phép sử dụng ngân sách thuộc tài khoản của chính mình</w:t>
       </w:r>
       <w:r>
         <w:rPr>
@@ -10335,73 +11153,7 @@
           <w:sz w:val="28"/>
           <w:szCs w:val="28"/>
         </w:rPr>
-        <w:t>BR-BUD-</w:t>
-      </w:r>
-      <w:r>
-        <w:rPr>
-          <w:rFonts w:ascii="Arial" w:hAnsi="Arial" w:cs="Arial"/>
-          <w:sz w:val="28"/>
-          <w:szCs w:val="28"/>
-        </w:rPr>
-        <w:t>1</w:t>
-      </w:r>
-      <w:r>
-        <w:rPr>
-          <w:rFonts w:ascii="Arial" w:hAnsi="Arial" w:cs="Arial"/>
-          <w:sz w:val="28"/>
-          <w:szCs w:val="28"/>
-        </w:rPr>
-        <w:t>1</w:t>
-      </w:r>
-      <w:r>
-        <w:rPr>
-          <w:rFonts w:ascii="Arial" w:hAnsi="Arial" w:cs="Arial"/>
-          <w:sz w:val="28"/>
-          <w:szCs w:val="28"/>
-        </w:rPr>
-        <w:t xml:space="preserve">. </w:t>
-      </w:r>
-      <w:r>
-        <w:rPr>
-          <w:rFonts w:ascii="Arial" w:hAnsi="Arial" w:cs="Arial"/>
-          <w:sz w:val="28"/>
-          <w:szCs w:val="28"/>
-        </w:rPr>
-        <w:t>Người dùng chỉ được phép sử dụng ngân sách thuộc tài khoản của chính mình</w:t>
-      </w:r>
-      <w:r>
-        <w:rPr>
-          <w:rFonts w:ascii="Arial" w:hAnsi="Arial" w:cs="Arial"/>
-          <w:sz w:val="28"/>
-          <w:szCs w:val="28"/>
-        </w:rPr>
-        <w:t>.</w:t>
-      </w:r>
-    </w:p>
-    <w:p>
-      <w:pPr>
-        <w:ind w:left="720"/>
-        <w:rPr>
-          <w:rFonts w:ascii="Arial" w:hAnsi="Arial" w:cs="Arial"/>
-          <w:sz w:val="28"/>
-          <w:szCs w:val="28"/>
-        </w:rPr>
-      </w:pPr>
-      <w:r>
-        <w:rPr>
-          <w:rFonts w:ascii="Arial" w:hAnsi="Arial" w:cs="Arial"/>
-          <w:sz w:val="28"/>
-          <w:szCs w:val="28"/>
-        </w:rPr>
-        <w:t>BR-BUD-</w:t>
-      </w:r>
-      <w:r>
-        <w:rPr>
-          <w:rFonts w:ascii="Arial" w:hAnsi="Arial" w:cs="Arial"/>
-          <w:sz w:val="28"/>
-          <w:szCs w:val="28"/>
-        </w:rPr>
-        <w:t>1</w:t>
+        <w:t>BR-BUD-1</w:t>
       </w:r>
       <w:r>
         <w:rPr>
@@ -13687,6 +14439,1280 @@
           <w:szCs w:val="28"/>
         </w:rPr>
         <w:t>Quy Trình Nghiệp Vụ (Business Process)</w:t>
+      </w:r>
+    </w:p>
+    <w:p>
+      <w:pPr>
+        <w:pStyle w:val="ListParagraph"/>
+        <w:numPr>
+          <w:ilvl w:val="2"/>
+          <w:numId w:val="13"/>
+        </w:numPr>
+        <w:rPr>
+          <w:rFonts w:ascii="Arial" w:hAnsi="Arial" w:cs="Arial"/>
+          <w:b/>
+          <w:bCs/>
+          <w:sz w:val="28"/>
+          <w:szCs w:val="28"/>
+        </w:rPr>
+      </w:pPr>
+      <w:r>
+        <w:rPr>
+          <w:rFonts w:ascii="Arial" w:hAnsi="Arial" w:cs="Arial"/>
+          <w:b/>
+          <w:bCs/>
+          <w:sz w:val="28"/>
+          <w:szCs w:val="28"/>
+        </w:rPr>
+        <w:t xml:space="preserve"> Quy Trình Nghiệp Vụ Cho Tài Khoản</w:t>
+      </w:r>
+    </w:p>
+    <w:p>
+      <w:pPr>
+        <w:ind w:left="720"/>
+        <w:rPr>
+          <w:rFonts w:ascii="Arial" w:hAnsi="Arial" w:cs="Arial"/>
+          <w:sz w:val="28"/>
+          <w:szCs w:val="28"/>
+        </w:rPr>
+      </w:pPr>
+      <w:r>
+        <w:rPr>
+          <w:rFonts w:ascii="Arial" w:hAnsi="Arial" w:cs="Arial"/>
+          <w:sz w:val="28"/>
+          <w:szCs w:val="28"/>
+        </w:rPr>
+        <w:t>BP-ACC-1. Quy trình Đăng Ký Tài Khoản</w:t>
+      </w:r>
+    </w:p>
+    <w:p>
+      <w:pPr>
+        <w:pStyle w:val="ListParagraph"/>
+        <w:numPr>
+          <w:ilvl w:val="0"/>
+          <w:numId w:val="15"/>
+        </w:numPr>
+        <w:rPr>
+          <w:rFonts w:ascii="Arial" w:hAnsi="Arial" w:cs="Arial"/>
+          <w:sz w:val="28"/>
+          <w:szCs w:val="28"/>
+        </w:rPr>
+      </w:pPr>
+      <w:r>
+        <w:rPr>
+          <w:rFonts w:ascii="Arial" w:hAnsi="Arial" w:cs="Arial"/>
+          <w:sz w:val="28"/>
+          <w:szCs w:val="28"/>
+        </w:rPr>
+        <w:t>Nhập thông tin cần thiết</w:t>
+      </w:r>
+    </w:p>
+    <w:p>
+      <w:pPr>
+        <w:pStyle w:val="ListParagraph"/>
+        <w:numPr>
+          <w:ilvl w:val="0"/>
+          <w:numId w:val="15"/>
+        </w:numPr>
+        <w:rPr>
+          <w:rFonts w:ascii="Arial" w:hAnsi="Arial" w:cs="Arial"/>
+          <w:sz w:val="28"/>
+          <w:szCs w:val="28"/>
+        </w:rPr>
+      </w:pPr>
+      <w:r>
+        <w:rPr>
+          <w:rFonts w:ascii="Arial" w:hAnsi="Arial" w:cs="Arial"/>
+          <w:sz w:val="28"/>
+          <w:szCs w:val="28"/>
+        </w:rPr>
+        <w:t>Xác thực thông tin đầy đủ chưa</w:t>
+      </w:r>
+    </w:p>
+    <w:p>
+      <w:pPr>
+        <w:pStyle w:val="ListParagraph"/>
+        <w:numPr>
+          <w:ilvl w:val="0"/>
+          <w:numId w:val="15"/>
+        </w:numPr>
+        <w:rPr>
+          <w:rFonts w:ascii="Arial" w:hAnsi="Arial" w:cs="Arial"/>
+          <w:sz w:val="28"/>
+          <w:szCs w:val="28"/>
+        </w:rPr>
+      </w:pPr>
+      <w:r>
+        <w:rPr>
+          <w:rFonts w:ascii="Arial" w:hAnsi="Arial" w:cs="Arial"/>
+          <w:sz w:val="28"/>
+          <w:szCs w:val="28"/>
+        </w:rPr>
+        <w:t>Kiểm tra xem username/email đã tồn tại chưa</w:t>
+      </w:r>
+    </w:p>
+    <w:p>
+      <w:pPr>
+        <w:pStyle w:val="ListParagraph"/>
+        <w:numPr>
+          <w:ilvl w:val="0"/>
+          <w:numId w:val="15"/>
+        </w:numPr>
+        <w:rPr>
+          <w:rFonts w:ascii="Arial" w:hAnsi="Arial" w:cs="Arial"/>
+          <w:sz w:val="28"/>
+          <w:szCs w:val="28"/>
+        </w:rPr>
+      </w:pPr>
+      <w:r>
+        <w:rPr>
+          <w:rFonts w:ascii="Arial" w:hAnsi="Arial" w:cs="Arial"/>
+          <w:sz w:val="28"/>
+          <w:szCs w:val="28"/>
+        </w:rPr>
+        <w:t>Mã hóa mật khẩu</w:t>
+      </w:r>
+    </w:p>
+    <w:p>
+      <w:pPr>
+        <w:pStyle w:val="ListParagraph"/>
+        <w:numPr>
+          <w:ilvl w:val="0"/>
+          <w:numId w:val="15"/>
+        </w:numPr>
+        <w:rPr>
+          <w:rFonts w:ascii="Arial" w:hAnsi="Arial" w:cs="Arial"/>
+          <w:sz w:val="28"/>
+          <w:szCs w:val="28"/>
+        </w:rPr>
+      </w:pPr>
+      <w:r>
+        <w:rPr>
+          <w:rFonts w:ascii="Arial" w:hAnsi="Arial" w:cs="Arial"/>
+          <w:sz w:val="28"/>
+          <w:szCs w:val="28"/>
+        </w:rPr>
+        <w:t>Tiến hành tạo tài khoản</w:t>
+      </w:r>
+    </w:p>
+    <w:p>
+      <w:pPr>
+        <w:pStyle w:val="ListParagraph"/>
+        <w:numPr>
+          <w:ilvl w:val="0"/>
+          <w:numId w:val="15"/>
+        </w:numPr>
+        <w:rPr>
+          <w:rFonts w:ascii="Arial" w:hAnsi="Arial" w:cs="Arial"/>
+          <w:sz w:val="28"/>
+          <w:szCs w:val="28"/>
+        </w:rPr>
+      </w:pPr>
+      <w:r>
+        <w:rPr>
+          <w:rFonts w:ascii="Arial" w:hAnsi="Arial" w:cs="Arial"/>
+          <w:sz w:val="28"/>
+          <w:szCs w:val="28"/>
+        </w:rPr>
+        <w:t>Thành công</w:t>
+      </w:r>
+    </w:p>
+    <w:p>
+      <w:pPr>
+        <w:ind w:left="720"/>
+        <w:rPr>
+          <w:rFonts w:ascii="Arial" w:hAnsi="Arial" w:cs="Arial"/>
+          <w:sz w:val="28"/>
+          <w:szCs w:val="28"/>
+        </w:rPr>
+      </w:pPr>
+      <w:r>
+        <w:rPr>
+          <w:rFonts w:ascii="Arial" w:hAnsi="Arial" w:cs="Arial"/>
+          <w:sz w:val="28"/>
+          <w:szCs w:val="28"/>
+        </w:rPr>
+        <w:t>BP-ACC-2. Quy trình Đăng Nhập Tài Khoản</w:t>
+      </w:r>
+    </w:p>
+    <w:p>
+      <w:pPr>
+        <w:pStyle w:val="ListParagraph"/>
+        <w:numPr>
+          <w:ilvl w:val="0"/>
+          <w:numId w:val="15"/>
+        </w:numPr>
+        <w:rPr>
+          <w:rFonts w:ascii="Arial" w:hAnsi="Arial" w:cs="Arial"/>
+          <w:sz w:val="28"/>
+          <w:szCs w:val="28"/>
+        </w:rPr>
+      </w:pPr>
+      <w:r>
+        <w:rPr>
+          <w:rFonts w:ascii="Arial" w:hAnsi="Arial" w:cs="Arial"/>
+          <w:sz w:val="28"/>
+          <w:szCs w:val="28"/>
+        </w:rPr>
+        <w:t>Nhập username / email và mật khẩu</w:t>
+      </w:r>
+    </w:p>
+    <w:p>
+      <w:pPr>
+        <w:pStyle w:val="ListParagraph"/>
+        <w:numPr>
+          <w:ilvl w:val="0"/>
+          <w:numId w:val="15"/>
+        </w:numPr>
+        <w:rPr>
+          <w:rFonts w:ascii="Arial" w:hAnsi="Arial" w:cs="Arial"/>
+          <w:sz w:val="28"/>
+          <w:szCs w:val="28"/>
+        </w:rPr>
+      </w:pPr>
+      <w:r>
+        <w:rPr>
+          <w:rFonts w:ascii="Arial" w:hAnsi="Arial" w:cs="Arial"/>
+          <w:sz w:val="28"/>
+          <w:szCs w:val="28"/>
+        </w:rPr>
+        <w:lastRenderedPageBreak/>
+        <w:t>Kiểm tra username/gmail có tồn tại trong hệ thống hay chưa</w:t>
+      </w:r>
+    </w:p>
+    <w:p>
+      <w:pPr>
+        <w:pStyle w:val="ListParagraph"/>
+        <w:numPr>
+          <w:ilvl w:val="0"/>
+          <w:numId w:val="15"/>
+        </w:numPr>
+        <w:rPr>
+          <w:rFonts w:ascii="Arial" w:hAnsi="Arial" w:cs="Arial"/>
+          <w:sz w:val="28"/>
+          <w:szCs w:val="28"/>
+        </w:rPr>
+      </w:pPr>
+      <w:r>
+        <w:rPr>
+          <w:rFonts w:ascii="Arial" w:hAnsi="Arial" w:cs="Arial"/>
+          <w:sz w:val="28"/>
+          <w:szCs w:val="28"/>
+        </w:rPr>
+        <w:t>Xác thực mật khẩu ứng với tài khoản</w:t>
+      </w:r>
+    </w:p>
+    <w:p>
+      <w:pPr>
+        <w:pStyle w:val="ListParagraph"/>
+        <w:numPr>
+          <w:ilvl w:val="0"/>
+          <w:numId w:val="15"/>
+        </w:numPr>
+        <w:rPr>
+          <w:rFonts w:ascii="Arial" w:hAnsi="Arial" w:cs="Arial"/>
+          <w:sz w:val="28"/>
+          <w:szCs w:val="28"/>
+        </w:rPr>
+      </w:pPr>
+      <w:r>
+        <w:rPr>
+          <w:rFonts w:ascii="Arial" w:hAnsi="Arial" w:cs="Arial"/>
+          <w:sz w:val="28"/>
+          <w:szCs w:val="28"/>
+        </w:rPr>
+        <w:t>Tạo phiên (session) hoạt động</w:t>
+      </w:r>
+    </w:p>
+    <w:p>
+      <w:pPr>
+        <w:pStyle w:val="ListParagraph"/>
+        <w:numPr>
+          <w:ilvl w:val="0"/>
+          <w:numId w:val="15"/>
+        </w:numPr>
+        <w:rPr>
+          <w:rFonts w:ascii="Arial" w:hAnsi="Arial" w:cs="Arial"/>
+          <w:sz w:val="28"/>
+          <w:szCs w:val="28"/>
+        </w:rPr>
+      </w:pPr>
+      <w:r>
+        <w:rPr>
+          <w:rFonts w:ascii="Arial" w:hAnsi="Arial" w:cs="Arial"/>
+          <w:sz w:val="28"/>
+          <w:szCs w:val="28"/>
+        </w:rPr>
+        <w:t>Vào trang chủ</w:t>
+      </w:r>
+    </w:p>
+    <w:p>
+      <w:pPr>
+        <w:pStyle w:val="ListParagraph"/>
+        <w:numPr>
+          <w:ilvl w:val="2"/>
+          <w:numId w:val="13"/>
+        </w:numPr>
+        <w:rPr>
+          <w:rFonts w:ascii="Arial" w:hAnsi="Arial" w:cs="Arial"/>
+          <w:b/>
+          <w:bCs/>
+          <w:sz w:val="28"/>
+          <w:szCs w:val="28"/>
+        </w:rPr>
+      </w:pPr>
+      <w:r>
+        <w:rPr>
+          <w:rFonts w:ascii="Arial" w:hAnsi="Arial" w:cs="Arial"/>
+          <w:b/>
+          <w:bCs/>
+          <w:sz w:val="28"/>
+          <w:szCs w:val="28"/>
+        </w:rPr>
+        <w:t>Quy Trình Nghiệp Vụ Cho Quản Lý Chi Tiêu</w:t>
+      </w:r>
+    </w:p>
+    <w:p>
+      <w:pPr>
+        <w:ind w:left="720"/>
+        <w:rPr>
+          <w:rFonts w:ascii="Arial" w:hAnsi="Arial" w:cs="Arial"/>
+          <w:sz w:val="28"/>
+          <w:szCs w:val="28"/>
+        </w:rPr>
+      </w:pPr>
+      <w:r>
+        <w:rPr>
+          <w:rFonts w:ascii="Arial" w:hAnsi="Arial" w:cs="Arial"/>
+          <w:sz w:val="28"/>
+          <w:szCs w:val="28"/>
+        </w:rPr>
+        <w:t xml:space="preserve">BP-ET-1. </w:t>
+      </w:r>
+      <w:r>
+        <w:rPr>
+          <w:rFonts w:ascii="Arial" w:hAnsi="Arial" w:cs="Arial"/>
+          <w:sz w:val="28"/>
+          <w:szCs w:val="28"/>
+        </w:rPr>
+        <w:t>Quy trình Tạo Khoản Chi Tiêu</w:t>
+      </w:r>
+    </w:p>
+    <w:p>
+      <w:pPr>
+        <w:pStyle w:val="ListParagraph"/>
+        <w:numPr>
+          <w:ilvl w:val="0"/>
+          <w:numId w:val="15"/>
+        </w:numPr>
+        <w:rPr>
+          <w:rFonts w:ascii="Arial" w:hAnsi="Arial" w:cs="Arial"/>
+          <w:sz w:val="28"/>
+          <w:szCs w:val="28"/>
+        </w:rPr>
+      </w:pPr>
+      <w:r>
+        <w:rPr>
+          <w:rFonts w:ascii="Arial" w:hAnsi="Arial" w:cs="Arial"/>
+          <w:sz w:val="28"/>
+          <w:szCs w:val="28"/>
+        </w:rPr>
+        <w:t xml:space="preserve">Nhập </w:t>
+      </w:r>
+      <w:r>
+        <w:rPr>
+          <w:rFonts w:ascii="Arial" w:hAnsi="Arial" w:cs="Arial"/>
+          <w:sz w:val="28"/>
+          <w:szCs w:val="28"/>
+        </w:rPr>
+        <w:t>các thông tin liên quan đến chi tiêu</w:t>
+      </w:r>
+    </w:p>
+    <w:p>
+      <w:pPr>
+        <w:pStyle w:val="ListParagraph"/>
+        <w:numPr>
+          <w:ilvl w:val="0"/>
+          <w:numId w:val="15"/>
+        </w:numPr>
+        <w:rPr>
+          <w:rFonts w:ascii="Arial" w:hAnsi="Arial" w:cs="Arial"/>
+          <w:sz w:val="28"/>
+          <w:szCs w:val="28"/>
+        </w:rPr>
+      </w:pPr>
+      <w:r>
+        <w:rPr>
+          <w:rFonts w:ascii="Arial" w:hAnsi="Arial" w:cs="Arial"/>
+          <w:sz w:val="28"/>
+          <w:szCs w:val="28"/>
+        </w:rPr>
+        <w:t>Xác thực các dữ liệu yêu cầu</w:t>
+      </w:r>
+    </w:p>
+    <w:p>
+      <w:pPr>
+        <w:pStyle w:val="ListParagraph"/>
+        <w:numPr>
+          <w:ilvl w:val="0"/>
+          <w:numId w:val="15"/>
+        </w:numPr>
+        <w:rPr>
+          <w:rFonts w:ascii="Arial" w:hAnsi="Arial" w:cs="Arial"/>
+          <w:sz w:val="28"/>
+          <w:szCs w:val="28"/>
+        </w:rPr>
+      </w:pPr>
+      <w:r>
+        <w:rPr>
+          <w:rFonts w:ascii="Arial" w:hAnsi="Arial" w:cs="Arial"/>
+          <w:sz w:val="28"/>
+          <w:szCs w:val="28"/>
+        </w:rPr>
+        <w:t>Kiểm tra nguồn tiền</w:t>
+      </w:r>
+    </w:p>
+    <w:p>
+      <w:pPr>
+        <w:pStyle w:val="ListParagraph"/>
+        <w:numPr>
+          <w:ilvl w:val="0"/>
+          <w:numId w:val="15"/>
+        </w:numPr>
+        <w:rPr>
+          <w:rFonts w:ascii="Arial" w:hAnsi="Arial" w:cs="Arial"/>
+          <w:sz w:val="28"/>
+          <w:szCs w:val="28"/>
+        </w:rPr>
+      </w:pPr>
+      <w:r>
+        <w:rPr>
+          <w:rFonts w:ascii="Arial" w:hAnsi="Arial" w:cs="Arial"/>
+          <w:sz w:val="28"/>
+          <w:szCs w:val="28"/>
+        </w:rPr>
+        <w:t>Kiểm tra ngân sách (nếu có liên kết)</w:t>
+      </w:r>
+    </w:p>
+    <w:p>
+      <w:pPr>
+        <w:pStyle w:val="ListParagraph"/>
+        <w:numPr>
+          <w:ilvl w:val="0"/>
+          <w:numId w:val="15"/>
+        </w:numPr>
+        <w:rPr>
+          <w:rFonts w:ascii="Arial" w:hAnsi="Arial" w:cs="Arial"/>
+          <w:sz w:val="28"/>
+          <w:szCs w:val="28"/>
+        </w:rPr>
+      </w:pPr>
+      <w:r>
+        <w:rPr>
+          <w:rFonts w:ascii="Arial" w:hAnsi="Arial" w:cs="Arial"/>
+          <w:sz w:val="28"/>
+          <w:szCs w:val="28"/>
+        </w:rPr>
+        <w:t>Lưu chi tiêu</w:t>
+      </w:r>
+    </w:p>
+    <w:p>
+      <w:pPr>
+        <w:pStyle w:val="ListParagraph"/>
+        <w:numPr>
+          <w:ilvl w:val="0"/>
+          <w:numId w:val="15"/>
+        </w:numPr>
+        <w:rPr>
+          <w:rFonts w:ascii="Arial" w:hAnsi="Arial" w:cs="Arial"/>
+          <w:sz w:val="28"/>
+          <w:szCs w:val="28"/>
+        </w:rPr>
+      </w:pPr>
+      <w:r>
+        <w:rPr>
+          <w:rFonts w:ascii="Arial" w:hAnsi="Arial" w:cs="Arial"/>
+          <w:sz w:val="28"/>
+          <w:szCs w:val="28"/>
+        </w:rPr>
+        <w:t>Trừ số dư nguồn tiền</w:t>
+      </w:r>
+    </w:p>
+    <w:p>
+      <w:pPr>
+        <w:pStyle w:val="ListParagraph"/>
+        <w:numPr>
+          <w:ilvl w:val="0"/>
+          <w:numId w:val="15"/>
+        </w:numPr>
+        <w:rPr>
+          <w:rFonts w:ascii="Arial" w:hAnsi="Arial" w:cs="Arial"/>
+          <w:sz w:val="28"/>
+          <w:szCs w:val="28"/>
+        </w:rPr>
+      </w:pPr>
+      <w:r>
+        <w:rPr>
+          <w:rFonts w:ascii="Arial" w:hAnsi="Arial" w:cs="Arial"/>
+          <w:sz w:val="28"/>
+          <w:szCs w:val="28"/>
+        </w:rPr>
+        <w:t>Cập nhật ngân sách (nếu có liên kết)</w:t>
+      </w:r>
+    </w:p>
+    <w:p>
+      <w:pPr>
+        <w:pStyle w:val="ListParagraph"/>
+        <w:numPr>
+          <w:ilvl w:val="0"/>
+          <w:numId w:val="15"/>
+        </w:numPr>
+        <w:rPr>
+          <w:rFonts w:ascii="Arial" w:hAnsi="Arial" w:cs="Arial"/>
+          <w:sz w:val="28"/>
+          <w:szCs w:val="28"/>
+        </w:rPr>
+      </w:pPr>
+      <w:r>
+        <w:rPr>
+          <w:rFonts w:ascii="Arial" w:hAnsi="Arial" w:cs="Arial"/>
+          <w:sz w:val="28"/>
+          <w:szCs w:val="28"/>
+        </w:rPr>
+        <w:t>Cập nhật thống kê</w:t>
+      </w:r>
+    </w:p>
+    <w:p>
+      <w:pPr>
+        <w:pStyle w:val="ListParagraph"/>
+        <w:numPr>
+          <w:ilvl w:val="0"/>
+          <w:numId w:val="15"/>
+        </w:numPr>
+        <w:rPr>
+          <w:rFonts w:ascii="Arial" w:hAnsi="Arial" w:cs="Arial"/>
+          <w:sz w:val="28"/>
+          <w:szCs w:val="28"/>
+        </w:rPr>
+      </w:pPr>
+      <w:r>
+        <w:rPr>
+          <w:rFonts w:ascii="Arial" w:hAnsi="Arial" w:cs="Arial"/>
+          <w:sz w:val="28"/>
+          <w:szCs w:val="28"/>
+        </w:rPr>
+        <w:t>Lưu lịch sử</w:t>
+      </w:r>
+    </w:p>
+    <w:p>
+      <w:pPr>
+        <w:pStyle w:val="ListParagraph"/>
+        <w:numPr>
+          <w:ilvl w:val="2"/>
+          <w:numId w:val="13"/>
+        </w:numPr>
+        <w:rPr>
+          <w:rFonts w:ascii="Arial" w:hAnsi="Arial" w:cs="Arial"/>
+          <w:b/>
+          <w:bCs/>
+          <w:sz w:val="28"/>
+          <w:szCs w:val="28"/>
+        </w:rPr>
+      </w:pPr>
+      <w:r>
+        <w:rPr>
+          <w:rFonts w:ascii="Arial" w:hAnsi="Arial" w:cs="Arial"/>
+          <w:b/>
+          <w:bCs/>
+          <w:sz w:val="28"/>
+          <w:szCs w:val="28"/>
+        </w:rPr>
+        <w:t xml:space="preserve"> Quy Trình Nghiệp Vụ Cho Quản Lý Danh Mục Chi Tiêu</w:t>
+      </w:r>
+    </w:p>
+    <w:p>
+      <w:pPr>
+        <w:ind w:left="720"/>
+        <w:rPr>
+          <w:rFonts w:ascii="Arial" w:hAnsi="Arial" w:cs="Arial"/>
+          <w:sz w:val="28"/>
+          <w:szCs w:val="28"/>
+        </w:rPr>
+      </w:pPr>
+      <w:r>
+        <w:rPr>
+          <w:rFonts w:ascii="Arial" w:hAnsi="Arial" w:cs="Arial"/>
+          <w:sz w:val="28"/>
+          <w:szCs w:val="28"/>
+        </w:rPr>
+        <w:t>BP-CATE-</w:t>
+      </w:r>
+    </w:p>
+    <w:p>
+      <w:pPr>
+        <w:pStyle w:val="ListParagraph"/>
+        <w:numPr>
+          <w:ilvl w:val="2"/>
+          <w:numId w:val="13"/>
+        </w:numPr>
+        <w:rPr>
+          <w:rFonts w:ascii="Arial" w:hAnsi="Arial" w:cs="Arial"/>
+          <w:b/>
+          <w:bCs/>
+          <w:sz w:val="28"/>
+          <w:szCs w:val="28"/>
+        </w:rPr>
+      </w:pPr>
+      <w:r>
+        <w:rPr>
+          <w:rFonts w:ascii="Arial" w:hAnsi="Arial" w:cs="Arial"/>
+          <w:b/>
+          <w:bCs/>
+          <w:sz w:val="28"/>
+          <w:szCs w:val="28"/>
+        </w:rPr>
+        <w:t xml:space="preserve"> </w:t>
+      </w:r>
+      <w:r>
+        <w:rPr>
+          <w:rFonts w:ascii="Arial" w:hAnsi="Arial" w:cs="Arial"/>
+          <w:b/>
+          <w:bCs/>
+          <w:sz w:val="28"/>
+          <w:szCs w:val="28"/>
+        </w:rPr>
+        <w:t>Quy Trình Nghiệp Vụ Cho</w:t>
+      </w:r>
+      <w:r>
+        <w:rPr>
+          <w:rFonts w:ascii="Arial" w:hAnsi="Arial" w:cs="Arial"/>
+          <w:b/>
+          <w:bCs/>
+          <w:sz w:val="28"/>
+          <w:szCs w:val="28"/>
+        </w:rPr>
+        <w:t xml:space="preserve"> Quản Lý Thu Nhập</w:t>
+      </w:r>
+    </w:p>
+    <w:p>
+      <w:pPr>
+        <w:ind w:left="720"/>
+        <w:rPr>
+          <w:rFonts w:ascii="Arial" w:hAnsi="Arial" w:cs="Arial"/>
+          <w:sz w:val="28"/>
+          <w:szCs w:val="28"/>
+        </w:rPr>
+      </w:pPr>
+      <w:r>
+        <w:rPr>
+          <w:rFonts w:ascii="Arial" w:hAnsi="Arial" w:cs="Arial"/>
+          <w:sz w:val="28"/>
+          <w:szCs w:val="28"/>
+        </w:rPr>
+        <w:t>BP-IT-</w:t>
+      </w:r>
+    </w:p>
+    <w:p>
+      <w:pPr>
+        <w:pStyle w:val="ListParagraph"/>
+        <w:numPr>
+          <w:ilvl w:val="2"/>
+          <w:numId w:val="13"/>
+        </w:numPr>
+        <w:rPr>
+          <w:rFonts w:ascii="Arial" w:hAnsi="Arial" w:cs="Arial"/>
+          <w:b/>
+          <w:bCs/>
+          <w:sz w:val="28"/>
+          <w:szCs w:val="28"/>
+        </w:rPr>
+      </w:pPr>
+      <w:r>
+        <w:rPr>
+          <w:rFonts w:ascii="Arial" w:hAnsi="Arial" w:cs="Arial"/>
+          <w:b/>
+          <w:bCs/>
+          <w:sz w:val="28"/>
+          <w:szCs w:val="28"/>
+        </w:rPr>
+        <w:t xml:space="preserve"> </w:t>
+      </w:r>
+      <w:r>
+        <w:rPr>
+          <w:rFonts w:ascii="Arial" w:hAnsi="Arial" w:cs="Arial"/>
+          <w:b/>
+          <w:bCs/>
+          <w:sz w:val="28"/>
+          <w:szCs w:val="28"/>
+        </w:rPr>
+        <w:t>Quy Trình Nghiệp Vụ Cho</w:t>
+      </w:r>
+      <w:r>
+        <w:rPr>
+          <w:rFonts w:ascii="Arial" w:hAnsi="Arial" w:cs="Arial"/>
+          <w:b/>
+          <w:bCs/>
+          <w:sz w:val="28"/>
+          <w:szCs w:val="28"/>
+        </w:rPr>
+        <w:t xml:space="preserve"> Quản Lý Danh Mục Thu Nhập</w:t>
+      </w:r>
+    </w:p>
+    <w:p>
+      <w:pPr>
+        <w:ind w:left="720"/>
+        <w:rPr>
+          <w:rFonts w:ascii="Arial" w:hAnsi="Arial" w:cs="Arial"/>
+          <w:sz w:val="28"/>
+          <w:szCs w:val="28"/>
+        </w:rPr>
+      </w:pPr>
+      <w:r>
+        <w:rPr>
+          <w:rFonts w:ascii="Arial" w:hAnsi="Arial" w:cs="Arial"/>
+          <w:sz w:val="28"/>
+          <w:szCs w:val="28"/>
+        </w:rPr>
+        <w:t>BP-CATI-</w:t>
+      </w:r>
+    </w:p>
+    <w:p>
+      <w:pPr>
+        <w:pStyle w:val="ListParagraph"/>
+        <w:numPr>
+          <w:ilvl w:val="2"/>
+          <w:numId w:val="13"/>
+        </w:numPr>
+        <w:rPr>
+          <w:rFonts w:ascii="Arial" w:hAnsi="Arial" w:cs="Arial"/>
+          <w:b/>
+          <w:bCs/>
+          <w:sz w:val="28"/>
+          <w:szCs w:val="28"/>
+        </w:rPr>
+      </w:pPr>
+      <w:r>
+        <w:rPr>
+          <w:rFonts w:ascii="Arial" w:hAnsi="Arial" w:cs="Arial"/>
+          <w:b/>
+          <w:bCs/>
+          <w:sz w:val="28"/>
+          <w:szCs w:val="28"/>
+        </w:rPr>
+        <w:t xml:space="preserve"> Quy Trình Nghiệp Vụ Cho Quản Lý Nguồn Tiền</w:t>
+      </w:r>
+    </w:p>
+    <w:p>
+      <w:pPr>
+        <w:ind w:left="720"/>
+        <w:rPr>
+          <w:rFonts w:ascii="Arial" w:hAnsi="Arial" w:cs="Arial"/>
+          <w:sz w:val="28"/>
+          <w:szCs w:val="28"/>
+        </w:rPr>
+      </w:pPr>
+      <w:r>
+        <w:rPr>
+          <w:rFonts w:ascii="Arial" w:hAnsi="Arial" w:cs="Arial"/>
+          <w:sz w:val="28"/>
+          <w:szCs w:val="28"/>
+        </w:rPr>
+        <w:t>BP-SM-</w:t>
+      </w:r>
+    </w:p>
+    <w:p>
+      <w:pPr>
+        <w:pStyle w:val="ListParagraph"/>
+        <w:numPr>
+          <w:ilvl w:val="2"/>
+          <w:numId w:val="13"/>
+        </w:numPr>
+        <w:rPr>
+          <w:rFonts w:ascii="Arial" w:hAnsi="Arial" w:cs="Arial"/>
+          <w:b/>
+          <w:bCs/>
+          <w:sz w:val="28"/>
+          <w:szCs w:val="28"/>
+        </w:rPr>
+      </w:pPr>
+      <w:r>
+        <w:rPr>
+          <w:rFonts w:ascii="Arial" w:hAnsi="Arial" w:cs="Arial"/>
+          <w:b/>
+          <w:bCs/>
+          <w:sz w:val="28"/>
+          <w:szCs w:val="28"/>
+        </w:rPr>
+        <w:t xml:space="preserve"> </w:t>
+      </w:r>
+      <w:r>
+        <w:rPr>
+          <w:rFonts w:ascii="Arial" w:hAnsi="Arial" w:cs="Arial"/>
+          <w:b/>
+          <w:bCs/>
+          <w:sz w:val="28"/>
+          <w:szCs w:val="28"/>
+        </w:rPr>
+        <w:t>Quy Trình Nghiệp Vụ Cho</w:t>
+      </w:r>
+      <w:r>
+        <w:rPr>
+          <w:rFonts w:ascii="Arial" w:hAnsi="Arial" w:cs="Arial"/>
+          <w:b/>
+          <w:bCs/>
+          <w:sz w:val="28"/>
+          <w:szCs w:val="28"/>
+        </w:rPr>
+        <w:t xml:space="preserve"> Chuyển TIền Nội Bộ</w:t>
+      </w:r>
+    </w:p>
+    <w:p>
+      <w:pPr>
+        <w:ind w:left="720"/>
+        <w:rPr>
+          <w:rFonts w:ascii="Arial" w:hAnsi="Arial" w:cs="Arial"/>
+          <w:sz w:val="28"/>
+          <w:szCs w:val="28"/>
+        </w:rPr>
+      </w:pPr>
+      <w:r>
+        <w:rPr>
+          <w:rFonts w:ascii="Arial" w:hAnsi="Arial" w:cs="Arial"/>
+          <w:sz w:val="28"/>
+          <w:szCs w:val="28"/>
+        </w:rPr>
+        <w:t>BP-TF-</w:t>
+      </w:r>
+    </w:p>
+    <w:p>
+      <w:pPr>
+        <w:pStyle w:val="ListParagraph"/>
+        <w:numPr>
+          <w:ilvl w:val="2"/>
+          <w:numId w:val="13"/>
+        </w:numPr>
+        <w:rPr>
+          <w:rFonts w:ascii="Arial" w:hAnsi="Arial" w:cs="Arial"/>
+          <w:b/>
+          <w:bCs/>
+          <w:sz w:val="28"/>
+          <w:szCs w:val="28"/>
+        </w:rPr>
+      </w:pPr>
+      <w:r>
+        <w:rPr>
+          <w:rFonts w:ascii="Arial" w:hAnsi="Arial" w:cs="Arial"/>
+          <w:b/>
+          <w:bCs/>
+          <w:sz w:val="28"/>
+          <w:szCs w:val="28"/>
+        </w:rPr>
+        <w:t xml:space="preserve"> Quy Trình Nghiệp Vụ Cho Quản Lý Ngân Sách</w:t>
+      </w:r>
+    </w:p>
+    <w:p>
+      <w:pPr>
+        <w:ind w:left="720"/>
+        <w:rPr>
+          <w:rFonts w:ascii="Arial" w:hAnsi="Arial" w:cs="Arial"/>
+          <w:sz w:val="28"/>
+          <w:szCs w:val="28"/>
+        </w:rPr>
+      </w:pPr>
+      <w:r>
+        <w:rPr>
+          <w:rFonts w:ascii="Arial" w:hAnsi="Arial" w:cs="Arial"/>
+          <w:sz w:val="28"/>
+          <w:szCs w:val="28"/>
+        </w:rPr>
+        <w:t>BP-BUD-</w:t>
+      </w:r>
+    </w:p>
+    <w:p>
+      <w:pPr>
+        <w:pStyle w:val="ListParagraph"/>
+        <w:numPr>
+          <w:ilvl w:val="2"/>
+          <w:numId w:val="13"/>
+        </w:numPr>
+        <w:rPr>
+          <w:rFonts w:ascii="Arial" w:hAnsi="Arial" w:cs="Arial"/>
+          <w:b/>
+          <w:bCs/>
+          <w:sz w:val="28"/>
+          <w:szCs w:val="28"/>
+        </w:rPr>
+      </w:pPr>
+      <w:r>
+        <w:rPr>
+          <w:rFonts w:ascii="Arial" w:hAnsi="Arial" w:cs="Arial"/>
+          <w:b/>
+          <w:bCs/>
+          <w:sz w:val="28"/>
+          <w:szCs w:val="28"/>
+        </w:rPr>
+        <w:t xml:space="preserve"> </w:t>
+      </w:r>
+      <w:r>
+        <w:rPr>
+          <w:rFonts w:ascii="Arial" w:hAnsi="Arial" w:cs="Arial"/>
+          <w:b/>
+          <w:bCs/>
+          <w:sz w:val="28"/>
+          <w:szCs w:val="28"/>
+        </w:rPr>
+        <w:t>Quy Trình Nghiệp Vụ Cho</w:t>
+      </w:r>
+      <w:r>
+        <w:rPr>
+          <w:rFonts w:ascii="Arial" w:hAnsi="Arial" w:cs="Arial"/>
+          <w:b/>
+          <w:bCs/>
+          <w:sz w:val="28"/>
+          <w:szCs w:val="28"/>
+        </w:rPr>
+        <w:t xml:space="preserve"> Quản Lý Chi Phí Cố Định</w:t>
+      </w:r>
+    </w:p>
+    <w:p>
+      <w:pPr>
+        <w:ind w:left="720"/>
+        <w:rPr>
+          <w:rFonts w:ascii="Arial" w:hAnsi="Arial" w:cs="Arial"/>
+          <w:sz w:val="28"/>
+          <w:szCs w:val="28"/>
+        </w:rPr>
+      </w:pPr>
+      <w:r>
+        <w:rPr>
+          <w:rFonts w:ascii="Arial" w:hAnsi="Arial" w:cs="Arial"/>
+          <w:sz w:val="28"/>
+          <w:szCs w:val="28"/>
+        </w:rPr>
+        <w:lastRenderedPageBreak/>
+        <w:t>BP-RE-</w:t>
+      </w:r>
+    </w:p>
+    <w:p>
+      <w:pPr>
+        <w:pStyle w:val="ListParagraph"/>
+        <w:numPr>
+          <w:ilvl w:val="2"/>
+          <w:numId w:val="13"/>
+        </w:numPr>
+        <w:rPr>
+          <w:rFonts w:ascii="Arial" w:hAnsi="Arial" w:cs="Arial"/>
+          <w:b/>
+          <w:bCs/>
+          <w:sz w:val="28"/>
+          <w:szCs w:val="28"/>
+        </w:rPr>
+      </w:pPr>
+      <w:r>
+        <w:rPr>
+          <w:rFonts w:ascii="Arial" w:hAnsi="Arial" w:cs="Arial"/>
+          <w:b/>
+          <w:bCs/>
+          <w:sz w:val="28"/>
+          <w:szCs w:val="28"/>
+        </w:rPr>
+        <w:t xml:space="preserve"> </w:t>
+      </w:r>
+      <w:r>
+        <w:rPr>
+          <w:rFonts w:ascii="Arial" w:hAnsi="Arial" w:cs="Arial"/>
+          <w:b/>
+          <w:bCs/>
+          <w:sz w:val="28"/>
+          <w:szCs w:val="28"/>
+        </w:rPr>
+        <w:t>Quy Trình Nghiệp Vụ Cho</w:t>
+      </w:r>
+      <w:r>
+        <w:rPr>
+          <w:rFonts w:ascii="Arial" w:hAnsi="Arial" w:cs="Arial"/>
+          <w:b/>
+          <w:bCs/>
+          <w:sz w:val="28"/>
+          <w:szCs w:val="28"/>
+        </w:rPr>
+        <w:t xml:space="preserve"> Thống Kế Và Báo Cáo</w:t>
+      </w:r>
+    </w:p>
+    <w:p>
+      <w:pPr>
+        <w:ind w:left="720"/>
+        <w:rPr>
+          <w:rFonts w:ascii="Arial" w:hAnsi="Arial" w:cs="Arial"/>
+          <w:sz w:val="28"/>
+          <w:szCs w:val="28"/>
+        </w:rPr>
+      </w:pPr>
+      <w:r>
+        <w:rPr>
+          <w:rFonts w:ascii="Arial" w:hAnsi="Arial" w:cs="Arial"/>
+          <w:sz w:val="28"/>
+          <w:szCs w:val="28"/>
+        </w:rPr>
+        <w:t>BP-SRP-</w:t>
+      </w:r>
+    </w:p>
+    <w:p>
+      <w:pPr>
+        <w:pStyle w:val="ListParagraph"/>
+        <w:numPr>
+          <w:ilvl w:val="2"/>
+          <w:numId w:val="13"/>
+        </w:numPr>
+        <w:rPr>
+          <w:rFonts w:ascii="Arial" w:hAnsi="Arial" w:cs="Arial"/>
+          <w:b/>
+          <w:bCs/>
+          <w:sz w:val="28"/>
+          <w:szCs w:val="28"/>
+        </w:rPr>
+      </w:pPr>
+      <w:r>
+        <w:rPr>
+          <w:rFonts w:ascii="Arial" w:hAnsi="Arial" w:cs="Arial"/>
+          <w:b/>
+          <w:bCs/>
+          <w:sz w:val="28"/>
+          <w:szCs w:val="28"/>
+        </w:rPr>
+        <w:t xml:space="preserve"> </w:t>
+      </w:r>
+      <w:r>
+        <w:rPr>
+          <w:rFonts w:ascii="Arial" w:hAnsi="Arial" w:cs="Arial"/>
+          <w:b/>
+          <w:bCs/>
+          <w:sz w:val="28"/>
+          <w:szCs w:val="28"/>
+        </w:rPr>
+        <w:t>Quy Trình Nghiệp Vụ Cho</w:t>
+      </w:r>
+      <w:r>
+        <w:rPr>
+          <w:rFonts w:ascii="Arial" w:hAnsi="Arial" w:cs="Arial"/>
+          <w:b/>
+          <w:bCs/>
+          <w:sz w:val="28"/>
+          <w:szCs w:val="28"/>
+        </w:rPr>
+        <w:t xml:space="preserve"> Sao Lưu Và Khôi Phục</w:t>
+      </w:r>
+    </w:p>
+    <w:p>
+      <w:pPr>
+        <w:ind w:left="720"/>
+        <w:rPr>
+          <w:rFonts w:ascii="Arial" w:hAnsi="Arial" w:cs="Arial"/>
+          <w:b/>
+          <w:bCs/>
+          <w:sz w:val="28"/>
+          <w:szCs w:val="28"/>
+        </w:rPr>
+      </w:pPr>
+      <w:r>
+        <w:rPr>
+          <w:rFonts w:ascii="Arial" w:hAnsi="Arial" w:cs="Arial"/>
+          <w:sz w:val="28"/>
+          <w:szCs w:val="28"/>
+        </w:rPr>
+        <w:t>BP-</w:t>
+      </w:r>
+      <w:r>
+        <w:rPr>
+          <w:rFonts w:ascii="Arial" w:hAnsi="Arial" w:cs="Arial"/>
+          <w:sz w:val="28"/>
+          <w:szCs w:val="28"/>
+        </w:rPr>
+        <w:t>BUR-</w:t>
+      </w:r>
+    </w:p>
+    <w:p>
+      <w:pPr>
+        <w:pStyle w:val="ListParagraph"/>
+        <w:numPr>
+          <w:ilvl w:val="2"/>
+          <w:numId w:val="13"/>
+        </w:numPr>
+        <w:rPr>
+          <w:rFonts w:ascii="Arial" w:hAnsi="Arial" w:cs="Arial"/>
+          <w:b/>
+          <w:bCs/>
+          <w:sz w:val="28"/>
+          <w:szCs w:val="28"/>
+        </w:rPr>
+      </w:pPr>
+      <w:r>
+        <w:rPr>
+          <w:rFonts w:ascii="Arial" w:hAnsi="Arial" w:cs="Arial"/>
+          <w:b/>
+          <w:bCs/>
+          <w:sz w:val="28"/>
+          <w:szCs w:val="28"/>
+        </w:rPr>
+        <w:t xml:space="preserve"> </w:t>
+      </w:r>
+      <w:r>
+        <w:rPr>
+          <w:rFonts w:ascii="Arial" w:hAnsi="Arial" w:cs="Arial"/>
+          <w:b/>
+          <w:bCs/>
+          <w:sz w:val="28"/>
+          <w:szCs w:val="28"/>
+        </w:rPr>
+        <w:t>Quy Trình Nghiệp Vụ Cho</w:t>
+      </w:r>
+      <w:r>
+        <w:rPr>
+          <w:rFonts w:ascii="Arial" w:hAnsi="Arial" w:cs="Arial"/>
+          <w:b/>
+          <w:bCs/>
+          <w:sz w:val="28"/>
+          <w:szCs w:val="28"/>
+        </w:rPr>
+        <w:t xml:space="preserve"> Xóa Mềm</w:t>
+      </w:r>
+    </w:p>
+    <w:p>
+      <w:pPr>
+        <w:ind w:firstLine="720"/>
+        <w:rPr>
+          <w:rFonts w:ascii="Arial" w:hAnsi="Arial" w:cs="Arial"/>
+          <w:b/>
+          <w:bCs/>
+          <w:sz w:val="28"/>
+          <w:szCs w:val="28"/>
+        </w:rPr>
+      </w:pPr>
+      <w:r>
+        <w:rPr>
+          <w:rFonts w:ascii="Arial" w:hAnsi="Arial" w:cs="Arial"/>
+          <w:sz w:val="28"/>
+          <w:szCs w:val="28"/>
+        </w:rPr>
+        <w:t>BP-S</w:t>
+      </w:r>
+      <w:r>
+        <w:rPr>
+          <w:rFonts w:ascii="Arial" w:hAnsi="Arial" w:cs="Arial"/>
+          <w:sz w:val="28"/>
+          <w:szCs w:val="28"/>
+        </w:rPr>
+        <w:t>D-</w:t>
+      </w:r>
+    </w:p>
+    <w:p>
+      <w:pPr>
+        <w:pStyle w:val="ListParagraph"/>
+        <w:numPr>
+          <w:ilvl w:val="2"/>
+          <w:numId w:val="13"/>
+        </w:numPr>
+        <w:rPr>
+          <w:rFonts w:ascii="Arial" w:hAnsi="Arial" w:cs="Arial"/>
+          <w:b/>
+          <w:bCs/>
+          <w:sz w:val="28"/>
+          <w:szCs w:val="28"/>
+        </w:rPr>
+      </w:pPr>
+      <w:r>
+        <w:rPr>
+          <w:rFonts w:ascii="Arial" w:hAnsi="Arial" w:cs="Arial"/>
+          <w:b/>
+          <w:bCs/>
+          <w:sz w:val="28"/>
+          <w:szCs w:val="28"/>
+        </w:rPr>
+        <w:t xml:space="preserve"> </w:t>
+      </w:r>
+      <w:r>
+        <w:rPr>
+          <w:rFonts w:ascii="Arial" w:hAnsi="Arial" w:cs="Arial"/>
+          <w:b/>
+          <w:bCs/>
+          <w:sz w:val="28"/>
+          <w:szCs w:val="28"/>
+        </w:rPr>
+        <w:t>Quy Trình Nghiệp Vụ Cho</w:t>
+      </w:r>
+      <w:r>
+        <w:rPr>
+          <w:rFonts w:ascii="Arial" w:hAnsi="Arial" w:cs="Arial"/>
+          <w:b/>
+          <w:bCs/>
+          <w:sz w:val="28"/>
+          <w:szCs w:val="28"/>
+        </w:rPr>
+        <w:t xml:space="preserve"> Lịch Sử Giao Dịch</w:t>
+      </w:r>
+    </w:p>
+    <w:p>
+      <w:pPr>
+        <w:ind w:left="720"/>
+        <w:rPr>
+          <w:rFonts w:ascii="Arial" w:hAnsi="Arial" w:cs="Arial"/>
+          <w:b/>
+          <w:bCs/>
+          <w:sz w:val="28"/>
+          <w:szCs w:val="28"/>
+        </w:rPr>
+      </w:pPr>
+      <w:r>
+        <w:rPr>
+          <w:rFonts w:ascii="Arial" w:hAnsi="Arial" w:cs="Arial"/>
+          <w:sz w:val="28"/>
+          <w:szCs w:val="28"/>
+        </w:rPr>
+        <w:t>BP-</w:t>
+      </w:r>
+      <w:r>
+        <w:rPr>
+          <w:rFonts w:ascii="Arial" w:hAnsi="Arial" w:cs="Arial"/>
+          <w:sz w:val="28"/>
+          <w:szCs w:val="28"/>
+        </w:rPr>
+        <w:t>HIS-</w:t>
+      </w:r>
+    </w:p>
+    <w:p>
+      <w:pPr>
+        <w:pStyle w:val="ListParagraph"/>
+        <w:numPr>
+          <w:ilvl w:val="2"/>
+          <w:numId w:val="13"/>
+        </w:numPr>
+        <w:rPr>
+          <w:rFonts w:ascii="Arial" w:hAnsi="Arial" w:cs="Arial"/>
+          <w:b/>
+          <w:bCs/>
+          <w:sz w:val="28"/>
+          <w:szCs w:val="28"/>
+        </w:rPr>
+      </w:pPr>
+      <w:r>
+        <w:rPr>
+          <w:rFonts w:ascii="Arial" w:hAnsi="Arial" w:cs="Arial"/>
+          <w:b/>
+          <w:bCs/>
+          <w:sz w:val="28"/>
+          <w:szCs w:val="28"/>
+        </w:rPr>
+        <w:t xml:space="preserve"> </w:t>
+      </w:r>
+      <w:r>
+        <w:rPr>
+          <w:rFonts w:ascii="Arial" w:hAnsi="Arial" w:cs="Arial"/>
+          <w:b/>
+          <w:bCs/>
+          <w:sz w:val="28"/>
+          <w:szCs w:val="28"/>
+        </w:rPr>
+        <w:t>Updating…</w:t>
       </w:r>
     </w:p>
     <w:p>
@@ -14644,6 +16670,118 @@
     </w:lvl>
   </w:abstractNum>
   <w:abstractNum w:abstractNumId="7" w15:restartNumberingAfterBreak="0">
+    <w:nsid w:val="48052BF7"/>
+    <w:multiLevelType w:val="hybridMultilevel"/>
+    <w:tmpl w:val="768A013E"/>
+    <w:lvl w:ilvl="0" w:tplc="D264E14A">
+      <w:numFmt w:val="bullet"/>
+      <w:lvlText w:val=""/>
+      <w:lvlJc w:val="left"/>
+      <w:pPr>
+        <w:ind w:left="720" w:hanging="360"/>
+      </w:pPr>
+      <w:rPr>
+        <w:rFonts w:ascii="Wingdings" w:eastAsiaTheme="minorHAnsi" w:hAnsi="Wingdings" w:cs="Arial" w:hint="default"/>
+      </w:rPr>
+    </w:lvl>
+    <w:lvl w:ilvl="1" w:tplc="04090003">
+      <w:start w:val="1"/>
+      <w:numFmt w:val="bullet"/>
+      <w:lvlText w:val="o"/>
+      <w:lvlJc w:val="left"/>
+      <w:pPr>
+        <w:ind w:left="1440" w:hanging="360"/>
+      </w:pPr>
+      <w:rPr>
+        <w:rFonts w:ascii="Courier New" w:hAnsi="Courier New" w:cs="Courier New" w:hint="default"/>
+      </w:rPr>
+    </w:lvl>
+    <w:lvl w:ilvl="2" w:tplc="04090005" w:tentative="1">
+      <w:start w:val="1"/>
+      <w:numFmt w:val="bullet"/>
+      <w:lvlText w:val=""/>
+      <w:lvlJc w:val="left"/>
+      <w:pPr>
+        <w:ind w:left="2160" w:hanging="360"/>
+      </w:pPr>
+      <w:rPr>
+        <w:rFonts w:ascii="Wingdings" w:hAnsi="Wingdings" w:hint="default"/>
+      </w:rPr>
+    </w:lvl>
+    <w:lvl w:ilvl="3" w:tplc="04090001" w:tentative="1">
+      <w:start w:val="1"/>
+      <w:numFmt w:val="bullet"/>
+      <w:lvlText w:val=""/>
+      <w:lvlJc w:val="left"/>
+      <w:pPr>
+        <w:ind w:left="2880" w:hanging="360"/>
+      </w:pPr>
+      <w:rPr>
+        <w:rFonts w:ascii="Symbol" w:hAnsi="Symbol" w:hint="default"/>
+      </w:rPr>
+    </w:lvl>
+    <w:lvl w:ilvl="4" w:tplc="04090003" w:tentative="1">
+      <w:start w:val="1"/>
+      <w:numFmt w:val="bullet"/>
+      <w:lvlText w:val="o"/>
+      <w:lvlJc w:val="left"/>
+      <w:pPr>
+        <w:ind w:left="3600" w:hanging="360"/>
+      </w:pPr>
+      <w:rPr>
+        <w:rFonts w:ascii="Courier New" w:hAnsi="Courier New" w:cs="Courier New" w:hint="default"/>
+      </w:rPr>
+    </w:lvl>
+    <w:lvl w:ilvl="5" w:tplc="04090005" w:tentative="1">
+      <w:start w:val="1"/>
+      <w:numFmt w:val="bullet"/>
+      <w:lvlText w:val=""/>
+      <w:lvlJc w:val="left"/>
+      <w:pPr>
+        <w:ind w:left="4320" w:hanging="360"/>
+      </w:pPr>
+      <w:rPr>
+        <w:rFonts w:ascii="Wingdings" w:hAnsi="Wingdings" w:hint="default"/>
+      </w:rPr>
+    </w:lvl>
+    <w:lvl w:ilvl="6" w:tplc="04090001" w:tentative="1">
+      <w:start w:val="1"/>
+      <w:numFmt w:val="bullet"/>
+      <w:lvlText w:val=""/>
+      <w:lvlJc w:val="left"/>
+      <w:pPr>
+        <w:ind w:left="5040" w:hanging="360"/>
+      </w:pPr>
+      <w:rPr>
+        <w:rFonts w:ascii="Symbol" w:hAnsi="Symbol" w:hint="default"/>
+      </w:rPr>
+    </w:lvl>
+    <w:lvl w:ilvl="7" w:tplc="04090003" w:tentative="1">
+      <w:start w:val="1"/>
+      <w:numFmt w:val="bullet"/>
+      <w:lvlText w:val="o"/>
+      <w:lvlJc w:val="left"/>
+      <w:pPr>
+        <w:ind w:left="5760" w:hanging="360"/>
+      </w:pPr>
+      <w:rPr>
+        <w:rFonts w:ascii="Courier New" w:hAnsi="Courier New" w:cs="Courier New" w:hint="default"/>
+      </w:rPr>
+    </w:lvl>
+    <w:lvl w:ilvl="8" w:tplc="04090005" w:tentative="1">
+      <w:start w:val="1"/>
+      <w:numFmt w:val="bullet"/>
+      <w:lvlText w:val=""/>
+      <w:lvlJc w:val="left"/>
+      <w:pPr>
+        <w:ind w:left="6480" w:hanging="360"/>
+      </w:pPr>
+      <w:rPr>
+        <w:rFonts w:ascii="Wingdings" w:hAnsi="Wingdings" w:hint="default"/>
+      </w:rPr>
+    </w:lvl>
+  </w:abstractNum>
+  <w:abstractNum w:abstractNumId="8" w15:restartNumberingAfterBreak="0">
     <w:nsid w:val="4851143D"/>
     <w:multiLevelType w:val="multilevel"/>
     <w:tmpl w:val="45A41FFA"/>
@@ -14764,7 +16902,7 @@
       </w:rPr>
     </w:lvl>
   </w:abstractNum>
-  <w:abstractNum w:abstractNumId="8" w15:restartNumberingAfterBreak="0">
+  <w:abstractNum w:abstractNumId="9" w15:restartNumberingAfterBreak="0">
     <w:nsid w:val="48E00A08"/>
     <w:multiLevelType w:val="hybridMultilevel"/>
     <w:tmpl w:val="6D0E51BC"/>
@@ -14877,7 +17015,7 @@
       </w:rPr>
     </w:lvl>
   </w:abstractNum>
-  <w:abstractNum w:abstractNumId="9" w15:restartNumberingAfterBreak="0">
+  <w:abstractNum w:abstractNumId="10" w15:restartNumberingAfterBreak="0">
     <w:nsid w:val="56636AC1"/>
     <w:multiLevelType w:val="hybridMultilevel"/>
     <w:tmpl w:val="82289CFA"/>
@@ -14990,7 +17128,7 @@
       </w:rPr>
     </w:lvl>
   </w:abstractNum>
-  <w:abstractNum w:abstractNumId="10" w15:restartNumberingAfterBreak="0">
+  <w:abstractNum w:abstractNumId="11" w15:restartNumberingAfterBreak="0">
     <w:nsid w:val="62726C19"/>
     <w:multiLevelType w:val="multilevel"/>
     <w:tmpl w:val="B5AAC380"/>
@@ -15104,7 +17242,7 @@
       </w:pPr>
     </w:lvl>
   </w:abstractNum>
-  <w:abstractNum w:abstractNumId="11" w15:restartNumberingAfterBreak="0">
+  <w:abstractNum w:abstractNumId="12" w15:restartNumberingAfterBreak="0">
     <w:nsid w:val="67DD69B0"/>
     <w:multiLevelType w:val="hybridMultilevel"/>
     <w:tmpl w:val="FB36C922"/>
@@ -15217,7 +17355,7 @@
       </w:rPr>
     </w:lvl>
   </w:abstractNum>
-  <w:abstractNum w:abstractNumId="12" w15:restartNumberingAfterBreak="0">
+  <w:abstractNum w:abstractNumId="13" w15:restartNumberingAfterBreak="0">
     <w:nsid w:val="76A45631"/>
     <w:multiLevelType w:val="hybridMultilevel"/>
     <w:tmpl w:val="8C96FD0E"/>
@@ -15330,7 +17468,7 @@
       </w:rPr>
     </w:lvl>
   </w:abstractNum>
-  <w:abstractNum w:abstractNumId="13" w15:restartNumberingAfterBreak="0">
+  <w:abstractNum w:abstractNumId="14" w15:restartNumberingAfterBreak="0">
     <w:nsid w:val="76DB7E8C"/>
     <w:multiLevelType w:val="hybridMultilevel"/>
     <w:tmpl w:val="6E844D3E"/>
@@ -15443,7 +17581,7 @@
       </w:rPr>
     </w:lvl>
   </w:abstractNum>
-  <w:abstractNum w:abstractNumId="14" w15:restartNumberingAfterBreak="0">
+  <w:abstractNum w:abstractNumId="15" w15:restartNumberingAfterBreak="0">
     <w:nsid w:val="7DE467C8"/>
     <w:multiLevelType w:val="hybridMultilevel"/>
     <w:tmpl w:val="A58A2094"/>
@@ -15563,10 +17701,10 @@
     <w:abstractNumId w:val="6"/>
   </w:num>
   <w:num w:numId="3" w16cid:durableId="1255745673">
-    <w:abstractNumId w:val="10"/>
+    <w:abstractNumId w:val="11"/>
   </w:num>
   <w:num w:numId="4" w16cid:durableId="924846929">
-    <w:abstractNumId w:val="10"/>
+    <w:abstractNumId w:val="11"/>
     <w:lvlOverride w:ilvl="0">
       <w:startOverride w:val="1"/>
     </w:lvlOverride>
@@ -15602,16 +17740,16 @@
     <w:abstractNumId w:val="0"/>
   </w:num>
   <w:num w:numId="7" w16cid:durableId="1045829756">
-    <w:abstractNumId w:val="11"/>
+    <w:abstractNumId w:val="12"/>
   </w:num>
   <w:num w:numId="8" w16cid:durableId="2133935577">
-    <w:abstractNumId w:val="14"/>
+    <w:abstractNumId w:val="15"/>
   </w:num>
   <w:num w:numId="9" w16cid:durableId="1707943001">
     <w:abstractNumId w:val="2"/>
   </w:num>
   <w:num w:numId="10" w16cid:durableId="1411581399">
-    <w:abstractNumId w:val="12"/>
+    <w:abstractNumId w:val="13"/>
   </w:num>
   <w:num w:numId="11" w16cid:durableId="1559781520">
     <w:abstractNumId w:val="5"/>
@@ -15620,16 +17758,19 @@
     <w:abstractNumId w:val="4"/>
   </w:num>
   <w:num w:numId="13" w16cid:durableId="2099205866">
-    <w:abstractNumId w:val="7"/>
+    <w:abstractNumId w:val="8"/>
   </w:num>
   <w:num w:numId="14" w16cid:durableId="1074741623">
+    <w:abstractNumId w:val="10"/>
+  </w:num>
+  <w:num w:numId="15" w16cid:durableId="1581208812">
     <w:abstractNumId w:val="9"/>
   </w:num>
-  <w:num w:numId="15" w16cid:durableId="1581208812">
-    <w:abstractNumId w:val="8"/>
+  <w:num w:numId="16" w16cid:durableId="1700816857">
+    <w:abstractNumId w:val="14"/>
   </w:num>
-  <w:num w:numId="16" w16cid:durableId="1700816857">
-    <w:abstractNumId w:val="13"/>
+  <w:num w:numId="17" w16cid:durableId="551961133">
+    <w:abstractNumId w:val="7"/>
   </w:num>
 </w:numbering>
 </file>
@@ -16254,7 +18395,6 @@
   <w:style w:type="character" w:default="1" w:styleId="DefaultParagraphFont">
     <w:name w:val="Default Paragraph Font"/>
     <w:uiPriority w:val="1"/>
-    <w:semiHidden/>
     <w:unhideWhenUsed/>
   </w:style>
   <w:style w:type="table" w:default="1" w:styleId="TableNormal">
@@ -16948,4 +19088,16 @@
     </a:ext>
   </a:extLst>
 </a:theme>
+</file>
+
+<file path=customXml/item1.xml><?xml version="1.0" encoding="utf-8"?>
+<b:Sources xmlns:b="http://schemas.openxmlformats.org/officeDocument/2006/bibliography" xmlns="http://schemas.openxmlformats.org/officeDocument/2006/bibliography" SelectedStyle="\APASixthEditionOfficeOnline.xsl" StyleName="APA" Version="6"/>
+</file>
+
+<file path=customXml/itemProps1.xml><?xml version="1.0" encoding="utf-8"?>
+<ds:datastoreItem xmlns:ds="http://schemas.openxmlformats.org/officeDocument/2006/customXml" ds:itemID="{F7A20586-F72E-4E12-92AC-8FB50D1D087B}">
+  <ds:schemaRefs>
+    <ds:schemaRef ds:uri="http://schemas.openxmlformats.org/officeDocument/2006/bibliography"/>
+  </ds:schemaRefs>
+</ds:datastoreItem>
 </file>
</xml_diff>

<commit_message>
phác thảo sơ về các quy trình nghiệp vụ chính, làm chi tiết quy trình nghiệp vụ 1.4.1 và 1.4.2
</commit_message>
<xml_diff>
--- a/Document/Expense Tracker SRS.docx
+++ b/Document/Expense Tracker SRS.docx
@@ -1801,15 +1801,7 @@
                 <w:sz w:val="28"/>
                 <w:szCs w:val="28"/>
               </w:rPr>
-              <w:t>BP-CATE</w:t>
-            </w:r>
-            <w:r>
-              <w:rPr>
-                <w:rFonts w:ascii="Arial" w:hAnsi="Arial" w:cs="Arial"/>
-                <w:sz w:val="28"/>
-                <w:szCs w:val="28"/>
-              </w:rPr>
-              <w:t>-&lt;num&gt;</w:t>
+              <w:t>BP-CATE-&lt;num&gt;</w:t>
             </w:r>
           </w:p>
         </w:tc>
@@ -1858,15 +1850,7 @@
                 <w:sz w:val="28"/>
                 <w:szCs w:val="28"/>
               </w:rPr>
-              <w:t>BP-IT</w:t>
-            </w:r>
-            <w:r>
-              <w:rPr>
-                <w:rFonts w:ascii="Arial" w:hAnsi="Arial" w:cs="Arial"/>
-                <w:sz w:val="28"/>
-                <w:szCs w:val="28"/>
-              </w:rPr>
-              <w:t>-&lt;num&gt;</w:t>
+              <w:t>BP-IT-&lt;num&gt;</w:t>
             </w:r>
           </w:p>
         </w:tc>
@@ -1939,15 +1923,7 @@
                 <w:sz w:val="28"/>
                 <w:szCs w:val="28"/>
               </w:rPr>
-              <w:t>TI</w:t>
-            </w:r>
-            <w:r>
-              <w:rPr>
-                <w:rFonts w:ascii="Arial" w:hAnsi="Arial" w:cs="Arial"/>
-                <w:sz w:val="28"/>
-                <w:szCs w:val="28"/>
-              </w:rPr>
-              <w:t>-&lt;num&gt;</w:t>
+              <w:t>TI-&lt;num&gt;</w:t>
             </w:r>
           </w:p>
         </w:tc>
@@ -1997,15 +1973,7 @@
                 <w:szCs w:val="28"/>
               </w:rPr>
               <w:lastRenderedPageBreak/>
-              <w:t>BP-SM</w:t>
-            </w:r>
-            <w:r>
-              <w:rPr>
-                <w:rFonts w:ascii="Arial" w:hAnsi="Arial" w:cs="Arial"/>
-                <w:sz w:val="28"/>
-                <w:szCs w:val="28"/>
-              </w:rPr>
-              <w:t>-&lt;num&gt;</w:t>
+              <w:t>BP-SM-&lt;num&gt;</w:t>
             </w:r>
           </w:p>
         </w:tc>
@@ -2054,15 +2022,7 @@
                 <w:sz w:val="28"/>
                 <w:szCs w:val="28"/>
               </w:rPr>
-              <w:t>BP-TF</w:t>
-            </w:r>
-            <w:r>
-              <w:rPr>
-                <w:rFonts w:ascii="Arial" w:hAnsi="Arial" w:cs="Arial"/>
-                <w:sz w:val="28"/>
-                <w:szCs w:val="28"/>
-              </w:rPr>
-              <w:t>-&lt;num&gt;</w:t>
+              <w:t>BP-TF-&lt;num&gt;</w:t>
             </w:r>
           </w:p>
         </w:tc>
@@ -2111,15 +2071,7 @@
                 <w:sz w:val="28"/>
                 <w:szCs w:val="28"/>
               </w:rPr>
-              <w:t>BP-BUD</w:t>
-            </w:r>
-            <w:r>
-              <w:rPr>
-                <w:rFonts w:ascii="Arial" w:hAnsi="Arial" w:cs="Arial"/>
-                <w:sz w:val="28"/>
-                <w:szCs w:val="28"/>
-              </w:rPr>
-              <w:t>-&lt;num&gt;</w:t>
+              <w:t>BP-BUD-&lt;num&gt;</w:t>
             </w:r>
           </w:p>
         </w:tc>
@@ -2168,15 +2120,7 @@
                 <w:sz w:val="28"/>
                 <w:szCs w:val="28"/>
               </w:rPr>
-              <w:t>BP-RE</w:t>
-            </w:r>
-            <w:r>
-              <w:rPr>
-                <w:rFonts w:ascii="Arial" w:hAnsi="Arial" w:cs="Arial"/>
-                <w:sz w:val="28"/>
-                <w:szCs w:val="28"/>
-              </w:rPr>
-              <w:t>-&lt;num&gt;</w:t>
+              <w:t>BP-RE-&lt;num&gt;</w:t>
             </w:r>
           </w:p>
         </w:tc>
@@ -2225,15 +2169,7 @@
                 <w:sz w:val="28"/>
                 <w:szCs w:val="28"/>
               </w:rPr>
-              <w:t>BP-SRP</w:t>
-            </w:r>
-            <w:r>
-              <w:rPr>
-                <w:rFonts w:ascii="Arial" w:hAnsi="Arial" w:cs="Arial"/>
-                <w:sz w:val="28"/>
-                <w:szCs w:val="28"/>
-              </w:rPr>
-              <w:t>-&lt;num&gt;</w:t>
+              <w:t>BP-SRP-&lt;num&gt;</w:t>
             </w:r>
           </w:p>
         </w:tc>
@@ -2282,15 +2218,7 @@
                 <w:sz w:val="28"/>
                 <w:szCs w:val="28"/>
               </w:rPr>
-              <w:t>BP-BUR</w:t>
-            </w:r>
-            <w:r>
-              <w:rPr>
-                <w:rFonts w:ascii="Arial" w:hAnsi="Arial" w:cs="Arial"/>
-                <w:sz w:val="28"/>
-                <w:szCs w:val="28"/>
-              </w:rPr>
-              <w:t>-&lt;num&gt;</w:t>
+              <w:t>BP-BUR-&lt;num&gt;</w:t>
             </w:r>
           </w:p>
         </w:tc>
@@ -2339,15 +2267,7 @@
                 <w:sz w:val="28"/>
                 <w:szCs w:val="28"/>
               </w:rPr>
-              <w:t>BP-SD</w:t>
-            </w:r>
-            <w:r>
-              <w:rPr>
-                <w:rFonts w:ascii="Arial" w:hAnsi="Arial" w:cs="Arial"/>
-                <w:sz w:val="28"/>
-                <w:szCs w:val="28"/>
-              </w:rPr>
-              <w:t>-&lt;num&gt;</w:t>
+              <w:t>BP-SD-&lt;num&gt;</w:t>
             </w:r>
           </w:p>
         </w:tc>
@@ -2396,15 +2316,7 @@
                 <w:sz w:val="28"/>
                 <w:szCs w:val="28"/>
               </w:rPr>
-              <w:t>BP-HIS</w:t>
-            </w:r>
-            <w:r>
-              <w:rPr>
-                <w:rFonts w:ascii="Arial" w:hAnsi="Arial" w:cs="Arial"/>
-                <w:sz w:val="28"/>
-                <w:szCs w:val="28"/>
-              </w:rPr>
-              <w:t>-&lt;num&gt;</w:t>
+              <w:t>BP-HIS-&lt;num&gt;</w:t>
             </w:r>
           </w:p>
         </w:tc>
@@ -14416,6 +14328,17 @@
     </w:p>
     <w:p>
       <w:pPr>
+        <w:rPr>
+          <w:rFonts w:ascii="Arial" w:hAnsi="Arial" w:cs="Arial"/>
+          <w:b/>
+          <w:bCs/>
+          <w:sz w:val="28"/>
+          <w:szCs w:val="28"/>
+        </w:rPr>
+      </w:pPr>
+    </w:p>
+    <w:p>
+      <w:pPr>
         <w:pStyle w:val="ListParagraph"/>
         <w:numPr>
           <w:ilvl w:val="1"/>
@@ -14472,13 +14395,17 @@
         <w:ind w:left="720"/>
         <w:rPr>
           <w:rFonts w:ascii="Arial" w:hAnsi="Arial" w:cs="Arial"/>
-          <w:sz w:val="28"/>
-          <w:szCs w:val="28"/>
-        </w:rPr>
-      </w:pPr>
-      <w:r>
-        <w:rPr>
-          <w:rFonts w:ascii="Arial" w:hAnsi="Arial" w:cs="Arial"/>
+          <w:b/>
+          <w:bCs/>
+          <w:sz w:val="28"/>
+          <w:szCs w:val="28"/>
+        </w:rPr>
+      </w:pPr>
+      <w:r>
+        <w:rPr>
+          <w:rFonts w:ascii="Arial" w:hAnsi="Arial" w:cs="Arial"/>
+          <w:b/>
+          <w:bCs/>
           <w:sz w:val="28"/>
           <w:szCs w:val="28"/>
         </w:rPr>
@@ -14504,7 +14431,117 @@
           <w:sz w:val="28"/>
           <w:szCs w:val="28"/>
         </w:rPr>
-        <w:t>Nhập thông tin cần thiết</w:t>
+        <w:t>Người dùng nhập thông tin:</w:t>
+      </w:r>
+    </w:p>
+    <w:p>
+      <w:pPr>
+        <w:pStyle w:val="ListParagraph"/>
+        <w:numPr>
+          <w:ilvl w:val="1"/>
+          <w:numId w:val="15"/>
+        </w:numPr>
+        <w:rPr>
+          <w:rFonts w:ascii="Arial" w:hAnsi="Arial" w:cs="Arial"/>
+          <w:sz w:val="28"/>
+          <w:szCs w:val="28"/>
+        </w:rPr>
+      </w:pPr>
+      <w:r>
+        <w:rPr>
+          <w:rFonts w:ascii="Arial" w:hAnsi="Arial" w:cs="Arial"/>
+          <w:sz w:val="28"/>
+          <w:szCs w:val="28"/>
+        </w:rPr>
+        <w:t>Username</w:t>
+      </w:r>
+    </w:p>
+    <w:p>
+      <w:pPr>
+        <w:pStyle w:val="ListParagraph"/>
+        <w:numPr>
+          <w:ilvl w:val="1"/>
+          <w:numId w:val="15"/>
+        </w:numPr>
+        <w:rPr>
+          <w:rFonts w:ascii="Arial" w:hAnsi="Arial" w:cs="Arial"/>
+          <w:sz w:val="28"/>
+          <w:szCs w:val="28"/>
+        </w:rPr>
+      </w:pPr>
+      <w:r>
+        <w:rPr>
+          <w:rFonts w:ascii="Arial" w:hAnsi="Arial" w:cs="Arial"/>
+          <w:sz w:val="28"/>
+          <w:szCs w:val="28"/>
+        </w:rPr>
+        <w:t>Nickname (nếu không có sẽ sử dụng username)</w:t>
+      </w:r>
+    </w:p>
+    <w:p>
+      <w:pPr>
+        <w:pStyle w:val="ListParagraph"/>
+        <w:numPr>
+          <w:ilvl w:val="1"/>
+          <w:numId w:val="15"/>
+        </w:numPr>
+        <w:rPr>
+          <w:rFonts w:ascii="Arial" w:hAnsi="Arial" w:cs="Arial"/>
+          <w:sz w:val="28"/>
+          <w:szCs w:val="28"/>
+        </w:rPr>
+      </w:pPr>
+      <w:r>
+        <w:rPr>
+          <w:rFonts w:ascii="Arial" w:hAnsi="Arial" w:cs="Arial"/>
+          <w:sz w:val="28"/>
+          <w:szCs w:val="28"/>
+        </w:rPr>
+        <w:t>Email</w:t>
+      </w:r>
+    </w:p>
+    <w:p>
+      <w:pPr>
+        <w:pStyle w:val="ListParagraph"/>
+        <w:numPr>
+          <w:ilvl w:val="1"/>
+          <w:numId w:val="15"/>
+        </w:numPr>
+        <w:rPr>
+          <w:rFonts w:ascii="Arial" w:hAnsi="Arial" w:cs="Arial"/>
+          <w:sz w:val="28"/>
+          <w:szCs w:val="28"/>
+        </w:rPr>
+      </w:pPr>
+      <w:r>
+        <w:rPr>
+          <w:rFonts w:ascii="Arial" w:hAnsi="Arial" w:cs="Arial"/>
+          <w:sz w:val="28"/>
+          <w:szCs w:val="28"/>
+        </w:rPr>
+        <w:t>Mật khẩu</w:t>
+      </w:r>
+    </w:p>
+    <w:p>
+      <w:pPr>
+        <w:pStyle w:val="ListParagraph"/>
+        <w:numPr>
+          <w:ilvl w:val="1"/>
+          <w:numId w:val="15"/>
+        </w:numPr>
+        <w:rPr>
+          <w:rFonts w:ascii="Arial" w:hAnsi="Arial" w:cs="Arial"/>
+          <w:sz w:val="28"/>
+          <w:szCs w:val="28"/>
+        </w:rPr>
+      </w:pPr>
+      <w:r>
+        <w:rPr>
+          <w:rFonts w:ascii="Arial" w:hAnsi="Arial" w:cs="Arial"/>
+          <w:sz w:val="28"/>
+          <w:szCs w:val="28"/>
+        </w:rPr>
+        <w:t>Nhập lại mật khẩu</w:t>
       </w:r>
     </w:p>
     <w:p>
@@ -14526,7 +14563,104 @@
           <w:sz w:val="28"/>
           <w:szCs w:val="28"/>
         </w:rPr>
-        <w:t>Xác thực thông tin đầy đủ chưa</w:t>
+        <w:t xml:space="preserve">Xác thực thông </w:t>
+      </w:r>
+      <w:r>
+        <w:rPr>
+          <w:rFonts w:ascii="Arial" w:hAnsi="Arial" w:cs="Arial"/>
+          <w:sz w:val="28"/>
+          <w:szCs w:val="28"/>
+        </w:rPr>
+        <w:t>thực thông tin được nhập vào</w:t>
+      </w:r>
+    </w:p>
+    <w:p>
+      <w:pPr>
+        <w:pStyle w:val="ListParagraph"/>
+        <w:numPr>
+          <w:ilvl w:val="1"/>
+          <w:numId w:val="15"/>
+        </w:numPr>
+        <w:rPr>
+          <w:rFonts w:ascii="Arial" w:hAnsi="Arial" w:cs="Arial"/>
+          <w:sz w:val="28"/>
+          <w:szCs w:val="28"/>
+        </w:rPr>
+      </w:pPr>
+      <w:r>
+        <w:rPr>
+          <w:rFonts w:ascii="Arial" w:hAnsi="Arial" w:cs="Arial"/>
+          <w:sz w:val="28"/>
+          <w:szCs w:val="28"/>
+        </w:rPr>
+        <w:lastRenderedPageBreak/>
+        <w:t>Username tối thiểu 3 ký tự</w:t>
+      </w:r>
+    </w:p>
+    <w:p>
+      <w:pPr>
+        <w:pStyle w:val="ListParagraph"/>
+        <w:numPr>
+          <w:ilvl w:val="1"/>
+          <w:numId w:val="15"/>
+        </w:numPr>
+        <w:rPr>
+          <w:rFonts w:ascii="Arial" w:hAnsi="Arial" w:cs="Arial"/>
+          <w:sz w:val="28"/>
+          <w:szCs w:val="28"/>
+        </w:rPr>
+      </w:pPr>
+      <w:r>
+        <w:rPr>
+          <w:rFonts w:ascii="Arial" w:hAnsi="Arial" w:cs="Arial"/>
+          <w:sz w:val="28"/>
+          <w:szCs w:val="28"/>
+        </w:rPr>
+        <w:t>Mật khẩu tối thiểu 6 ký tự</w:t>
+      </w:r>
+    </w:p>
+    <w:p>
+      <w:pPr>
+        <w:pStyle w:val="ListParagraph"/>
+        <w:numPr>
+          <w:ilvl w:val="1"/>
+          <w:numId w:val="15"/>
+        </w:numPr>
+        <w:rPr>
+          <w:rFonts w:ascii="Arial" w:hAnsi="Arial" w:cs="Arial"/>
+          <w:sz w:val="28"/>
+          <w:szCs w:val="28"/>
+        </w:rPr>
+      </w:pPr>
+      <w:r>
+        <w:rPr>
+          <w:rFonts w:ascii="Arial" w:hAnsi="Arial" w:cs="Arial"/>
+          <w:sz w:val="28"/>
+          <w:szCs w:val="28"/>
+        </w:rPr>
+        <w:t>Mật khẩu nhập lại phải giống mật khẩu trên</w:t>
+      </w:r>
+    </w:p>
+    <w:p>
+      <w:pPr>
+        <w:pStyle w:val="ListParagraph"/>
+        <w:numPr>
+          <w:ilvl w:val="1"/>
+          <w:numId w:val="15"/>
+        </w:numPr>
+        <w:rPr>
+          <w:rFonts w:ascii="Arial" w:hAnsi="Arial" w:cs="Arial"/>
+          <w:sz w:val="28"/>
+          <w:szCs w:val="28"/>
+        </w:rPr>
+      </w:pPr>
+      <w:r>
+        <w:rPr>
+          <w:rFonts w:ascii="Arial" w:hAnsi="Arial" w:cs="Arial"/>
+          <w:sz w:val="28"/>
+          <w:szCs w:val="28"/>
+        </w:rPr>
+        <w:t>Email đúng định dạng</w:t>
       </w:r>
     </w:p>
     <w:p>
@@ -14548,7 +14682,23 @@
           <w:sz w:val="28"/>
           <w:szCs w:val="28"/>
         </w:rPr>
-        <w:t>Kiểm tra xem username/email đã tồn tại chưa</w:t>
+        <w:t xml:space="preserve">Kiểm tra xem </w:t>
+      </w:r>
+      <w:r>
+        <w:rPr>
+          <w:rFonts w:ascii="Arial" w:hAnsi="Arial" w:cs="Arial"/>
+          <w:sz w:val="28"/>
+          <w:szCs w:val="28"/>
+        </w:rPr>
+        <w:t>Username và Email</w:t>
+      </w:r>
+      <w:r>
+        <w:rPr>
+          <w:rFonts w:ascii="Arial" w:hAnsi="Arial" w:cs="Arial"/>
+          <w:sz w:val="28"/>
+          <w:szCs w:val="28"/>
+        </w:rPr>
+        <w:t xml:space="preserve"> đã tồn tại chưa</w:t>
       </w:r>
     </w:p>
     <w:p>
@@ -14614,25 +14764,48 @@
           <w:sz w:val="28"/>
           <w:szCs w:val="28"/>
         </w:rPr>
-        <w:t>Thành công</w:t>
-      </w:r>
-    </w:p>
-    <w:p>
-      <w:pPr>
-        <w:ind w:left="720"/>
-        <w:rPr>
-          <w:rFonts w:ascii="Arial" w:hAnsi="Arial" w:cs="Arial"/>
-          <w:sz w:val="28"/>
-          <w:szCs w:val="28"/>
-        </w:rPr>
-      </w:pPr>
-      <w:r>
-        <w:rPr>
-          <w:rFonts w:ascii="Arial" w:hAnsi="Arial" w:cs="Arial"/>
+        <w:t>Thông báo tạo tài khoản thành công, chuyển về màn hình đăng nhập</w:t>
+      </w:r>
+    </w:p>
+    <w:p>
+      <w:pPr>
+        <w:rPr>
+          <w:rFonts w:ascii="Arial" w:hAnsi="Arial" w:cs="Arial"/>
+          <w:sz w:val="28"/>
+          <w:szCs w:val="28"/>
+        </w:rPr>
+      </w:pPr>
+    </w:p>
+    <w:p>
+      <w:pPr>
+        <w:ind w:left="720"/>
+        <w:rPr>
+          <w:rFonts w:ascii="Arial" w:hAnsi="Arial" w:cs="Arial"/>
+          <w:b/>
+          <w:bCs/>
+          <w:sz w:val="28"/>
+          <w:szCs w:val="28"/>
+        </w:rPr>
+      </w:pPr>
+      <w:r>
+        <w:rPr>
+          <w:rFonts w:ascii="Arial" w:hAnsi="Arial" w:cs="Arial"/>
+          <w:b/>
+          <w:bCs/>
           <w:sz w:val="28"/>
           <w:szCs w:val="28"/>
         </w:rPr>
         <w:t>BP-ACC-2. Quy trình Đăng Nhập Tài Khoản</w:t>
+      </w:r>
+      <w:r>
+        <w:rPr>
+          <w:rFonts w:ascii="Arial" w:hAnsi="Arial" w:cs="Arial"/>
+          <w:b/>
+          <w:bCs/>
+          <w:sz w:val="28"/>
+          <w:szCs w:val="28"/>
+        </w:rPr>
+        <w:t xml:space="preserve"> Với Local</w:t>
       </w:r>
     </w:p>
     <w:p>
@@ -14654,7 +14827,15 @@
           <w:sz w:val="28"/>
           <w:szCs w:val="28"/>
         </w:rPr>
-        <w:t>Nhập username / email và mật khẩu</w:t>
+        <w:t>N</w:t>
+      </w:r>
+      <w:r>
+        <w:rPr>
+          <w:rFonts w:ascii="Arial" w:hAnsi="Arial" w:cs="Arial"/>
+          <w:sz w:val="28"/>
+          <w:szCs w:val="28"/>
+        </w:rPr>
+        <w:t>gười dùng nhập Username hoặc Email và Mật khẩu tương ứng</w:t>
       </w:r>
     </w:p>
     <w:p>
@@ -14676,8 +14857,45 @@
           <w:sz w:val="28"/>
           <w:szCs w:val="28"/>
         </w:rPr>
-        <w:lastRenderedPageBreak/>
-        <w:t>Kiểm tra username/gmail có tồn tại trong hệ thống hay chưa</w:t>
+        <w:t xml:space="preserve">Kiểm tra </w:t>
+      </w:r>
+      <w:r>
+        <w:rPr>
+          <w:rFonts w:ascii="Arial" w:hAnsi="Arial" w:cs="Arial"/>
+          <w:sz w:val="28"/>
+          <w:szCs w:val="28"/>
+        </w:rPr>
+        <w:t xml:space="preserve">Username hoặc Email </w:t>
+      </w:r>
+      <w:r>
+        <w:rPr>
+          <w:rFonts w:ascii="Arial" w:hAnsi="Arial" w:cs="Arial"/>
+          <w:sz w:val="28"/>
+          <w:szCs w:val="28"/>
+        </w:rPr>
+        <w:t>có tồn tại trong hệ thống hay chưa</w:t>
+      </w:r>
+    </w:p>
+    <w:p>
+      <w:pPr>
+        <w:pStyle w:val="ListParagraph"/>
+        <w:numPr>
+          <w:ilvl w:val="1"/>
+          <w:numId w:val="15"/>
+        </w:numPr>
+        <w:rPr>
+          <w:rFonts w:ascii="Arial" w:hAnsi="Arial" w:cs="Arial"/>
+          <w:sz w:val="28"/>
+          <w:szCs w:val="28"/>
+        </w:rPr>
+      </w:pPr>
+      <w:r>
+        <w:rPr>
+          <w:rFonts w:ascii="Arial" w:hAnsi="Arial" w:cs="Arial"/>
+          <w:sz w:val="28"/>
+          <w:szCs w:val="28"/>
+        </w:rPr>
+        <w:t>Nếu chưa, thông báo Tài khoản hoặc Mật khẩu sai</w:t>
       </w:r>
     </w:p>
     <w:p>
@@ -14699,7 +14917,37 @@
           <w:sz w:val="28"/>
           <w:szCs w:val="28"/>
         </w:rPr>
-        <w:t>Xác thực mật khẩu ứng với tài khoản</w:t>
+        <w:t xml:space="preserve">Xác thực mật khẩu </w:t>
+      </w:r>
+      <w:r>
+        <w:rPr>
+          <w:rFonts w:ascii="Arial" w:hAnsi="Arial" w:cs="Arial"/>
+          <w:sz w:val="28"/>
+          <w:szCs w:val="28"/>
+        </w:rPr>
+        <w:t>tương ứng với tài khoản</w:t>
+      </w:r>
+    </w:p>
+    <w:p>
+      <w:pPr>
+        <w:pStyle w:val="ListParagraph"/>
+        <w:numPr>
+          <w:ilvl w:val="1"/>
+          <w:numId w:val="15"/>
+        </w:numPr>
+        <w:rPr>
+          <w:rFonts w:ascii="Arial" w:hAnsi="Arial" w:cs="Arial"/>
+          <w:sz w:val="28"/>
+          <w:szCs w:val="28"/>
+        </w:rPr>
+      </w:pPr>
+      <w:r>
+        <w:rPr>
+          <w:rFonts w:ascii="Arial" w:hAnsi="Arial" w:cs="Arial"/>
+          <w:sz w:val="28"/>
+          <w:szCs w:val="28"/>
+        </w:rPr>
+        <w:t>Nếu sai, thông báo Tài khoản hoặc Mật khẩu sai</w:t>
       </w:r>
     </w:p>
     <w:p>
@@ -14721,7 +14969,7 @@
           <w:sz w:val="28"/>
           <w:szCs w:val="28"/>
         </w:rPr>
-        <w:t>Tạo phiên (session) hoạt động</w:t>
+        <w:t>Thông báo đăng nhập thành công</w:t>
       </w:r>
     </w:p>
     <w:p>
@@ -14743,8 +14991,39 @@
           <w:sz w:val="28"/>
           <w:szCs w:val="28"/>
         </w:rPr>
+        <w:t>Tạo phiên hoạt động mới (Session)</w:t>
+      </w:r>
+    </w:p>
+    <w:p>
+      <w:pPr>
+        <w:pStyle w:val="ListParagraph"/>
+        <w:numPr>
+          <w:ilvl w:val="0"/>
+          <w:numId w:val="15"/>
+        </w:numPr>
+        <w:rPr>
+          <w:rFonts w:ascii="Arial" w:hAnsi="Arial" w:cs="Arial"/>
+          <w:sz w:val="28"/>
+          <w:szCs w:val="28"/>
+        </w:rPr>
+      </w:pPr>
+      <w:r>
+        <w:rPr>
+          <w:rFonts w:ascii="Arial" w:hAnsi="Arial" w:cs="Arial"/>
+          <w:sz w:val="28"/>
+          <w:szCs w:val="28"/>
+        </w:rPr>
         <w:t>Vào trang chủ</w:t>
       </w:r>
+    </w:p>
+    <w:p>
+      <w:pPr>
+        <w:rPr>
+          <w:rFonts w:ascii="Arial" w:hAnsi="Arial" w:cs="Arial"/>
+          <w:sz w:val="28"/>
+          <w:szCs w:val="28"/>
+        </w:rPr>
+      </w:pPr>
     </w:p>
     <w:p>
       <w:pPr>
@@ -14777,13 +15056,17 @@
         <w:ind w:left="720"/>
         <w:rPr>
           <w:rFonts w:ascii="Arial" w:hAnsi="Arial" w:cs="Arial"/>
-          <w:sz w:val="28"/>
-          <w:szCs w:val="28"/>
-        </w:rPr>
-      </w:pPr>
-      <w:r>
-        <w:rPr>
-          <w:rFonts w:ascii="Arial" w:hAnsi="Arial" w:cs="Arial"/>
+          <w:b/>
+          <w:bCs/>
+          <w:sz w:val="28"/>
+          <w:szCs w:val="28"/>
+        </w:rPr>
+      </w:pPr>
+      <w:r>
+        <w:rPr>
+          <w:rFonts w:ascii="Arial" w:hAnsi="Arial" w:cs="Arial"/>
+          <w:b/>
+          <w:bCs/>
           <w:sz w:val="28"/>
           <w:szCs w:val="28"/>
         </w:rPr>
@@ -14792,6 +15075,8 @@
       <w:r>
         <w:rPr>
           <w:rFonts w:ascii="Arial" w:hAnsi="Arial" w:cs="Arial"/>
+          <w:b/>
+          <w:bCs/>
           <w:sz w:val="28"/>
           <w:szCs w:val="28"/>
         </w:rPr>
@@ -14817,15 +15102,199 @@
           <w:sz w:val="28"/>
           <w:szCs w:val="28"/>
         </w:rPr>
-        <w:t xml:space="preserve">Nhập </w:t>
-      </w:r>
-      <w:r>
-        <w:rPr>
-          <w:rFonts w:ascii="Arial" w:hAnsi="Arial" w:cs="Arial"/>
-          <w:sz w:val="28"/>
-          <w:szCs w:val="28"/>
-        </w:rPr>
-        <w:t>các thông tin liên quan đến chi tiêu</w:t>
+        <w:t>N</w:t>
+      </w:r>
+      <w:r>
+        <w:rPr>
+          <w:rFonts w:ascii="Arial" w:hAnsi="Arial" w:cs="Arial"/>
+          <w:sz w:val="28"/>
+          <w:szCs w:val="28"/>
+        </w:rPr>
+        <w:t>gười dùng nhập hoặc chọn các thông tin tạo khoản chi tiêu</w:t>
+      </w:r>
+    </w:p>
+    <w:p>
+      <w:pPr>
+        <w:pStyle w:val="ListParagraph"/>
+        <w:numPr>
+          <w:ilvl w:val="1"/>
+          <w:numId w:val="15"/>
+        </w:numPr>
+        <w:rPr>
+          <w:rFonts w:ascii="Arial" w:hAnsi="Arial" w:cs="Arial"/>
+          <w:sz w:val="28"/>
+          <w:szCs w:val="28"/>
+        </w:rPr>
+      </w:pPr>
+      <w:r>
+        <w:rPr>
+          <w:rFonts w:ascii="Arial" w:hAnsi="Arial" w:cs="Arial"/>
+          <w:sz w:val="28"/>
+          <w:szCs w:val="28"/>
+        </w:rPr>
+        <w:t>Tên khoản chi tiêu</w:t>
+      </w:r>
+    </w:p>
+    <w:p>
+      <w:pPr>
+        <w:pStyle w:val="ListParagraph"/>
+        <w:numPr>
+          <w:ilvl w:val="2"/>
+          <w:numId w:val="15"/>
+        </w:numPr>
+        <w:rPr>
+          <w:rFonts w:ascii="Arial" w:hAnsi="Arial" w:cs="Arial"/>
+          <w:sz w:val="28"/>
+          <w:szCs w:val="28"/>
+        </w:rPr>
+      </w:pPr>
+      <w:r>
+        <w:rPr>
+          <w:rFonts w:ascii="Arial" w:hAnsi="Arial" w:cs="Arial"/>
+          <w:sz w:val="28"/>
+          <w:szCs w:val="28"/>
+        </w:rPr>
+        <w:t>Nếu không có, sẽ được dịnh dạng theo mẫu</w:t>
+      </w:r>
+    </w:p>
+    <w:p>
+      <w:pPr>
+        <w:pStyle w:val="ListParagraph"/>
+        <w:numPr>
+          <w:ilvl w:val="1"/>
+          <w:numId w:val="15"/>
+        </w:numPr>
+        <w:rPr>
+          <w:rFonts w:ascii="Arial" w:hAnsi="Arial" w:cs="Arial"/>
+          <w:sz w:val="28"/>
+          <w:szCs w:val="28"/>
+        </w:rPr>
+      </w:pPr>
+      <w:r>
+        <w:rPr>
+          <w:rFonts w:ascii="Arial" w:hAnsi="Arial" w:cs="Arial"/>
+          <w:sz w:val="28"/>
+          <w:szCs w:val="28"/>
+        </w:rPr>
+        <w:t>Số tiền chi tiêu</w:t>
+      </w:r>
+    </w:p>
+    <w:p>
+      <w:pPr>
+        <w:pStyle w:val="ListParagraph"/>
+        <w:numPr>
+          <w:ilvl w:val="1"/>
+          <w:numId w:val="15"/>
+        </w:numPr>
+        <w:rPr>
+          <w:rFonts w:ascii="Arial" w:hAnsi="Arial" w:cs="Arial"/>
+          <w:sz w:val="28"/>
+          <w:szCs w:val="28"/>
+        </w:rPr>
+      </w:pPr>
+      <w:r>
+        <w:rPr>
+          <w:rFonts w:ascii="Arial" w:hAnsi="Arial" w:cs="Arial"/>
+          <w:sz w:val="28"/>
+          <w:szCs w:val="28"/>
+        </w:rPr>
+        <w:t>Danh mục</w:t>
+      </w:r>
+    </w:p>
+    <w:p>
+      <w:pPr>
+        <w:pStyle w:val="ListParagraph"/>
+        <w:numPr>
+          <w:ilvl w:val="2"/>
+          <w:numId w:val="15"/>
+        </w:numPr>
+        <w:rPr>
+          <w:rFonts w:ascii="Arial" w:hAnsi="Arial" w:cs="Arial"/>
+          <w:sz w:val="28"/>
+          <w:szCs w:val="28"/>
+        </w:rPr>
+      </w:pPr>
+      <w:r>
+        <w:rPr>
+          <w:rFonts w:ascii="Arial" w:hAnsi="Arial" w:cs="Arial"/>
+          <w:sz w:val="28"/>
+          <w:szCs w:val="28"/>
+        </w:rPr>
+        <w:t>Nếu không có, sẽ được liên kết với danh mục “Khác”</w:t>
+      </w:r>
+    </w:p>
+    <w:p>
+      <w:pPr>
+        <w:pStyle w:val="ListParagraph"/>
+        <w:numPr>
+          <w:ilvl w:val="1"/>
+          <w:numId w:val="15"/>
+        </w:numPr>
+        <w:rPr>
+          <w:rFonts w:ascii="Arial" w:hAnsi="Arial" w:cs="Arial"/>
+          <w:sz w:val="28"/>
+          <w:szCs w:val="28"/>
+        </w:rPr>
+      </w:pPr>
+      <w:r>
+        <w:rPr>
+          <w:rFonts w:ascii="Arial" w:hAnsi="Arial" w:cs="Arial"/>
+          <w:sz w:val="28"/>
+          <w:szCs w:val="28"/>
+        </w:rPr>
+        <w:t xml:space="preserve">Nguồn </w:t>
+      </w:r>
+      <w:r>
+        <w:rPr>
+          <w:rFonts w:ascii="Arial" w:hAnsi="Arial" w:cs="Arial"/>
+          <w:sz w:val="28"/>
+          <w:szCs w:val="28"/>
+        </w:rPr>
+        <w:t>tiền</w:t>
+      </w:r>
+    </w:p>
+    <w:p>
+      <w:pPr>
+        <w:pStyle w:val="ListParagraph"/>
+        <w:numPr>
+          <w:ilvl w:val="1"/>
+          <w:numId w:val="15"/>
+        </w:numPr>
+        <w:rPr>
+          <w:rFonts w:ascii="Arial" w:hAnsi="Arial" w:cs="Arial"/>
+          <w:sz w:val="28"/>
+          <w:szCs w:val="28"/>
+        </w:rPr>
+      </w:pPr>
+      <w:r>
+        <w:rPr>
+          <w:rFonts w:ascii="Arial" w:hAnsi="Arial" w:cs="Arial"/>
+          <w:sz w:val="28"/>
+          <w:szCs w:val="28"/>
+        </w:rPr>
+        <w:t>Ngân sách (Nếu được liên kết)</w:t>
+      </w:r>
+    </w:p>
+    <w:p>
+      <w:pPr>
+        <w:pStyle w:val="ListParagraph"/>
+        <w:numPr>
+          <w:ilvl w:val="1"/>
+          <w:numId w:val="15"/>
+        </w:numPr>
+        <w:rPr>
+          <w:rFonts w:ascii="Arial" w:hAnsi="Arial" w:cs="Arial"/>
+          <w:sz w:val="28"/>
+          <w:szCs w:val="28"/>
+        </w:rPr>
+      </w:pPr>
+      <w:r>
+        <w:rPr>
+          <w:rFonts w:ascii="Arial" w:hAnsi="Arial" w:cs="Arial"/>
+          <w:sz w:val="28"/>
+          <w:szCs w:val="28"/>
+        </w:rPr>
+        <w:t>Nội dung chi tiêu (Nếu có)</w:t>
       </w:r>
     </w:p>
     <w:p>
@@ -14869,6 +15338,7 @@
           <w:sz w:val="28"/>
           <w:szCs w:val="28"/>
         </w:rPr>
+        <w:lastRenderedPageBreak/>
         <w:t>Kiểm tra nguồn tiền</w:t>
       </w:r>
     </w:p>
@@ -15006,6 +15476,597 @@
     </w:p>
     <w:p>
       <w:pPr>
+        <w:rPr>
+          <w:rFonts w:ascii="Arial" w:hAnsi="Arial" w:cs="Arial"/>
+          <w:sz w:val="28"/>
+          <w:szCs w:val="28"/>
+        </w:rPr>
+      </w:pPr>
+    </w:p>
+    <w:p>
+      <w:pPr>
+        <w:ind w:left="720"/>
+        <w:rPr>
+          <w:rFonts w:ascii="Arial" w:hAnsi="Arial" w:cs="Arial"/>
+          <w:b/>
+          <w:bCs/>
+          <w:sz w:val="28"/>
+          <w:szCs w:val="28"/>
+        </w:rPr>
+      </w:pPr>
+      <w:r>
+        <w:rPr>
+          <w:rFonts w:ascii="Arial" w:hAnsi="Arial" w:cs="Arial"/>
+          <w:b/>
+          <w:bCs/>
+          <w:sz w:val="28"/>
+          <w:szCs w:val="28"/>
+        </w:rPr>
+        <w:t xml:space="preserve">BP-ET-2. Quy trình </w:t>
+      </w:r>
+      <w:r>
+        <w:rPr>
+          <w:rFonts w:ascii="Arial" w:hAnsi="Arial" w:cs="Arial"/>
+          <w:b/>
+          <w:bCs/>
+          <w:sz w:val="28"/>
+          <w:szCs w:val="28"/>
+        </w:rPr>
+        <w:t xml:space="preserve">Cập Nhật </w:t>
+      </w:r>
+      <w:r>
+        <w:rPr>
+          <w:rFonts w:ascii="Arial" w:hAnsi="Arial" w:cs="Arial"/>
+          <w:b/>
+          <w:bCs/>
+          <w:sz w:val="28"/>
+          <w:szCs w:val="28"/>
+        </w:rPr>
+        <w:t>Khoản Chi Tiêu</w:t>
+      </w:r>
+    </w:p>
+    <w:p>
+      <w:pPr>
+        <w:pStyle w:val="ListParagraph"/>
+        <w:numPr>
+          <w:ilvl w:val="0"/>
+          <w:numId w:val="15"/>
+        </w:numPr>
+        <w:rPr>
+          <w:rFonts w:ascii="Arial" w:hAnsi="Arial" w:cs="Arial"/>
+          <w:sz w:val="28"/>
+          <w:szCs w:val="28"/>
+        </w:rPr>
+      </w:pPr>
+      <w:r>
+        <w:rPr>
+          <w:rFonts w:ascii="Arial" w:hAnsi="Arial" w:cs="Arial"/>
+          <w:sz w:val="28"/>
+          <w:szCs w:val="28"/>
+        </w:rPr>
+        <w:t>Người dùng c</w:t>
+      </w:r>
+      <w:r>
+        <w:rPr>
+          <w:rFonts w:ascii="Arial" w:hAnsi="Arial" w:cs="Arial"/>
+          <w:sz w:val="28"/>
+          <w:szCs w:val="28"/>
+        </w:rPr>
+        <w:t xml:space="preserve">họn khoản chi tiêu cần </w:t>
+      </w:r>
+      <w:r>
+        <w:rPr>
+          <w:rFonts w:ascii="Arial" w:hAnsi="Arial" w:cs="Arial"/>
+          <w:sz w:val="28"/>
+          <w:szCs w:val="28"/>
+        </w:rPr>
+        <w:t>cập nhật</w:t>
+      </w:r>
+    </w:p>
+    <w:p>
+      <w:pPr>
+        <w:pStyle w:val="ListParagraph"/>
+        <w:numPr>
+          <w:ilvl w:val="0"/>
+          <w:numId w:val="15"/>
+        </w:numPr>
+        <w:rPr>
+          <w:rFonts w:ascii="Arial" w:hAnsi="Arial" w:cs="Arial"/>
+          <w:sz w:val="28"/>
+          <w:szCs w:val="28"/>
+        </w:rPr>
+      </w:pPr>
+      <w:r>
+        <w:rPr>
+          <w:rFonts w:ascii="Arial" w:hAnsi="Arial" w:cs="Arial"/>
+          <w:sz w:val="28"/>
+          <w:szCs w:val="28"/>
+        </w:rPr>
+        <w:t>Kiểm tra trạng thái khoản chi tiêu</w:t>
+      </w:r>
+    </w:p>
+    <w:p>
+      <w:pPr>
+        <w:pStyle w:val="ListParagraph"/>
+        <w:numPr>
+          <w:ilvl w:val="1"/>
+          <w:numId w:val="15"/>
+        </w:numPr>
+        <w:rPr>
+          <w:rFonts w:ascii="Arial" w:hAnsi="Arial" w:cs="Arial"/>
+          <w:sz w:val="28"/>
+          <w:szCs w:val="28"/>
+        </w:rPr>
+      </w:pPr>
+      <w:r>
+        <w:rPr>
+          <w:rFonts w:ascii="Arial" w:hAnsi="Arial" w:cs="Arial"/>
+          <w:sz w:val="28"/>
+          <w:szCs w:val="28"/>
+        </w:rPr>
+        <w:t>Nếu trạng thái là đã xóa, hiển thị thông báo khôi phục khoản chi tiêu để cập nhật</w:t>
+      </w:r>
+    </w:p>
+    <w:p>
+      <w:pPr>
+        <w:pStyle w:val="ListParagraph"/>
+        <w:numPr>
+          <w:ilvl w:val="0"/>
+          <w:numId w:val="15"/>
+        </w:numPr>
+        <w:rPr>
+          <w:rFonts w:ascii="Arial" w:hAnsi="Arial" w:cs="Arial"/>
+          <w:sz w:val="28"/>
+          <w:szCs w:val="28"/>
+        </w:rPr>
+      </w:pPr>
+      <w:r>
+        <w:rPr>
+          <w:rFonts w:ascii="Arial" w:hAnsi="Arial" w:cs="Arial"/>
+          <w:sz w:val="28"/>
+          <w:szCs w:val="28"/>
+        </w:rPr>
+        <w:t>Người dùng nhập hoặc chọn thông tin cần cập nhật</w:t>
+      </w:r>
+    </w:p>
+    <w:p>
+      <w:pPr>
+        <w:pStyle w:val="ListParagraph"/>
+        <w:numPr>
+          <w:ilvl w:val="1"/>
+          <w:numId w:val="15"/>
+        </w:numPr>
+        <w:rPr>
+          <w:rFonts w:ascii="Arial" w:hAnsi="Arial" w:cs="Arial"/>
+          <w:sz w:val="28"/>
+          <w:szCs w:val="28"/>
+        </w:rPr>
+      </w:pPr>
+      <w:r>
+        <w:rPr>
+          <w:rFonts w:ascii="Arial" w:hAnsi="Arial" w:cs="Arial"/>
+          <w:sz w:val="28"/>
+          <w:szCs w:val="28"/>
+        </w:rPr>
+        <w:t>Nếu cập nhật số tiền chi tiêu</w:t>
+      </w:r>
+    </w:p>
+    <w:p>
+      <w:pPr>
+        <w:pStyle w:val="ListParagraph"/>
+        <w:numPr>
+          <w:ilvl w:val="2"/>
+          <w:numId w:val="15"/>
+        </w:numPr>
+        <w:rPr>
+          <w:rFonts w:ascii="Arial" w:hAnsi="Arial" w:cs="Arial"/>
+          <w:sz w:val="28"/>
+          <w:szCs w:val="28"/>
+        </w:rPr>
+      </w:pPr>
+      <w:r>
+        <w:rPr>
+          <w:rFonts w:ascii="Arial" w:hAnsi="Arial" w:cs="Arial"/>
+          <w:sz w:val="28"/>
+          <w:szCs w:val="28"/>
+        </w:rPr>
+        <w:t>Cập nhật số tương thay đổi tương ứng tại nguồn tiền và ngân sách (nếu có)</w:t>
+      </w:r>
+    </w:p>
+    <w:p>
+      <w:pPr>
+        <w:pStyle w:val="ListParagraph"/>
+        <w:numPr>
+          <w:ilvl w:val="1"/>
+          <w:numId w:val="15"/>
+        </w:numPr>
+        <w:rPr>
+          <w:rFonts w:ascii="Arial" w:hAnsi="Arial" w:cs="Arial"/>
+          <w:sz w:val="28"/>
+          <w:szCs w:val="28"/>
+        </w:rPr>
+      </w:pPr>
+      <w:r>
+        <w:rPr>
+          <w:rFonts w:ascii="Arial" w:hAnsi="Arial" w:cs="Arial"/>
+          <w:sz w:val="28"/>
+          <w:szCs w:val="28"/>
+        </w:rPr>
+        <w:t>Nếu cập nhật danh mục</w:t>
+      </w:r>
+    </w:p>
+    <w:p>
+      <w:pPr>
+        <w:pStyle w:val="ListParagraph"/>
+        <w:numPr>
+          <w:ilvl w:val="2"/>
+          <w:numId w:val="15"/>
+        </w:numPr>
+        <w:rPr>
+          <w:rFonts w:ascii="Arial" w:hAnsi="Arial" w:cs="Arial"/>
+          <w:sz w:val="28"/>
+          <w:szCs w:val="28"/>
+        </w:rPr>
+      </w:pPr>
+      <w:r>
+        <w:rPr>
+          <w:rFonts w:ascii="Arial" w:hAnsi="Arial" w:cs="Arial"/>
+          <w:sz w:val="28"/>
+          <w:szCs w:val="28"/>
+        </w:rPr>
+        <w:t>Thêm khoản chi tiêu vào danh mục mới</w:t>
+      </w:r>
+    </w:p>
+    <w:p>
+      <w:pPr>
+        <w:pStyle w:val="ListParagraph"/>
+        <w:numPr>
+          <w:ilvl w:val="2"/>
+          <w:numId w:val="15"/>
+        </w:numPr>
+        <w:rPr>
+          <w:rFonts w:ascii="Arial" w:hAnsi="Arial" w:cs="Arial"/>
+          <w:sz w:val="28"/>
+          <w:szCs w:val="28"/>
+        </w:rPr>
+      </w:pPr>
+      <w:r>
+        <w:rPr>
+          <w:rFonts w:ascii="Arial" w:hAnsi="Arial" w:cs="Arial"/>
+          <w:sz w:val="28"/>
+          <w:szCs w:val="28"/>
+        </w:rPr>
+        <w:t>Xóa khoản chi tiêu khỏi danh mục cũ</w:t>
+      </w:r>
+    </w:p>
+    <w:p>
+      <w:pPr>
+        <w:pStyle w:val="ListParagraph"/>
+        <w:numPr>
+          <w:ilvl w:val="1"/>
+          <w:numId w:val="15"/>
+        </w:numPr>
+        <w:rPr>
+          <w:rFonts w:ascii="Arial" w:hAnsi="Arial" w:cs="Arial"/>
+          <w:sz w:val="28"/>
+          <w:szCs w:val="28"/>
+        </w:rPr>
+      </w:pPr>
+      <w:r>
+        <w:rPr>
+          <w:rFonts w:ascii="Arial" w:hAnsi="Arial" w:cs="Arial"/>
+          <w:sz w:val="28"/>
+          <w:szCs w:val="28"/>
+        </w:rPr>
+        <w:t>Cập nhật tên</w:t>
+      </w:r>
+    </w:p>
+    <w:p>
+      <w:pPr>
+        <w:pStyle w:val="ListParagraph"/>
+        <w:numPr>
+          <w:ilvl w:val="1"/>
+          <w:numId w:val="15"/>
+        </w:numPr>
+        <w:rPr>
+          <w:rFonts w:ascii="Arial" w:hAnsi="Arial" w:cs="Arial"/>
+          <w:sz w:val="28"/>
+          <w:szCs w:val="28"/>
+        </w:rPr>
+      </w:pPr>
+      <w:r>
+        <w:rPr>
+          <w:rFonts w:ascii="Arial" w:hAnsi="Arial" w:cs="Arial"/>
+          <w:sz w:val="28"/>
+          <w:szCs w:val="28"/>
+        </w:rPr>
+        <w:t>Nếu cập nhật nguồn tiền</w:t>
+      </w:r>
+    </w:p>
+    <w:p>
+      <w:pPr>
+        <w:pStyle w:val="ListParagraph"/>
+        <w:numPr>
+          <w:ilvl w:val="2"/>
+          <w:numId w:val="15"/>
+        </w:numPr>
+        <w:rPr>
+          <w:rFonts w:ascii="Arial" w:hAnsi="Arial" w:cs="Arial"/>
+          <w:sz w:val="28"/>
+          <w:szCs w:val="28"/>
+        </w:rPr>
+      </w:pPr>
+      <w:r>
+        <w:rPr>
+          <w:rFonts w:ascii="Arial" w:hAnsi="Arial" w:cs="Arial"/>
+          <w:sz w:val="28"/>
+          <w:szCs w:val="28"/>
+        </w:rPr>
+        <w:t>Tính toán cộng lại số tiền tương ứng cho nguồn tiền cũ</w:t>
+      </w:r>
+    </w:p>
+    <w:p>
+      <w:pPr>
+        <w:pStyle w:val="ListParagraph"/>
+        <w:numPr>
+          <w:ilvl w:val="2"/>
+          <w:numId w:val="15"/>
+        </w:numPr>
+        <w:rPr>
+          <w:rFonts w:ascii="Arial" w:hAnsi="Arial" w:cs="Arial"/>
+          <w:sz w:val="28"/>
+          <w:szCs w:val="28"/>
+        </w:rPr>
+      </w:pPr>
+      <w:r>
+        <w:rPr>
+          <w:rFonts w:ascii="Arial" w:hAnsi="Arial" w:cs="Arial"/>
+          <w:sz w:val="28"/>
+          <w:szCs w:val="28"/>
+        </w:rPr>
+        <w:t>Tính toán trừ số tiền tương ứng cho nguồn tiền mới</w:t>
+      </w:r>
+    </w:p>
+    <w:p>
+      <w:pPr>
+        <w:pStyle w:val="ListParagraph"/>
+        <w:numPr>
+          <w:ilvl w:val="1"/>
+          <w:numId w:val="15"/>
+        </w:numPr>
+        <w:rPr>
+          <w:rFonts w:ascii="Arial" w:hAnsi="Arial" w:cs="Arial"/>
+          <w:sz w:val="28"/>
+          <w:szCs w:val="28"/>
+        </w:rPr>
+      </w:pPr>
+      <w:r>
+        <w:rPr>
+          <w:rFonts w:ascii="Arial" w:hAnsi="Arial" w:cs="Arial"/>
+          <w:sz w:val="28"/>
+          <w:szCs w:val="28"/>
+        </w:rPr>
+        <w:t>Nếu cập nhật ngân sách</w:t>
+      </w:r>
+    </w:p>
+    <w:p>
+      <w:pPr>
+        <w:pStyle w:val="ListParagraph"/>
+        <w:numPr>
+          <w:ilvl w:val="2"/>
+          <w:numId w:val="15"/>
+        </w:numPr>
+        <w:rPr>
+          <w:rFonts w:ascii="Arial" w:hAnsi="Arial" w:cs="Arial"/>
+          <w:sz w:val="28"/>
+          <w:szCs w:val="28"/>
+        </w:rPr>
+      </w:pPr>
+      <w:r>
+        <w:rPr>
+          <w:rFonts w:ascii="Arial" w:hAnsi="Arial" w:cs="Arial"/>
+          <w:sz w:val="28"/>
+          <w:szCs w:val="28"/>
+        </w:rPr>
+        <w:t>Nếu trước đó chưa liên kết</w:t>
+      </w:r>
+    </w:p>
+    <w:p>
+      <w:pPr>
+        <w:pStyle w:val="ListParagraph"/>
+        <w:numPr>
+          <w:ilvl w:val="3"/>
+          <w:numId w:val="15"/>
+        </w:numPr>
+        <w:rPr>
+          <w:rFonts w:ascii="Arial" w:hAnsi="Arial" w:cs="Arial"/>
+          <w:sz w:val="28"/>
+          <w:szCs w:val="28"/>
+        </w:rPr>
+      </w:pPr>
+      <w:r>
+        <w:rPr>
+          <w:rFonts w:ascii="Arial" w:hAnsi="Arial" w:cs="Arial"/>
+          <w:sz w:val="28"/>
+          <w:szCs w:val="28"/>
+        </w:rPr>
+        <w:t>Tính toán từ số tiền tương ứng cho ngân sách vừa được liên kết</w:t>
+      </w:r>
+    </w:p>
+    <w:p>
+      <w:pPr>
+        <w:pStyle w:val="ListParagraph"/>
+        <w:numPr>
+          <w:ilvl w:val="2"/>
+          <w:numId w:val="15"/>
+        </w:numPr>
+        <w:rPr>
+          <w:rFonts w:ascii="Arial" w:hAnsi="Arial" w:cs="Arial"/>
+          <w:sz w:val="28"/>
+          <w:szCs w:val="28"/>
+        </w:rPr>
+      </w:pPr>
+      <w:r>
+        <w:rPr>
+          <w:rFonts w:ascii="Arial" w:hAnsi="Arial" w:cs="Arial"/>
+          <w:sz w:val="28"/>
+          <w:szCs w:val="28"/>
+        </w:rPr>
+        <w:t xml:space="preserve">Nếu trước đó đã liên kết </w:t>
+      </w:r>
+    </w:p>
+    <w:p>
+      <w:pPr>
+        <w:pStyle w:val="ListParagraph"/>
+        <w:numPr>
+          <w:ilvl w:val="3"/>
+          <w:numId w:val="15"/>
+        </w:numPr>
+        <w:rPr>
+          <w:rFonts w:ascii="Arial" w:hAnsi="Arial" w:cs="Arial"/>
+          <w:sz w:val="28"/>
+          <w:szCs w:val="28"/>
+        </w:rPr>
+      </w:pPr>
+      <w:r>
+        <w:rPr>
+          <w:rFonts w:ascii="Arial" w:hAnsi="Arial" w:cs="Arial"/>
+          <w:sz w:val="28"/>
+          <w:szCs w:val="28"/>
+        </w:rPr>
+        <w:t>Tính toán cộng số tiền tương ứng cho ngân sách cũ</w:t>
+      </w:r>
+    </w:p>
+    <w:p>
+      <w:pPr>
+        <w:pStyle w:val="ListParagraph"/>
+        <w:numPr>
+          <w:ilvl w:val="3"/>
+          <w:numId w:val="15"/>
+        </w:numPr>
+        <w:rPr>
+          <w:rFonts w:ascii="Arial" w:hAnsi="Arial" w:cs="Arial"/>
+          <w:sz w:val="28"/>
+          <w:szCs w:val="28"/>
+        </w:rPr>
+      </w:pPr>
+      <w:r>
+        <w:rPr>
+          <w:rFonts w:ascii="Arial" w:hAnsi="Arial" w:cs="Arial"/>
+          <w:sz w:val="28"/>
+          <w:szCs w:val="28"/>
+        </w:rPr>
+        <w:t>Tính toán trừ số tiền tương ứng cho ngân sách mới</w:t>
+      </w:r>
+    </w:p>
+    <w:p>
+      <w:pPr>
+        <w:pStyle w:val="ListParagraph"/>
+        <w:numPr>
+          <w:ilvl w:val="1"/>
+          <w:numId w:val="15"/>
+        </w:numPr>
+        <w:rPr>
+          <w:rFonts w:ascii="Arial" w:hAnsi="Arial" w:cs="Arial"/>
+          <w:sz w:val="28"/>
+          <w:szCs w:val="28"/>
+        </w:rPr>
+      </w:pPr>
+      <w:r>
+        <w:rPr>
+          <w:rFonts w:ascii="Arial" w:hAnsi="Arial" w:cs="Arial"/>
+          <w:sz w:val="28"/>
+          <w:szCs w:val="28"/>
+        </w:rPr>
+        <w:t>Cập nhật nội dung chi tiêu</w:t>
+      </w:r>
+    </w:p>
+    <w:p>
+      <w:pPr>
+        <w:pStyle w:val="ListParagraph"/>
+        <w:numPr>
+          <w:ilvl w:val="0"/>
+          <w:numId w:val="15"/>
+        </w:numPr>
+        <w:rPr>
+          <w:rFonts w:ascii="Arial" w:hAnsi="Arial" w:cs="Arial"/>
+          <w:sz w:val="28"/>
+          <w:szCs w:val="28"/>
+        </w:rPr>
+      </w:pPr>
+      <w:r>
+        <w:rPr>
+          <w:rFonts w:ascii="Arial" w:hAnsi="Arial" w:cs="Arial"/>
+          <w:sz w:val="28"/>
+          <w:szCs w:val="28"/>
+        </w:rPr>
+        <w:t>Lưu lại vào lịch sử</w:t>
+      </w:r>
+    </w:p>
+    <w:p>
+      <w:pPr>
+        <w:pStyle w:val="ListParagraph"/>
+        <w:numPr>
+          <w:ilvl w:val="0"/>
+          <w:numId w:val="15"/>
+        </w:numPr>
+        <w:rPr>
+          <w:rFonts w:ascii="Arial" w:hAnsi="Arial" w:cs="Arial"/>
+          <w:sz w:val="28"/>
+          <w:szCs w:val="28"/>
+        </w:rPr>
+      </w:pPr>
+      <w:r>
+        <w:rPr>
+          <w:rFonts w:ascii="Arial" w:hAnsi="Arial" w:cs="Arial"/>
+          <w:sz w:val="28"/>
+          <w:szCs w:val="28"/>
+        </w:rPr>
+        <w:lastRenderedPageBreak/>
+        <w:t>Lưu lại vào thống kê</w:t>
+      </w:r>
+    </w:p>
+    <w:p>
+      <w:pPr>
+        <w:pStyle w:val="ListParagraph"/>
+        <w:numPr>
+          <w:ilvl w:val="0"/>
+          <w:numId w:val="15"/>
+        </w:numPr>
+        <w:rPr>
+          <w:rFonts w:ascii="Arial" w:hAnsi="Arial" w:cs="Arial"/>
+          <w:sz w:val="28"/>
+          <w:szCs w:val="28"/>
+        </w:rPr>
+      </w:pPr>
+      <w:r>
+        <w:rPr>
+          <w:rFonts w:ascii="Arial" w:hAnsi="Arial" w:cs="Arial"/>
+          <w:sz w:val="28"/>
+          <w:szCs w:val="28"/>
+        </w:rPr>
+        <w:t xml:space="preserve">Thông báo </w:t>
+      </w:r>
+      <w:r>
+        <w:rPr>
+          <w:rFonts w:ascii="Arial" w:hAnsi="Arial" w:cs="Arial"/>
+          <w:sz w:val="28"/>
+          <w:szCs w:val="28"/>
+        </w:rPr>
+        <w:t>cập nhật khoản chi tiêu hoàn tất</w:t>
+      </w:r>
+    </w:p>
+    <w:p>
+      <w:pPr>
+        <w:rPr>
+          <w:rFonts w:ascii="Arial" w:hAnsi="Arial" w:cs="Arial"/>
+          <w:sz w:val="28"/>
+          <w:szCs w:val="28"/>
+        </w:rPr>
+      </w:pPr>
+    </w:p>
+    <w:p>
+      <w:pPr>
         <w:pStyle w:val="ListParagraph"/>
         <w:numPr>
           <w:ilvl w:val="2"/>
@@ -15035,18 +16096,484 @@
         <w:ind w:left="720"/>
         <w:rPr>
           <w:rFonts w:ascii="Arial" w:hAnsi="Arial" w:cs="Arial"/>
-          <w:sz w:val="28"/>
-          <w:szCs w:val="28"/>
-        </w:rPr>
-      </w:pPr>
-      <w:r>
-        <w:rPr>
-          <w:rFonts w:ascii="Arial" w:hAnsi="Arial" w:cs="Arial"/>
+          <w:b/>
+          <w:bCs/>
+          <w:sz w:val="28"/>
+          <w:szCs w:val="28"/>
+        </w:rPr>
+      </w:pPr>
+      <w:r>
+        <w:rPr>
+          <w:rFonts w:ascii="Arial" w:hAnsi="Arial" w:cs="Arial"/>
+          <w:b/>
+          <w:bCs/>
           <w:sz w:val="28"/>
           <w:szCs w:val="28"/>
         </w:rPr>
         <w:t>BP-CATE-</w:t>
       </w:r>
+      <w:r>
+        <w:rPr>
+          <w:rFonts w:ascii="Arial" w:hAnsi="Arial" w:cs="Arial"/>
+          <w:b/>
+          <w:bCs/>
+          <w:sz w:val="28"/>
+          <w:szCs w:val="28"/>
+        </w:rPr>
+        <w:t>1. Quy trình Tạo Danh Mục Chi Tiêu</w:t>
+      </w:r>
+    </w:p>
+    <w:p>
+      <w:pPr>
+        <w:pStyle w:val="ListParagraph"/>
+        <w:numPr>
+          <w:ilvl w:val="0"/>
+          <w:numId w:val="15"/>
+        </w:numPr>
+        <w:rPr>
+          <w:rFonts w:ascii="Arial" w:hAnsi="Arial" w:cs="Arial"/>
+          <w:sz w:val="28"/>
+          <w:szCs w:val="28"/>
+        </w:rPr>
+      </w:pPr>
+      <w:r>
+        <w:rPr>
+          <w:rFonts w:ascii="Arial" w:hAnsi="Arial" w:cs="Arial"/>
+          <w:sz w:val="28"/>
+          <w:szCs w:val="28"/>
+        </w:rPr>
+        <w:t>Ấn nút tạo danh mục chi tiêu mới</w:t>
+      </w:r>
+    </w:p>
+    <w:p>
+      <w:pPr>
+        <w:pStyle w:val="ListParagraph"/>
+        <w:numPr>
+          <w:ilvl w:val="0"/>
+          <w:numId w:val="15"/>
+        </w:numPr>
+        <w:rPr>
+          <w:rFonts w:ascii="Arial" w:hAnsi="Arial" w:cs="Arial"/>
+          <w:sz w:val="28"/>
+          <w:szCs w:val="28"/>
+        </w:rPr>
+      </w:pPr>
+      <w:r>
+        <w:rPr>
+          <w:rFonts w:ascii="Arial" w:hAnsi="Arial" w:cs="Arial"/>
+          <w:sz w:val="28"/>
+          <w:szCs w:val="28"/>
+        </w:rPr>
+        <w:t>Nhập các dữ liệu cần thiết của danh mục chi tiêu</w:t>
+      </w:r>
+    </w:p>
+    <w:p>
+      <w:pPr>
+        <w:pStyle w:val="ListParagraph"/>
+        <w:numPr>
+          <w:ilvl w:val="0"/>
+          <w:numId w:val="15"/>
+        </w:numPr>
+        <w:rPr>
+          <w:rFonts w:ascii="Arial" w:hAnsi="Arial" w:cs="Arial"/>
+          <w:sz w:val="28"/>
+          <w:szCs w:val="28"/>
+        </w:rPr>
+      </w:pPr>
+      <w:r>
+        <w:rPr>
+          <w:rFonts w:ascii="Arial" w:hAnsi="Arial" w:cs="Arial"/>
+          <w:sz w:val="28"/>
+          <w:szCs w:val="28"/>
+        </w:rPr>
+        <w:t>Kiểm tra xác thực dữ liệu đầu vào của danh mục đang tạo</w:t>
+      </w:r>
+    </w:p>
+    <w:p>
+      <w:pPr>
+        <w:pStyle w:val="ListParagraph"/>
+        <w:numPr>
+          <w:ilvl w:val="0"/>
+          <w:numId w:val="15"/>
+        </w:numPr>
+        <w:rPr>
+          <w:rFonts w:ascii="Arial" w:hAnsi="Arial" w:cs="Arial"/>
+          <w:sz w:val="28"/>
+          <w:szCs w:val="28"/>
+        </w:rPr>
+      </w:pPr>
+      <w:r>
+        <w:rPr>
+          <w:rFonts w:ascii="Arial" w:hAnsi="Arial" w:cs="Arial"/>
+          <w:sz w:val="28"/>
+          <w:szCs w:val="28"/>
+        </w:rPr>
+        <w:t>Kiểm tra tên của danh mục</w:t>
+      </w:r>
+    </w:p>
+    <w:p>
+      <w:pPr>
+        <w:pStyle w:val="ListParagraph"/>
+        <w:numPr>
+          <w:ilvl w:val="1"/>
+          <w:numId w:val="15"/>
+        </w:numPr>
+        <w:rPr>
+          <w:rFonts w:ascii="Arial" w:hAnsi="Arial" w:cs="Arial"/>
+          <w:sz w:val="28"/>
+          <w:szCs w:val="28"/>
+        </w:rPr>
+      </w:pPr>
+      <w:r>
+        <w:rPr>
+          <w:rFonts w:ascii="Arial" w:hAnsi="Arial" w:cs="Arial"/>
+          <w:sz w:val="28"/>
+          <w:szCs w:val="28"/>
+        </w:rPr>
+        <w:t>Nếu danh mục chưa được đặt tên, tên danh mục chi tiêu sẽ được khởi tạo theo mẫu</w:t>
+      </w:r>
+    </w:p>
+    <w:p>
+      <w:pPr>
+        <w:pStyle w:val="ListParagraph"/>
+        <w:numPr>
+          <w:ilvl w:val="1"/>
+          <w:numId w:val="15"/>
+        </w:numPr>
+        <w:rPr>
+          <w:rFonts w:ascii="Arial" w:hAnsi="Arial" w:cs="Arial"/>
+          <w:sz w:val="28"/>
+          <w:szCs w:val="28"/>
+        </w:rPr>
+      </w:pPr>
+      <w:r>
+        <w:rPr>
+          <w:rFonts w:ascii="Arial" w:hAnsi="Arial" w:cs="Arial"/>
+          <w:sz w:val="28"/>
+          <w:szCs w:val="28"/>
+        </w:rPr>
+        <w:t>Nếu danh mục đã được đặt tên</w:t>
+      </w:r>
+    </w:p>
+    <w:p>
+      <w:pPr>
+        <w:pStyle w:val="ListParagraph"/>
+        <w:numPr>
+          <w:ilvl w:val="2"/>
+          <w:numId w:val="15"/>
+        </w:numPr>
+        <w:rPr>
+          <w:rFonts w:ascii="Arial" w:hAnsi="Arial" w:cs="Arial"/>
+          <w:sz w:val="28"/>
+          <w:szCs w:val="28"/>
+        </w:rPr>
+      </w:pPr>
+      <w:r>
+        <w:rPr>
+          <w:rFonts w:ascii="Arial" w:hAnsi="Arial" w:cs="Arial"/>
+          <w:sz w:val="28"/>
+          <w:szCs w:val="28"/>
+        </w:rPr>
+        <w:t>Kiểm tra ký tự tối đa của tên danh mục</w:t>
+      </w:r>
+    </w:p>
+    <w:p>
+      <w:pPr>
+        <w:pStyle w:val="ListParagraph"/>
+        <w:numPr>
+          <w:ilvl w:val="2"/>
+          <w:numId w:val="15"/>
+        </w:numPr>
+        <w:rPr>
+          <w:rFonts w:ascii="Arial" w:hAnsi="Arial" w:cs="Arial"/>
+          <w:sz w:val="28"/>
+          <w:szCs w:val="28"/>
+        </w:rPr>
+      </w:pPr>
+      <w:r>
+        <w:rPr>
+          <w:rFonts w:ascii="Arial" w:hAnsi="Arial" w:cs="Arial"/>
+          <w:sz w:val="28"/>
+          <w:szCs w:val="28"/>
+        </w:rPr>
+        <w:t>Kiểm tra trùng tên danh mục chi tiêu trong hệ thống</w:t>
+      </w:r>
+    </w:p>
+    <w:p>
+      <w:pPr>
+        <w:pStyle w:val="ListParagraph"/>
+        <w:numPr>
+          <w:ilvl w:val="1"/>
+          <w:numId w:val="15"/>
+        </w:numPr>
+        <w:rPr>
+          <w:rFonts w:ascii="Arial" w:hAnsi="Arial" w:cs="Arial"/>
+          <w:sz w:val="28"/>
+          <w:szCs w:val="28"/>
+        </w:rPr>
+      </w:pPr>
+      <w:r>
+        <w:rPr>
+          <w:rFonts w:ascii="Arial" w:hAnsi="Arial" w:cs="Arial"/>
+          <w:sz w:val="28"/>
+          <w:szCs w:val="28"/>
+        </w:rPr>
+        <w:t>Tạo danh mục chi tiêu thành công</w:t>
+      </w:r>
+    </w:p>
+    <w:p>
+      <w:pPr>
+        <w:rPr>
+          <w:rFonts w:ascii="Arial" w:hAnsi="Arial" w:cs="Arial"/>
+          <w:sz w:val="28"/>
+          <w:szCs w:val="28"/>
+        </w:rPr>
+      </w:pPr>
+    </w:p>
+    <w:p>
+      <w:pPr>
+        <w:ind w:left="720"/>
+        <w:rPr>
+          <w:rFonts w:ascii="Arial" w:hAnsi="Arial" w:cs="Arial"/>
+          <w:b/>
+          <w:bCs/>
+          <w:sz w:val="28"/>
+          <w:szCs w:val="28"/>
+        </w:rPr>
+      </w:pPr>
+      <w:r>
+        <w:rPr>
+          <w:rFonts w:ascii="Arial" w:hAnsi="Arial" w:cs="Arial"/>
+          <w:b/>
+          <w:bCs/>
+          <w:sz w:val="28"/>
+          <w:szCs w:val="28"/>
+        </w:rPr>
+        <w:t>BP-CATE-2. Quy trình Xóa Danh Mục Tự Tạo</w:t>
+      </w:r>
+    </w:p>
+    <w:p>
+      <w:pPr>
+        <w:pStyle w:val="ListParagraph"/>
+        <w:numPr>
+          <w:ilvl w:val="0"/>
+          <w:numId w:val="15"/>
+        </w:numPr>
+        <w:rPr>
+          <w:rFonts w:ascii="Arial" w:hAnsi="Arial" w:cs="Arial"/>
+          <w:sz w:val="28"/>
+          <w:szCs w:val="28"/>
+        </w:rPr>
+      </w:pPr>
+      <w:r>
+        <w:rPr>
+          <w:rFonts w:ascii="Arial" w:hAnsi="Arial" w:cs="Arial"/>
+          <w:sz w:val="28"/>
+          <w:szCs w:val="28"/>
+        </w:rPr>
+        <w:t>Ấn chọn danh mục tự tạo cần xóa</w:t>
+      </w:r>
+    </w:p>
+    <w:p>
+      <w:pPr>
+        <w:pStyle w:val="ListParagraph"/>
+        <w:numPr>
+          <w:ilvl w:val="0"/>
+          <w:numId w:val="15"/>
+        </w:numPr>
+        <w:rPr>
+          <w:rFonts w:ascii="Arial" w:hAnsi="Arial" w:cs="Arial"/>
+          <w:sz w:val="28"/>
+          <w:szCs w:val="28"/>
+        </w:rPr>
+      </w:pPr>
+      <w:r>
+        <w:rPr>
+          <w:rFonts w:ascii="Arial" w:hAnsi="Arial" w:cs="Arial"/>
+          <w:sz w:val="28"/>
+          <w:szCs w:val="28"/>
+        </w:rPr>
+        <w:t xml:space="preserve">Kiểm tra </w:t>
+      </w:r>
+      <w:r>
+        <w:rPr>
+          <w:rFonts w:ascii="Arial" w:hAnsi="Arial" w:cs="Arial"/>
+          <w:sz w:val="28"/>
+          <w:szCs w:val="28"/>
+        </w:rPr>
+        <w:t>loại danh mục</w:t>
+      </w:r>
+    </w:p>
+    <w:p>
+      <w:pPr>
+        <w:pStyle w:val="ListParagraph"/>
+        <w:numPr>
+          <w:ilvl w:val="1"/>
+          <w:numId w:val="15"/>
+        </w:numPr>
+        <w:rPr>
+          <w:rFonts w:ascii="Arial" w:hAnsi="Arial" w:cs="Arial"/>
+          <w:sz w:val="28"/>
+          <w:szCs w:val="28"/>
+        </w:rPr>
+      </w:pPr>
+      <w:r>
+        <w:rPr>
+          <w:rFonts w:ascii="Arial" w:hAnsi="Arial" w:cs="Arial"/>
+          <w:sz w:val="28"/>
+          <w:szCs w:val="28"/>
+        </w:rPr>
+        <w:t>Nếu danh mục mặc định, không cho xóa</w:t>
+      </w:r>
+    </w:p>
+    <w:p>
+      <w:pPr>
+        <w:pStyle w:val="ListParagraph"/>
+        <w:numPr>
+          <w:ilvl w:val="1"/>
+          <w:numId w:val="15"/>
+        </w:numPr>
+        <w:rPr>
+          <w:rFonts w:ascii="Arial" w:hAnsi="Arial" w:cs="Arial"/>
+          <w:sz w:val="28"/>
+          <w:szCs w:val="28"/>
+        </w:rPr>
+      </w:pPr>
+      <w:r>
+        <w:rPr>
+          <w:rFonts w:ascii="Arial" w:hAnsi="Arial" w:cs="Arial"/>
+          <w:sz w:val="28"/>
+          <w:szCs w:val="28"/>
+        </w:rPr>
+        <w:t>Nếu danh mục tự tạo, hiện xác nhận</w:t>
+      </w:r>
+    </w:p>
+    <w:p>
+      <w:pPr>
+        <w:pStyle w:val="ListParagraph"/>
+        <w:numPr>
+          <w:ilvl w:val="0"/>
+          <w:numId w:val="15"/>
+        </w:numPr>
+        <w:rPr>
+          <w:rFonts w:ascii="Arial" w:hAnsi="Arial" w:cs="Arial"/>
+          <w:sz w:val="28"/>
+          <w:szCs w:val="28"/>
+        </w:rPr>
+      </w:pPr>
+      <w:r>
+        <w:rPr>
+          <w:rFonts w:ascii="Arial" w:hAnsi="Arial" w:cs="Arial"/>
+          <w:sz w:val="28"/>
+          <w:szCs w:val="28"/>
+        </w:rPr>
+        <w:t>Tiến hành chuyển các khoản chi</w:t>
+      </w:r>
+      <w:r>
+        <w:rPr>
+          <w:rFonts w:ascii="Arial" w:hAnsi="Arial" w:cs="Arial"/>
+          <w:sz w:val="28"/>
+          <w:szCs w:val="28"/>
+        </w:rPr>
+        <w:t xml:space="preserve"> tiêu được liên kết qua các danh mục chi tiêu khác</w:t>
+      </w:r>
+    </w:p>
+    <w:p>
+      <w:pPr>
+        <w:pStyle w:val="ListParagraph"/>
+        <w:numPr>
+          <w:ilvl w:val="1"/>
+          <w:numId w:val="15"/>
+        </w:numPr>
+        <w:rPr>
+          <w:rFonts w:ascii="Arial" w:hAnsi="Arial" w:cs="Arial"/>
+          <w:sz w:val="28"/>
+          <w:szCs w:val="28"/>
+        </w:rPr>
+      </w:pPr>
+      <w:r>
+        <w:rPr>
+          <w:rFonts w:ascii="Arial" w:hAnsi="Arial" w:cs="Arial"/>
+          <w:sz w:val="28"/>
+          <w:szCs w:val="28"/>
+        </w:rPr>
+        <w:t>Nếu không chỉ định danh mục chi tiêu, tự động chuyển về danh mục “Khác”</w:t>
+      </w:r>
+    </w:p>
+    <w:p>
+      <w:pPr>
+        <w:pStyle w:val="ListParagraph"/>
+        <w:numPr>
+          <w:ilvl w:val="1"/>
+          <w:numId w:val="15"/>
+        </w:numPr>
+        <w:rPr>
+          <w:rFonts w:ascii="Arial" w:hAnsi="Arial" w:cs="Arial"/>
+          <w:sz w:val="28"/>
+          <w:szCs w:val="28"/>
+        </w:rPr>
+      </w:pPr>
+      <w:r>
+        <w:rPr>
+          <w:rFonts w:ascii="Arial" w:hAnsi="Arial" w:cs="Arial"/>
+          <w:sz w:val="28"/>
+          <w:szCs w:val="28"/>
+        </w:rPr>
+        <w:t>Nếu được chỉ định danh mục mới làm đích, các khoản chi tiêu được liên kết sẽ được chuyển về cho danh mục đích</w:t>
+      </w:r>
+    </w:p>
+    <w:p>
+      <w:pPr>
+        <w:pStyle w:val="ListParagraph"/>
+        <w:numPr>
+          <w:ilvl w:val="0"/>
+          <w:numId w:val="15"/>
+        </w:numPr>
+        <w:rPr>
+          <w:rFonts w:ascii="Arial" w:hAnsi="Arial" w:cs="Arial"/>
+          <w:sz w:val="28"/>
+          <w:szCs w:val="28"/>
+        </w:rPr>
+      </w:pPr>
+      <w:r>
+        <w:rPr>
+          <w:rFonts w:ascii="Arial" w:hAnsi="Arial" w:cs="Arial"/>
+          <w:sz w:val="28"/>
+          <w:szCs w:val="28"/>
+        </w:rPr>
+        <w:t>Tiến hành chuyển danh mục chỉ định xóa vào thùng rác</w:t>
+      </w:r>
+    </w:p>
+    <w:p>
+      <w:pPr>
+        <w:pStyle w:val="ListParagraph"/>
+        <w:numPr>
+          <w:ilvl w:val="0"/>
+          <w:numId w:val="15"/>
+        </w:numPr>
+        <w:rPr>
+          <w:rFonts w:ascii="Arial" w:hAnsi="Arial" w:cs="Arial"/>
+          <w:sz w:val="28"/>
+          <w:szCs w:val="28"/>
+        </w:rPr>
+      </w:pPr>
+      <w:r>
+        <w:rPr>
+          <w:rFonts w:ascii="Arial" w:hAnsi="Arial" w:cs="Arial"/>
+          <w:sz w:val="28"/>
+          <w:szCs w:val="28"/>
+        </w:rPr>
+        <w:t>Xóa mềm danh mục chi tiêu được chỉ định trong 30 ngày</w:t>
+      </w:r>
+    </w:p>
+    <w:p>
+      <w:pPr>
+        <w:rPr>
+          <w:rFonts w:ascii="Arial" w:hAnsi="Arial" w:cs="Arial"/>
+          <w:sz w:val="28"/>
+          <w:szCs w:val="28"/>
+        </w:rPr>
+      </w:pPr>
     </w:p>
     <w:p>
       <w:pPr>
@@ -15071,46 +16598,248 @@
           <w:sz w:val="28"/>
           <w:szCs w:val="28"/>
         </w:rPr>
-        <w:t xml:space="preserve"> </w:t>
-      </w:r>
-      <w:r>
-        <w:rPr>
-          <w:rFonts w:ascii="Arial" w:hAnsi="Arial" w:cs="Arial"/>
-          <w:b/>
-          <w:bCs/>
-          <w:sz w:val="28"/>
-          <w:szCs w:val="28"/>
-        </w:rPr>
-        <w:t>Quy Trình Nghiệp Vụ Cho</w:t>
-      </w:r>
-      <w:r>
-        <w:rPr>
-          <w:rFonts w:ascii="Arial" w:hAnsi="Arial" w:cs="Arial"/>
-          <w:b/>
-          <w:bCs/>
-          <w:sz w:val="28"/>
-          <w:szCs w:val="28"/>
-        </w:rPr>
-        <w:t xml:space="preserve"> Quản Lý Thu Nhập</w:t>
-      </w:r>
-    </w:p>
-    <w:p>
-      <w:pPr>
-        <w:ind w:left="720"/>
-        <w:rPr>
-          <w:rFonts w:ascii="Arial" w:hAnsi="Arial" w:cs="Arial"/>
-          <w:sz w:val="28"/>
-          <w:szCs w:val="28"/>
-        </w:rPr>
-      </w:pPr>
-      <w:r>
-        <w:rPr>
-          <w:rFonts w:ascii="Arial" w:hAnsi="Arial" w:cs="Arial"/>
-          <w:sz w:val="28"/>
-          <w:szCs w:val="28"/>
-        </w:rPr>
+        <w:t xml:space="preserve"> Quy Trình Nghiệp Vụ Cho Quản Lý Thu Nhập</w:t>
+      </w:r>
+    </w:p>
+    <w:p>
+      <w:pPr>
+        <w:ind w:left="720"/>
+        <w:rPr>
+          <w:rFonts w:ascii="Arial" w:hAnsi="Arial" w:cs="Arial"/>
+          <w:b/>
+          <w:bCs/>
+          <w:sz w:val="28"/>
+          <w:szCs w:val="28"/>
+        </w:rPr>
+      </w:pPr>
+      <w:r>
+        <w:rPr>
+          <w:rFonts w:ascii="Arial" w:hAnsi="Arial" w:cs="Arial"/>
+          <w:b/>
+          <w:bCs/>
+          <w:sz w:val="28"/>
+          <w:szCs w:val="28"/>
+        </w:rPr>
+        <w:lastRenderedPageBreak/>
         <w:t>BP-IT-</w:t>
       </w:r>
+      <w:r>
+        <w:rPr>
+          <w:rFonts w:ascii="Arial" w:hAnsi="Arial" w:cs="Arial"/>
+          <w:b/>
+          <w:bCs/>
+          <w:sz w:val="28"/>
+          <w:szCs w:val="28"/>
+        </w:rPr>
+        <w:t>1. Quy trình Tạo Khoản Thu Nhập</w:t>
+      </w:r>
+    </w:p>
+    <w:p>
+      <w:pPr>
+        <w:pStyle w:val="ListParagraph"/>
+        <w:numPr>
+          <w:ilvl w:val="0"/>
+          <w:numId w:val="15"/>
+        </w:numPr>
+        <w:rPr>
+          <w:rFonts w:ascii="Arial" w:hAnsi="Arial" w:cs="Arial"/>
+          <w:sz w:val="28"/>
+          <w:szCs w:val="28"/>
+        </w:rPr>
+      </w:pPr>
+      <w:r>
+        <w:rPr>
+          <w:rFonts w:ascii="Arial" w:hAnsi="Arial" w:cs="Arial"/>
+          <w:sz w:val="28"/>
+          <w:szCs w:val="28"/>
+        </w:rPr>
+        <w:t>Nhập thu nhập</w:t>
+      </w:r>
+    </w:p>
+    <w:p>
+      <w:pPr>
+        <w:pStyle w:val="ListParagraph"/>
+        <w:numPr>
+          <w:ilvl w:val="0"/>
+          <w:numId w:val="15"/>
+        </w:numPr>
+        <w:rPr>
+          <w:rFonts w:ascii="Arial" w:hAnsi="Arial" w:cs="Arial"/>
+          <w:sz w:val="28"/>
+          <w:szCs w:val="28"/>
+        </w:rPr>
+      </w:pPr>
+      <w:r>
+        <w:rPr>
+          <w:rFonts w:ascii="Arial" w:hAnsi="Arial" w:cs="Arial"/>
+          <w:sz w:val="28"/>
+          <w:szCs w:val="28"/>
+        </w:rPr>
+        <w:t>Xác thực thu nhập</w:t>
+      </w:r>
+    </w:p>
+    <w:p>
+      <w:pPr>
+        <w:pStyle w:val="ListParagraph"/>
+        <w:numPr>
+          <w:ilvl w:val="0"/>
+          <w:numId w:val="15"/>
+        </w:numPr>
+        <w:rPr>
+          <w:rFonts w:ascii="Arial" w:hAnsi="Arial" w:cs="Arial"/>
+          <w:sz w:val="28"/>
+          <w:szCs w:val="28"/>
+        </w:rPr>
+      </w:pPr>
+      <w:r>
+        <w:rPr>
+          <w:rFonts w:ascii="Arial" w:hAnsi="Arial" w:cs="Arial"/>
+          <w:sz w:val="28"/>
+          <w:szCs w:val="28"/>
+        </w:rPr>
+        <w:t>Chọn danh mục thu nhập</w:t>
+      </w:r>
+    </w:p>
+    <w:p>
+      <w:pPr>
+        <w:pStyle w:val="ListParagraph"/>
+        <w:numPr>
+          <w:ilvl w:val="1"/>
+          <w:numId w:val="15"/>
+        </w:numPr>
+        <w:rPr>
+          <w:rFonts w:ascii="Arial" w:hAnsi="Arial" w:cs="Arial"/>
+          <w:sz w:val="28"/>
+          <w:szCs w:val="28"/>
+        </w:rPr>
+      </w:pPr>
+      <w:r>
+        <w:rPr>
+          <w:rFonts w:ascii="Arial" w:hAnsi="Arial" w:cs="Arial"/>
+          <w:sz w:val="28"/>
+          <w:szCs w:val="28"/>
+        </w:rPr>
+        <w:t>Nếu không chọn, mặc định danh mục sẽ là khác</w:t>
+      </w:r>
+    </w:p>
+    <w:p>
+      <w:pPr>
+        <w:pStyle w:val="ListParagraph"/>
+        <w:numPr>
+          <w:ilvl w:val="0"/>
+          <w:numId w:val="15"/>
+        </w:numPr>
+        <w:rPr>
+          <w:rFonts w:ascii="Arial" w:hAnsi="Arial" w:cs="Arial"/>
+          <w:sz w:val="28"/>
+          <w:szCs w:val="28"/>
+        </w:rPr>
+      </w:pPr>
+      <w:r>
+        <w:rPr>
+          <w:rFonts w:ascii="Arial" w:hAnsi="Arial" w:cs="Arial"/>
+          <w:sz w:val="28"/>
+          <w:szCs w:val="28"/>
+        </w:rPr>
+        <w:t>Kiểm tra nguồn tiền</w:t>
+      </w:r>
+    </w:p>
+    <w:p>
+      <w:pPr>
+        <w:pStyle w:val="ListParagraph"/>
+        <w:numPr>
+          <w:ilvl w:val="0"/>
+          <w:numId w:val="15"/>
+        </w:numPr>
+        <w:rPr>
+          <w:rFonts w:ascii="Arial" w:hAnsi="Arial" w:cs="Arial"/>
+          <w:sz w:val="28"/>
+          <w:szCs w:val="28"/>
+        </w:rPr>
+      </w:pPr>
+      <w:r>
+        <w:rPr>
+          <w:rFonts w:ascii="Arial" w:hAnsi="Arial" w:cs="Arial"/>
+          <w:sz w:val="28"/>
+          <w:szCs w:val="28"/>
+        </w:rPr>
+        <w:t>Lưu thu nhập</w:t>
+      </w:r>
+    </w:p>
+    <w:p>
+      <w:pPr>
+        <w:pStyle w:val="ListParagraph"/>
+        <w:numPr>
+          <w:ilvl w:val="0"/>
+          <w:numId w:val="15"/>
+        </w:numPr>
+        <w:rPr>
+          <w:rFonts w:ascii="Arial" w:hAnsi="Arial" w:cs="Arial"/>
+          <w:sz w:val="28"/>
+          <w:szCs w:val="28"/>
+        </w:rPr>
+      </w:pPr>
+      <w:r>
+        <w:rPr>
+          <w:rFonts w:ascii="Arial" w:hAnsi="Arial" w:cs="Arial"/>
+          <w:sz w:val="28"/>
+          <w:szCs w:val="28"/>
+        </w:rPr>
+        <w:t>Cộng số dư nguồn tiền</w:t>
+      </w:r>
+    </w:p>
+    <w:p>
+      <w:pPr>
+        <w:pStyle w:val="ListParagraph"/>
+        <w:numPr>
+          <w:ilvl w:val="0"/>
+          <w:numId w:val="15"/>
+        </w:numPr>
+        <w:rPr>
+          <w:rFonts w:ascii="Arial" w:hAnsi="Arial" w:cs="Arial"/>
+          <w:sz w:val="28"/>
+          <w:szCs w:val="28"/>
+        </w:rPr>
+      </w:pPr>
+      <w:r>
+        <w:rPr>
+          <w:rFonts w:ascii="Arial" w:hAnsi="Arial" w:cs="Arial"/>
+          <w:sz w:val="28"/>
+          <w:szCs w:val="28"/>
+        </w:rPr>
+        <w:t>Cập nhật thống kê</w:t>
+      </w:r>
+    </w:p>
+    <w:p>
+      <w:pPr>
+        <w:pStyle w:val="ListParagraph"/>
+        <w:numPr>
+          <w:ilvl w:val="0"/>
+          <w:numId w:val="15"/>
+        </w:numPr>
+        <w:rPr>
+          <w:rFonts w:ascii="Arial" w:hAnsi="Arial" w:cs="Arial"/>
+          <w:sz w:val="28"/>
+          <w:szCs w:val="28"/>
+        </w:rPr>
+      </w:pPr>
+      <w:r>
+        <w:rPr>
+          <w:rFonts w:ascii="Arial" w:hAnsi="Arial" w:cs="Arial"/>
+          <w:sz w:val="28"/>
+          <w:szCs w:val="28"/>
+        </w:rPr>
+        <w:t>Lưu lịch sử</w:t>
+      </w:r>
+    </w:p>
+    <w:p>
+      <w:pPr>
+        <w:rPr>
+          <w:rFonts w:ascii="Arial" w:hAnsi="Arial" w:cs="Arial"/>
+          <w:sz w:val="28"/>
+          <w:szCs w:val="28"/>
+        </w:rPr>
+      </w:pPr>
     </w:p>
     <w:p>
       <w:pPr>
@@ -15135,27 +16864,7 @@
           <w:sz w:val="28"/>
           <w:szCs w:val="28"/>
         </w:rPr>
-        <w:t xml:space="preserve"> </w:t>
-      </w:r>
-      <w:r>
-        <w:rPr>
-          <w:rFonts w:ascii="Arial" w:hAnsi="Arial" w:cs="Arial"/>
-          <w:b/>
-          <w:bCs/>
-          <w:sz w:val="28"/>
-          <w:szCs w:val="28"/>
-        </w:rPr>
-        <w:t>Quy Trình Nghiệp Vụ Cho</w:t>
-      </w:r>
-      <w:r>
-        <w:rPr>
-          <w:rFonts w:ascii="Arial" w:hAnsi="Arial" w:cs="Arial"/>
-          <w:b/>
-          <w:bCs/>
-          <w:sz w:val="28"/>
-          <w:szCs w:val="28"/>
-        </w:rPr>
-        <w:t xml:space="preserve"> Quản Lý Danh Mục Thu Nhập</w:t>
+        <w:t xml:space="preserve"> Quy Trình Nghiệp Vụ Cho Quản Lý Danh Mục Thu Nhập</w:t>
       </w:r>
     </w:p>
     <w:p>
@@ -15243,46 +16952,225 @@
           <w:sz w:val="28"/>
           <w:szCs w:val="28"/>
         </w:rPr>
-        <w:t xml:space="preserve"> </w:t>
-      </w:r>
-      <w:r>
-        <w:rPr>
-          <w:rFonts w:ascii="Arial" w:hAnsi="Arial" w:cs="Arial"/>
-          <w:b/>
-          <w:bCs/>
-          <w:sz w:val="28"/>
-          <w:szCs w:val="28"/>
-        </w:rPr>
-        <w:t>Quy Trình Nghiệp Vụ Cho</w:t>
-      </w:r>
-      <w:r>
-        <w:rPr>
-          <w:rFonts w:ascii="Arial" w:hAnsi="Arial" w:cs="Arial"/>
-          <w:b/>
-          <w:bCs/>
-          <w:sz w:val="28"/>
-          <w:szCs w:val="28"/>
-        </w:rPr>
-        <w:t xml:space="preserve"> Chuyển TIền Nội Bộ</w:t>
-      </w:r>
-    </w:p>
-    <w:p>
-      <w:pPr>
-        <w:ind w:left="720"/>
-        <w:rPr>
-          <w:rFonts w:ascii="Arial" w:hAnsi="Arial" w:cs="Arial"/>
-          <w:sz w:val="28"/>
-          <w:szCs w:val="28"/>
-        </w:rPr>
-      </w:pPr>
-      <w:r>
-        <w:rPr>
-          <w:rFonts w:ascii="Arial" w:hAnsi="Arial" w:cs="Arial"/>
+        <w:t xml:space="preserve"> Quy Trình Nghiệp Vụ Cho Chuyển TIền Nội Bộ</w:t>
+      </w:r>
+    </w:p>
+    <w:p>
+      <w:pPr>
+        <w:ind w:left="720"/>
+        <w:rPr>
+          <w:rFonts w:ascii="Arial" w:hAnsi="Arial" w:cs="Arial"/>
+          <w:b/>
+          <w:bCs/>
+          <w:sz w:val="28"/>
+          <w:szCs w:val="28"/>
+        </w:rPr>
+      </w:pPr>
+      <w:r>
+        <w:rPr>
+          <w:rFonts w:ascii="Arial" w:hAnsi="Arial" w:cs="Arial"/>
+          <w:b/>
+          <w:bCs/>
           <w:sz w:val="28"/>
           <w:szCs w:val="28"/>
         </w:rPr>
         <w:t>BP-TF-</w:t>
       </w:r>
+      <w:r>
+        <w:rPr>
+          <w:rFonts w:ascii="Arial" w:hAnsi="Arial" w:cs="Arial"/>
+          <w:b/>
+          <w:bCs/>
+          <w:sz w:val="28"/>
+          <w:szCs w:val="28"/>
+        </w:rPr>
+        <w:t>1. Quy trình Chuyển Tiền Nội Bộ</w:t>
+      </w:r>
+    </w:p>
+    <w:p>
+      <w:pPr>
+        <w:pStyle w:val="ListParagraph"/>
+        <w:numPr>
+          <w:ilvl w:val="0"/>
+          <w:numId w:val="15"/>
+        </w:numPr>
+        <w:rPr>
+          <w:rFonts w:ascii="Arial" w:hAnsi="Arial" w:cs="Arial"/>
+          <w:sz w:val="28"/>
+          <w:szCs w:val="28"/>
+        </w:rPr>
+      </w:pPr>
+      <w:r>
+        <w:rPr>
+          <w:rFonts w:ascii="Arial" w:hAnsi="Arial" w:cs="Arial"/>
+          <w:sz w:val="28"/>
+          <w:szCs w:val="28"/>
+        </w:rPr>
+        <w:t>Chọn nguồn gửi</w:t>
+      </w:r>
+    </w:p>
+    <w:p>
+      <w:pPr>
+        <w:pStyle w:val="ListParagraph"/>
+        <w:numPr>
+          <w:ilvl w:val="0"/>
+          <w:numId w:val="15"/>
+        </w:numPr>
+        <w:rPr>
+          <w:rFonts w:ascii="Arial" w:hAnsi="Arial" w:cs="Arial"/>
+          <w:sz w:val="28"/>
+          <w:szCs w:val="28"/>
+        </w:rPr>
+      </w:pPr>
+      <w:r>
+        <w:rPr>
+          <w:rFonts w:ascii="Arial" w:hAnsi="Arial" w:cs="Arial"/>
+          <w:sz w:val="28"/>
+          <w:szCs w:val="28"/>
+        </w:rPr>
+        <w:t>Chọn nguồn nhận</w:t>
+      </w:r>
+    </w:p>
+    <w:p>
+      <w:pPr>
+        <w:pStyle w:val="ListParagraph"/>
+        <w:numPr>
+          <w:ilvl w:val="0"/>
+          <w:numId w:val="15"/>
+        </w:numPr>
+        <w:rPr>
+          <w:rFonts w:ascii="Arial" w:hAnsi="Arial" w:cs="Arial"/>
+          <w:sz w:val="28"/>
+          <w:szCs w:val="28"/>
+        </w:rPr>
+      </w:pPr>
+      <w:r>
+        <w:rPr>
+          <w:rFonts w:ascii="Arial" w:hAnsi="Arial" w:cs="Arial"/>
+          <w:sz w:val="28"/>
+          <w:szCs w:val="28"/>
+        </w:rPr>
+        <w:t>Xác thực</w:t>
+      </w:r>
+    </w:p>
+    <w:p>
+      <w:pPr>
+        <w:pStyle w:val="ListParagraph"/>
+        <w:numPr>
+          <w:ilvl w:val="0"/>
+          <w:numId w:val="15"/>
+        </w:numPr>
+        <w:rPr>
+          <w:rFonts w:ascii="Arial" w:hAnsi="Arial" w:cs="Arial"/>
+          <w:sz w:val="28"/>
+          <w:szCs w:val="28"/>
+        </w:rPr>
+      </w:pPr>
+      <w:r>
+        <w:rPr>
+          <w:rFonts w:ascii="Arial" w:hAnsi="Arial" w:cs="Arial"/>
+          <w:sz w:val="28"/>
+          <w:szCs w:val="28"/>
+        </w:rPr>
+        <w:t>Kiểm tra số dư</w:t>
+      </w:r>
+    </w:p>
+    <w:p>
+      <w:pPr>
+        <w:pStyle w:val="ListParagraph"/>
+        <w:numPr>
+          <w:ilvl w:val="0"/>
+          <w:numId w:val="15"/>
+        </w:numPr>
+        <w:rPr>
+          <w:rFonts w:ascii="Arial" w:hAnsi="Arial" w:cs="Arial"/>
+          <w:sz w:val="28"/>
+          <w:szCs w:val="28"/>
+        </w:rPr>
+      </w:pPr>
+      <w:r>
+        <w:rPr>
+          <w:rFonts w:ascii="Arial" w:hAnsi="Arial" w:cs="Arial"/>
+          <w:sz w:val="28"/>
+          <w:szCs w:val="28"/>
+        </w:rPr>
+        <w:t>Trừ nguồn gửi</w:t>
+      </w:r>
+    </w:p>
+    <w:p>
+      <w:pPr>
+        <w:pStyle w:val="ListParagraph"/>
+        <w:numPr>
+          <w:ilvl w:val="0"/>
+          <w:numId w:val="15"/>
+        </w:numPr>
+        <w:rPr>
+          <w:rFonts w:ascii="Arial" w:hAnsi="Arial" w:cs="Arial"/>
+          <w:sz w:val="28"/>
+          <w:szCs w:val="28"/>
+        </w:rPr>
+      </w:pPr>
+      <w:r>
+        <w:rPr>
+          <w:rFonts w:ascii="Arial" w:hAnsi="Arial" w:cs="Arial"/>
+          <w:sz w:val="28"/>
+          <w:szCs w:val="28"/>
+        </w:rPr>
+        <w:t>Cộng nguồn nhận</w:t>
+      </w:r>
+    </w:p>
+    <w:p>
+      <w:pPr>
+        <w:pStyle w:val="ListParagraph"/>
+        <w:numPr>
+          <w:ilvl w:val="0"/>
+          <w:numId w:val="15"/>
+        </w:numPr>
+        <w:rPr>
+          <w:rFonts w:ascii="Arial" w:hAnsi="Arial" w:cs="Arial"/>
+          <w:sz w:val="28"/>
+          <w:szCs w:val="28"/>
+        </w:rPr>
+      </w:pPr>
+      <w:r>
+        <w:rPr>
+          <w:rFonts w:ascii="Arial" w:hAnsi="Arial" w:cs="Arial"/>
+          <w:sz w:val="28"/>
+          <w:szCs w:val="28"/>
+        </w:rPr>
+        <w:t>Lưu chuyển tiền</w:t>
+      </w:r>
+    </w:p>
+    <w:p>
+      <w:pPr>
+        <w:pStyle w:val="ListParagraph"/>
+        <w:numPr>
+          <w:ilvl w:val="0"/>
+          <w:numId w:val="15"/>
+        </w:numPr>
+        <w:rPr>
+          <w:rFonts w:ascii="Arial" w:hAnsi="Arial" w:cs="Arial"/>
+          <w:sz w:val="28"/>
+          <w:szCs w:val="28"/>
+        </w:rPr>
+      </w:pPr>
+      <w:r>
+        <w:rPr>
+          <w:rFonts w:ascii="Arial" w:hAnsi="Arial" w:cs="Arial"/>
+          <w:sz w:val="28"/>
+          <w:szCs w:val="28"/>
+        </w:rPr>
+        <w:t>Lưu lịch sử</w:t>
+      </w:r>
+    </w:p>
+    <w:p>
+      <w:pPr>
+        <w:rPr>
+          <w:rFonts w:ascii="Arial" w:hAnsi="Arial" w:cs="Arial"/>
+          <w:sz w:val="28"/>
+          <w:szCs w:val="28"/>
+        </w:rPr>
+      </w:pPr>
     </w:p>
     <w:p>
       <w:pPr>
@@ -15315,18 +17203,425 @@
         <w:ind w:left="720"/>
         <w:rPr>
           <w:rFonts w:ascii="Arial" w:hAnsi="Arial" w:cs="Arial"/>
-          <w:sz w:val="28"/>
-          <w:szCs w:val="28"/>
-        </w:rPr>
-      </w:pPr>
-      <w:r>
-        <w:rPr>
-          <w:rFonts w:ascii="Arial" w:hAnsi="Arial" w:cs="Arial"/>
+          <w:b/>
+          <w:bCs/>
+          <w:sz w:val="28"/>
+          <w:szCs w:val="28"/>
+        </w:rPr>
+      </w:pPr>
+      <w:r>
+        <w:rPr>
+          <w:rFonts w:ascii="Arial" w:hAnsi="Arial" w:cs="Arial"/>
+          <w:b/>
+          <w:bCs/>
           <w:sz w:val="28"/>
           <w:szCs w:val="28"/>
         </w:rPr>
         <w:t>BP-BUD-</w:t>
       </w:r>
+      <w:r>
+        <w:rPr>
+          <w:rFonts w:ascii="Arial" w:hAnsi="Arial" w:cs="Arial"/>
+          <w:b/>
+          <w:bCs/>
+          <w:sz w:val="28"/>
+          <w:szCs w:val="28"/>
+        </w:rPr>
+        <w:t>1. Quy trình Tạo Ngân Sách</w:t>
+      </w:r>
+    </w:p>
+    <w:p>
+      <w:pPr>
+        <w:pStyle w:val="ListParagraph"/>
+        <w:numPr>
+          <w:ilvl w:val="0"/>
+          <w:numId w:val="15"/>
+        </w:numPr>
+        <w:rPr>
+          <w:rFonts w:ascii="Arial" w:hAnsi="Arial" w:cs="Arial"/>
+          <w:sz w:val="28"/>
+          <w:szCs w:val="28"/>
+        </w:rPr>
+      </w:pPr>
+      <w:r>
+        <w:rPr>
+          <w:rFonts w:ascii="Arial" w:hAnsi="Arial" w:cs="Arial"/>
+          <w:sz w:val="28"/>
+          <w:szCs w:val="28"/>
+        </w:rPr>
+        <w:t>Tạo ngân sách</w:t>
+      </w:r>
+    </w:p>
+    <w:p>
+      <w:pPr>
+        <w:pStyle w:val="ListParagraph"/>
+        <w:numPr>
+          <w:ilvl w:val="0"/>
+          <w:numId w:val="15"/>
+        </w:numPr>
+        <w:rPr>
+          <w:rFonts w:ascii="Arial" w:hAnsi="Arial" w:cs="Arial"/>
+          <w:sz w:val="28"/>
+          <w:szCs w:val="28"/>
+        </w:rPr>
+      </w:pPr>
+      <w:r>
+        <w:rPr>
+          <w:rFonts w:ascii="Arial" w:hAnsi="Arial" w:cs="Arial"/>
+          <w:sz w:val="28"/>
+          <w:szCs w:val="28"/>
+        </w:rPr>
+        <w:lastRenderedPageBreak/>
+        <w:t>Chọn chu kỳ tái lập</w:t>
+      </w:r>
+    </w:p>
+    <w:p>
+      <w:pPr>
+        <w:pStyle w:val="ListParagraph"/>
+        <w:numPr>
+          <w:ilvl w:val="0"/>
+          <w:numId w:val="15"/>
+        </w:numPr>
+        <w:rPr>
+          <w:rFonts w:ascii="Arial" w:hAnsi="Arial" w:cs="Arial"/>
+          <w:sz w:val="28"/>
+          <w:szCs w:val="28"/>
+        </w:rPr>
+      </w:pPr>
+      <w:r>
+        <w:rPr>
+          <w:rFonts w:ascii="Arial" w:hAnsi="Arial" w:cs="Arial"/>
+          <w:sz w:val="28"/>
+          <w:szCs w:val="28"/>
+        </w:rPr>
+        <w:t>Nhập giới hạn chi tiệu</w:t>
+      </w:r>
+    </w:p>
+    <w:p>
+      <w:pPr>
+        <w:pStyle w:val="ListParagraph"/>
+        <w:numPr>
+          <w:ilvl w:val="0"/>
+          <w:numId w:val="15"/>
+        </w:numPr>
+        <w:rPr>
+          <w:rFonts w:ascii="Arial" w:hAnsi="Arial" w:cs="Arial"/>
+          <w:sz w:val="28"/>
+          <w:szCs w:val="28"/>
+        </w:rPr>
+      </w:pPr>
+      <w:r>
+        <w:rPr>
+          <w:rFonts w:ascii="Arial" w:hAnsi="Arial" w:cs="Arial"/>
+          <w:sz w:val="28"/>
+          <w:szCs w:val="28"/>
+        </w:rPr>
+        <w:t>Xác thực</w:t>
+      </w:r>
+    </w:p>
+    <w:p>
+      <w:pPr>
+        <w:pStyle w:val="ListParagraph"/>
+        <w:numPr>
+          <w:ilvl w:val="0"/>
+          <w:numId w:val="15"/>
+        </w:numPr>
+        <w:rPr>
+          <w:rFonts w:ascii="Arial" w:hAnsi="Arial" w:cs="Arial"/>
+          <w:sz w:val="28"/>
+          <w:szCs w:val="28"/>
+        </w:rPr>
+      </w:pPr>
+      <w:r>
+        <w:rPr>
+          <w:rFonts w:ascii="Arial" w:hAnsi="Arial" w:cs="Arial"/>
+          <w:sz w:val="28"/>
+          <w:szCs w:val="28"/>
+        </w:rPr>
+        <w:t>Lưu ngân sách</w:t>
+      </w:r>
+    </w:p>
+    <w:p>
+      <w:pPr>
+        <w:rPr>
+          <w:rFonts w:ascii="Arial" w:hAnsi="Arial" w:cs="Arial"/>
+          <w:sz w:val="28"/>
+          <w:szCs w:val="28"/>
+        </w:rPr>
+      </w:pPr>
+    </w:p>
+    <w:p>
+      <w:pPr>
+        <w:ind w:left="720"/>
+        <w:rPr>
+          <w:rFonts w:ascii="Arial" w:hAnsi="Arial" w:cs="Arial"/>
+          <w:b/>
+          <w:bCs/>
+          <w:sz w:val="28"/>
+          <w:szCs w:val="28"/>
+        </w:rPr>
+      </w:pPr>
+      <w:r>
+        <w:rPr>
+          <w:rFonts w:ascii="Arial" w:hAnsi="Arial" w:cs="Arial"/>
+          <w:b/>
+          <w:bCs/>
+          <w:sz w:val="28"/>
+          <w:szCs w:val="28"/>
+        </w:rPr>
+        <w:t>BP-BUD-2. Quy trình Kiểm Tra Ngân Sách Khi Chi Tiêu</w:t>
+      </w:r>
+    </w:p>
+    <w:p>
+      <w:pPr>
+        <w:pStyle w:val="ListParagraph"/>
+        <w:numPr>
+          <w:ilvl w:val="0"/>
+          <w:numId w:val="15"/>
+        </w:numPr>
+        <w:rPr>
+          <w:rFonts w:ascii="Arial" w:hAnsi="Arial" w:cs="Arial"/>
+          <w:sz w:val="28"/>
+          <w:szCs w:val="28"/>
+        </w:rPr>
+      </w:pPr>
+      <w:r>
+        <w:rPr>
+          <w:rFonts w:ascii="Arial" w:hAnsi="Arial" w:cs="Arial"/>
+          <w:sz w:val="28"/>
+          <w:szCs w:val="28"/>
+        </w:rPr>
+        <w:t>Tạo giao dịch chi tiêu</w:t>
+      </w:r>
+    </w:p>
+    <w:p>
+      <w:pPr>
+        <w:pStyle w:val="ListParagraph"/>
+        <w:numPr>
+          <w:ilvl w:val="0"/>
+          <w:numId w:val="15"/>
+        </w:numPr>
+        <w:rPr>
+          <w:rFonts w:ascii="Arial" w:hAnsi="Arial" w:cs="Arial"/>
+          <w:sz w:val="28"/>
+          <w:szCs w:val="28"/>
+        </w:rPr>
+      </w:pPr>
+      <w:r>
+        <w:rPr>
+          <w:rFonts w:ascii="Arial" w:hAnsi="Arial" w:cs="Arial"/>
+          <w:sz w:val="28"/>
+          <w:szCs w:val="28"/>
+        </w:rPr>
+        <w:t>Kiểm tra liên kết ngân sách</w:t>
+      </w:r>
+    </w:p>
+    <w:p>
+      <w:pPr>
+        <w:pStyle w:val="ListParagraph"/>
+        <w:numPr>
+          <w:ilvl w:val="1"/>
+          <w:numId w:val="15"/>
+        </w:numPr>
+        <w:rPr>
+          <w:rFonts w:ascii="Arial" w:hAnsi="Arial" w:cs="Arial"/>
+          <w:sz w:val="28"/>
+          <w:szCs w:val="28"/>
+        </w:rPr>
+      </w:pPr>
+      <w:r>
+        <w:rPr>
+          <w:rFonts w:ascii="Arial" w:hAnsi="Arial" w:cs="Arial"/>
+          <w:sz w:val="28"/>
+          <w:szCs w:val="28"/>
+        </w:rPr>
+        <w:t>Nếu không liên kết, lưu giao dịch</w:t>
+      </w:r>
+    </w:p>
+    <w:p>
+      <w:pPr>
+        <w:pStyle w:val="ListParagraph"/>
+        <w:numPr>
+          <w:ilvl w:val="1"/>
+          <w:numId w:val="15"/>
+        </w:numPr>
+        <w:rPr>
+          <w:rFonts w:ascii="Arial" w:hAnsi="Arial" w:cs="Arial"/>
+          <w:sz w:val="28"/>
+          <w:szCs w:val="28"/>
+        </w:rPr>
+      </w:pPr>
+      <w:r>
+        <w:rPr>
+          <w:rFonts w:ascii="Arial" w:hAnsi="Arial" w:cs="Arial"/>
+          <w:sz w:val="28"/>
+          <w:szCs w:val="28"/>
+        </w:rPr>
+        <w:t>Nếu có liên kết với ngân sách</w:t>
+      </w:r>
+    </w:p>
+    <w:p>
+      <w:pPr>
+        <w:pStyle w:val="ListParagraph"/>
+        <w:numPr>
+          <w:ilvl w:val="2"/>
+          <w:numId w:val="15"/>
+        </w:numPr>
+        <w:rPr>
+          <w:rFonts w:ascii="Arial" w:hAnsi="Arial" w:cs="Arial"/>
+          <w:sz w:val="28"/>
+          <w:szCs w:val="28"/>
+        </w:rPr>
+      </w:pPr>
+      <w:r>
+        <w:rPr>
+          <w:rFonts w:ascii="Arial" w:hAnsi="Arial" w:cs="Arial"/>
+          <w:sz w:val="28"/>
+          <w:szCs w:val="28"/>
+        </w:rPr>
+        <w:t>Tính số lượng sử dụng</w:t>
+      </w:r>
+    </w:p>
+    <w:p>
+      <w:pPr>
+        <w:pStyle w:val="ListParagraph"/>
+        <w:numPr>
+          <w:ilvl w:val="3"/>
+          <w:numId w:val="15"/>
+        </w:numPr>
+        <w:rPr>
+          <w:rFonts w:ascii="Arial" w:hAnsi="Arial" w:cs="Arial"/>
+          <w:sz w:val="28"/>
+          <w:szCs w:val="28"/>
+        </w:rPr>
+      </w:pPr>
+      <w:r>
+        <w:rPr>
+          <w:rFonts w:ascii="Arial" w:hAnsi="Arial" w:cs="Arial"/>
+          <w:sz w:val="28"/>
+          <w:szCs w:val="28"/>
+        </w:rPr>
+        <w:t>Nếu vượt ngưỡng một lần giao dịch</w:t>
+      </w:r>
+    </w:p>
+    <w:p>
+      <w:pPr>
+        <w:pStyle w:val="ListParagraph"/>
+        <w:numPr>
+          <w:ilvl w:val="4"/>
+          <w:numId w:val="15"/>
+        </w:numPr>
+        <w:rPr>
+          <w:rFonts w:ascii="Arial" w:hAnsi="Arial" w:cs="Arial"/>
+          <w:sz w:val="28"/>
+          <w:szCs w:val="28"/>
+        </w:rPr>
+      </w:pPr>
+      <w:r>
+        <w:rPr>
+          <w:rFonts w:ascii="Arial" w:hAnsi="Arial" w:cs="Arial"/>
+          <w:sz w:val="28"/>
+          <w:szCs w:val="28"/>
+        </w:rPr>
+        <w:t>Cảnh báo</w:t>
+      </w:r>
+    </w:p>
+    <w:p>
+      <w:pPr>
+        <w:pStyle w:val="ListParagraph"/>
+        <w:numPr>
+          <w:ilvl w:val="3"/>
+          <w:numId w:val="15"/>
+        </w:numPr>
+        <w:rPr>
+          <w:rFonts w:ascii="Arial" w:hAnsi="Arial" w:cs="Arial"/>
+          <w:sz w:val="28"/>
+          <w:szCs w:val="28"/>
+        </w:rPr>
+      </w:pPr>
+      <w:r>
+        <w:rPr>
+          <w:rFonts w:ascii="Arial" w:hAnsi="Arial" w:cs="Arial"/>
+          <w:sz w:val="28"/>
+          <w:szCs w:val="28"/>
+        </w:rPr>
+        <w:t>Nếu vượt ngân sách</w:t>
+      </w:r>
+    </w:p>
+    <w:p>
+      <w:pPr>
+        <w:pStyle w:val="ListParagraph"/>
+        <w:numPr>
+          <w:ilvl w:val="4"/>
+          <w:numId w:val="15"/>
+        </w:numPr>
+        <w:rPr>
+          <w:rFonts w:ascii="Arial" w:hAnsi="Arial" w:cs="Arial"/>
+          <w:sz w:val="28"/>
+          <w:szCs w:val="28"/>
+        </w:rPr>
+      </w:pPr>
+      <w:r>
+        <w:rPr>
+          <w:rFonts w:ascii="Arial" w:hAnsi="Arial" w:cs="Arial"/>
+          <w:sz w:val="28"/>
+          <w:szCs w:val="28"/>
+        </w:rPr>
+        <w:t>Đánh dấu ngân sách đã bị vượt</w:t>
+      </w:r>
+    </w:p>
+    <w:p>
+      <w:pPr>
+        <w:pStyle w:val="ListParagraph"/>
+        <w:numPr>
+          <w:ilvl w:val="4"/>
+          <w:numId w:val="15"/>
+        </w:numPr>
+        <w:rPr>
+          <w:rFonts w:ascii="Arial" w:hAnsi="Arial" w:cs="Arial"/>
+          <w:sz w:val="28"/>
+          <w:szCs w:val="28"/>
+        </w:rPr>
+      </w:pPr>
+      <w:r>
+        <w:rPr>
+          <w:rFonts w:ascii="Arial" w:hAnsi="Arial" w:cs="Arial"/>
+          <w:sz w:val="28"/>
+          <w:szCs w:val="28"/>
+        </w:rPr>
+        <w:t>Chuyển về số tiền âm tương ứng</w:t>
+      </w:r>
+    </w:p>
+    <w:p>
+      <w:pPr>
+        <w:pStyle w:val="ListParagraph"/>
+        <w:numPr>
+          <w:ilvl w:val="1"/>
+          <w:numId w:val="15"/>
+        </w:numPr>
+        <w:rPr>
+          <w:rFonts w:ascii="Arial" w:hAnsi="Arial" w:cs="Arial"/>
+          <w:sz w:val="28"/>
+          <w:szCs w:val="28"/>
+        </w:rPr>
+      </w:pPr>
+      <w:r>
+        <w:rPr>
+          <w:rFonts w:ascii="Arial" w:hAnsi="Arial" w:cs="Arial"/>
+          <w:sz w:val="28"/>
+          <w:szCs w:val="28"/>
+        </w:rPr>
+        <w:t>Lưu giao dịch</w:t>
+      </w:r>
+    </w:p>
+    <w:p>
+      <w:pPr>
+        <w:rPr>
+          <w:rFonts w:ascii="Arial" w:hAnsi="Arial" w:cs="Arial"/>
+          <w:sz w:val="28"/>
+          <w:szCs w:val="28"/>
+        </w:rPr>
+      </w:pPr>
     </w:p>
     <w:p>
       <w:pPr>
@@ -15351,32 +17646,224 @@
           <w:sz w:val="28"/>
           <w:szCs w:val="28"/>
         </w:rPr>
-        <w:t xml:space="preserve"> </w:t>
-      </w:r>
-      <w:r>
-        <w:rPr>
-          <w:rFonts w:ascii="Arial" w:hAnsi="Arial" w:cs="Arial"/>
-          <w:b/>
-          <w:bCs/>
-          <w:sz w:val="28"/>
-          <w:szCs w:val="28"/>
-        </w:rPr>
-        <w:t>Quy Trình Nghiệp Vụ Cho</w:t>
-      </w:r>
-      <w:r>
-        <w:rPr>
-          <w:rFonts w:ascii="Arial" w:hAnsi="Arial" w:cs="Arial"/>
-          <w:b/>
-          <w:bCs/>
-          <w:sz w:val="28"/>
-          <w:szCs w:val="28"/>
-        </w:rPr>
-        <w:t xml:space="preserve"> Quản Lý Chi Phí Cố Định</w:t>
-      </w:r>
-    </w:p>
-    <w:p>
-      <w:pPr>
-        <w:ind w:left="720"/>
+        <w:t xml:space="preserve"> Quy Trình Nghiệp Vụ Cho Quản Lý Chi Phí Cố Định</w:t>
+      </w:r>
+    </w:p>
+    <w:p>
+      <w:pPr>
+        <w:ind w:left="720"/>
+        <w:rPr>
+          <w:rFonts w:ascii="Arial" w:hAnsi="Arial" w:cs="Arial"/>
+          <w:b/>
+          <w:bCs/>
+          <w:sz w:val="28"/>
+          <w:szCs w:val="28"/>
+        </w:rPr>
+      </w:pPr>
+      <w:r>
+        <w:rPr>
+          <w:rFonts w:ascii="Arial" w:hAnsi="Arial" w:cs="Arial"/>
+          <w:b/>
+          <w:bCs/>
+          <w:sz w:val="28"/>
+          <w:szCs w:val="28"/>
+        </w:rPr>
+        <w:t>BP-RE-</w:t>
+      </w:r>
+      <w:r>
+        <w:rPr>
+          <w:rFonts w:ascii="Arial" w:hAnsi="Arial" w:cs="Arial"/>
+          <w:b/>
+          <w:bCs/>
+          <w:sz w:val="28"/>
+          <w:szCs w:val="28"/>
+        </w:rPr>
+        <w:t>1. Quy trình Thanh Toán Giao Dịch Định Kỳ</w:t>
+      </w:r>
+    </w:p>
+    <w:p>
+      <w:pPr>
+        <w:pStyle w:val="ListParagraph"/>
+        <w:numPr>
+          <w:ilvl w:val="0"/>
+          <w:numId w:val="15"/>
+        </w:numPr>
+        <w:rPr>
+          <w:rFonts w:ascii="Arial" w:hAnsi="Arial" w:cs="Arial"/>
+          <w:sz w:val="28"/>
+          <w:szCs w:val="28"/>
+        </w:rPr>
+      </w:pPr>
+      <w:r>
+        <w:rPr>
+          <w:rFonts w:ascii="Arial" w:hAnsi="Arial" w:cs="Arial"/>
+          <w:sz w:val="28"/>
+          <w:szCs w:val="28"/>
+        </w:rPr>
+        <w:t>Scheduler chạy</w:t>
+      </w:r>
+    </w:p>
+    <w:p>
+      <w:pPr>
+        <w:pStyle w:val="ListParagraph"/>
+        <w:numPr>
+          <w:ilvl w:val="0"/>
+          <w:numId w:val="15"/>
+        </w:numPr>
+        <w:rPr>
+          <w:rFonts w:ascii="Arial" w:hAnsi="Arial" w:cs="Arial"/>
+          <w:sz w:val="28"/>
+          <w:szCs w:val="28"/>
+        </w:rPr>
+      </w:pPr>
+      <w:r>
+        <w:rPr>
+          <w:rFonts w:ascii="Arial" w:hAnsi="Arial" w:cs="Arial"/>
+          <w:sz w:val="28"/>
+          <w:szCs w:val="28"/>
+        </w:rPr>
+        <w:t>Kiểm tra các giao dịch định kỳ đến hạn</w:t>
+      </w:r>
+    </w:p>
+    <w:p>
+      <w:pPr>
+        <w:pStyle w:val="ListParagraph"/>
+        <w:numPr>
+          <w:ilvl w:val="0"/>
+          <w:numId w:val="15"/>
+        </w:numPr>
+        <w:rPr>
+          <w:rFonts w:ascii="Arial" w:hAnsi="Arial" w:cs="Arial"/>
+          <w:sz w:val="28"/>
+          <w:szCs w:val="28"/>
+        </w:rPr>
+      </w:pPr>
+      <w:r>
+        <w:rPr>
+          <w:rFonts w:ascii="Arial" w:hAnsi="Arial" w:cs="Arial"/>
+          <w:sz w:val="28"/>
+          <w:szCs w:val="28"/>
+        </w:rPr>
+        <w:t>Kiểm tra xem đang tạm dừng hay đang hoạt động</w:t>
+      </w:r>
+    </w:p>
+    <w:p>
+      <w:pPr>
+        <w:pStyle w:val="ListParagraph"/>
+        <w:numPr>
+          <w:ilvl w:val="0"/>
+          <w:numId w:val="15"/>
+        </w:numPr>
+        <w:rPr>
+          <w:rFonts w:ascii="Arial" w:hAnsi="Arial" w:cs="Arial"/>
+          <w:sz w:val="28"/>
+          <w:szCs w:val="28"/>
+        </w:rPr>
+      </w:pPr>
+      <w:r>
+        <w:rPr>
+          <w:rFonts w:ascii="Arial" w:hAnsi="Arial" w:cs="Arial"/>
+          <w:sz w:val="28"/>
+          <w:szCs w:val="28"/>
+        </w:rPr>
+        <w:t>Kiểm tra xem giao dịch định kỳ này là tự động thanh toán hay thanh toán thủ công</w:t>
+      </w:r>
+    </w:p>
+    <w:p>
+      <w:pPr>
+        <w:pStyle w:val="ListParagraph"/>
+        <w:numPr>
+          <w:ilvl w:val="1"/>
+          <w:numId w:val="15"/>
+        </w:numPr>
+        <w:rPr>
+          <w:rFonts w:ascii="Arial" w:hAnsi="Arial" w:cs="Arial"/>
+          <w:sz w:val="28"/>
+          <w:szCs w:val="28"/>
+        </w:rPr>
+      </w:pPr>
+      <w:r>
+        <w:rPr>
+          <w:rFonts w:ascii="Arial" w:hAnsi="Arial" w:cs="Arial"/>
+          <w:sz w:val="28"/>
+          <w:szCs w:val="28"/>
+        </w:rPr>
+        <w:t>Nếu thanh toán thủ công, gửi thông báo đến hạn cần thanh toán</w:t>
+      </w:r>
+    </w:p>
+    <w:p>
+      <w:pPr>
+        <w:pStyle w:val="ListParagraph"/>
+        <w:numPr>
+          <w:ilvl w:val="1"/>
+          <w:numId w:val="15"/>
+        </w:numPr>
+        <w:rPr>
+          <w:rFonts w:ascii="Arial" w:hAnsi="Arial" w:cs="Arial"/>
+          <w:sz w:val="28"/>
+          <w:szCs w:val="28"/>
+        </w:rPr>
+      </w:pPr>
+      <w:r>
+        <w:rPr>
+          <w:rFonts w:ascii="Arial" w:hAnsi="Arial" w:cs="Arial"/>
+          <w:sz w:val="28"/>
+          <w:szCs w:val="28"/>
+        </w:rPr>
+        <w:t>Nếu thanh toán tự động</w:t>
+      </w:r>
+    </w:p>
+    <w:p>
+      <w:pPr>
+        <w:pStyle w:val="ListParagraph"/>
+        <w:numPr>
+          <w:ilvl w:val="2"/>
+          <w:numId w:val="15"/>
+        </w:numPr>
+        <w:rPr>
+          <w:rFonts w:ascii="Arial" w:hAnsi="Arial" w:cs="Arial"/>
+          <w:sz w:val="28"/>
+          <w:szCs w:val="28"/>
+        </w:rPr>
+      </w:pPr>
+      <w:r>
+        <w:rPr>
+          <w:rFonts w:ascii="Arial" w:hAnsi="Arial" w:cs="Arial"/>
+          <w:sz w:val="28"/>
+          <w:szCs w:val="28"/>
+        </w:rPr>
+        <w:t>Kiểm tra số dư của nguồn tiền được liên kết</w:t>
+      </w:r>
+    </w:p>
+    <w:p>
+      <w:pPr>
+        <w:pStyle w:val="ListParagraph"/>
+        <w:numPr>
+          <w:ilvl w:val="3"/>
+          <w:numId w:val="15"/>
+        </w:numPr>
+        <w:rPr>
+          <w:rFonts w:ascii="Arial" w:hAnsi="Arial" w:cs="Arial"/>
+          <w:sz w:val="28"/>
+          <w:szCs w:val="28"/>
+        </w:rPr>
+      </w:pPr>
+      <w:r>
+        <w:rPr>
+          <w:rFonts w:ascii="Arial" w:hAnsi="Arial" w:cs="Arial"/>
+          <w:sz w:val="28"/>
+          <w:szCs w:val="28"/>
+        </w:rPr>
+        <w:t>Nếu không đủ, hủy giao dịch tự động, chuyển về thủ công</w:t>
+      </w:r>
+    </w:p>
+    <w:p>
+      <w:pPr>
+        <w:pStyle w:val="ListParagraph"/>
+        <w:numPr>
+          <w:ilvl w:val="2"/>
+          <w:numId w:val="15"/>
+        </w:numPr>
         <w:rPr>
           <w:rFonts w:ascii="Arial" w:hAnsi="Arial" w:cs="Arial"/>
           <w:sz w:val="28"/>
@@ -15390,8 +17877,83 @@
           <w:szCs w:val="28"/>
         </w:rPr>
         <w:lastRenderedPageBreak/>
-        <w:t>BP-RE-</w:t>
-      </w:r>
+        <w:t>Khởi tạo giao dịch</w:t>
+      </w:r>
+    </w:p>
+    <w:p>
+      <w:pPr>
+        <w:pStyle w:val="ListParagraph"/>
+        <w:numPr>
+          <w:ilvl w:val="2"/>
+          <w:numId w:val="15"/>
+        </w:numPr>
+        <w:rPr>
+          <w:rFonts w:ascii="Arial" w:hAnsi="Arial" w:cs="Arial"/>
+          <w:sz w:val="28"/>
+          <w:szCs w:val="28"/>
+        </w:rPr>
+      </w:pPr>
+      <w:r>
+        <w:rPr>
+          <w:rFonts w:ascii="Arial" w:hAnsi="Arial" w:cs="Arial"/>
+          <w:sz w:val="28"/>
+          <w:szCs w:val="28"/>
+        </w:rPr>
+        <w:t>Cập nhật số dư của nguồn</w:t>
+      </w:r>
+    </w:p>
+    <w:p>
+      <w:pPr>
+        <w:pStyle w:val="ListParagraph"/>
+        <w:numPr>
+          <w:ilvl w:val="2"/>
+          <w:numId w:val="15"/>
+        </w:numPr>
+        <w:rPr>
+          <w:rFonts w:ascii="Arial" w:hAnsi="Arial" w:cs="Arial"/>
+          <w:sz w:val="28"/>
+          <w:szCs w:val="28"/>
+        </w:rPr>
+      </w:pPr>
+      <w:r>
+        <w:rPr>
+          <w:rFonts w:ascii="Arial" w:hAnsi="Arial" w:cs="Arial"/>
+          <w:sz w:val="28"/>
+          <w:szCs w:val="28"/>
+        </w:rPr>
+        <w:t>Cập nhật số dư của ngân sách (Nếu có liên kết)</w:t>
+      </w:r>
+    </w:p>
+    <w:p>
+      <w:pPr>
+        <w:pStyle w:val="ListParagraph"/>
+        <w:numPr>
+          <w:ilvl w:val="2"/>
+          <w:numId w:val="15"/>
+        </w:numPr>
+        <w:rPr>
+          <w:rFonts w:ascii="Arial" w:hAnsi="Arial" w:cs="Arial"/>
+          <w:sz w:val="28"/>
+          <w:szCs w:val="28"/>
+        </w:rPr>
+      </w:pPr>
+      <w:r>
+        <w:rPr>
+          <w:rFonts w:ascii="Arial" w:hAnsi="Arial" w:cs="Arial"/>
+          <w:sz w:val="28"/>
+          <w:szCs w:val="28"/>
+        </w:rPr>
+        <w:t>Lưu lịch sử cập nhật</w:t>
+      </w:r>
+    </w:p>
+    <w:p>
+      <w:pPr>
+        <w:rPr>
+          <w:rFonts w:ascii="Arial" w:hAnsi="Arial" w:cs="Arial"/>
+          <w:sz w:val="28"/>
+          <w:szCs w:val="28"/>
+        </w:rPr>
+      </w:pPr>
     </w:p>
     <w:p>
       <w:pPr>
@@ -15416,46 +17978,159 @@
           <w:sz w:val="28"/>
           <w:szCs w:val="28"/>
         </w:rPr>
-        <w:t xml:space="preserve"> </w:t>
-      </w:r>
-      <w:r>
-        <w:rPr>
-          <w:rFonts w:ascii="Arial" w:hAnsi="Arial" w:cs="Arial"/>
-          <w:b/>
-          <w:bCs/>
-          <w:sz w:val="28"/>
-          <w:szCs w:val="28"/>
-        </w:rPr>
-        <w:t>Quy Trình Nghiệp Vụ Cho</w:t>
-      </w:r>
-      <w:r>
-        <w:rPr>
-          <w:rFonts w:ascii="Arial" w:hAnsi="Arial" w:cs="Arial"/>
-          <w:b/>
-          <w:bCs/>
-          <w:sz w:val="28"/>
-          <w:szCs w:val="28"/>
-        </w:rPr>
-        <w:t xml:space="preserve"> Thống Kế Và Báo Cáo</w:t>
-      </w:r>
-    </w:p>
-    <w:p>
-      <w:pPr>
-        <w:ind w:left="720"/>
-        <w:rPr>
-          <w:rFonts w:ascii="Arial" w:hAnsi="Arial" w:cs="Arial"/>
-          <w:sz w:val="28"/>
-          <w:szCs w:val="28"/>
-        </w:rPr>
-      </w:pPr>
-      <w:r>
-        <w:rPr>
-          <w:rFonts w:ascii="Arial" w:hAnsi="Arial" w:cs="Arial"/>
+        <w:t xml:space="preserve"> Quy Trình Nghiệp Vụ Cho Thống Kế Và Báo Cáo</w:t>
+      </w:r>
+    </w:p>
+    <w:p>
+      <w:pPr>
+        <w:ind w:left="720"/>
+        <w:rPr>
+          <w:rFonts w:ascii="Arial" w:hAnsi="Arial" w:cs="Arial"/>
+          <w:b/>
+          <w:bCs/>
+          <w:sz w:val="28"/>
+          <w:szCs w:val="28"/>
+        </w:rPr>
+      </w:pPr>
+      <w:r>
+        <w:rPr>
+          <w:rFonts w:ascii="Arial" w:hAnsi="Arial" w:cs="Arial"/>
+          <w:b/>
+          <w:bCs/>
           <w:sz w:val="28"/>
           <w:szCs w:val="28"/>
         </w:rPr>
         <w:t>BP-SRP-</w:t>
       </w:r>
+      <w:r>
+        <w:rPr>
+          <w:rFonts w:ascii="Arial" w:hAnsi="Arial" w:cs="Arial"/>
+          <w:b/>
+          <w:bCs/>
+          <w:sz w:val="28"/>
+          <w:szCs w:val="28"/>
+        </w:rPr>
+        <w:t>1. Quy trình Xem Báo Cáo Thống kê</w:t>
+      </w:r>
+    </w:p>
+    <w:p>
+      <w:pPr>
+        <w:pStyle w:val="ListParagraph"/>
+        <w:numPr>
+          <w:ilvl w:val="0"/>
+          <w:numId w:val="15"/>
+        </w:numPr>
+        <w:rPr>
+          <w:rFonts w:ascii="Arial" w:hAnsi="Arial" w:cs="Arial"/>
+          <w:sz w:val="28"/>
+          <w:szCs w:val="28"/>
+        </w:rPr>
+      </w:pPr>
+      <w:r>
+        <w:rPr>
+          <w:rFonts w:ascii="Arial" w:hAnsi="Arial" w:cs="Arial"/>
+          <w:sz w:val="28"/>
+          <w:szCs w:val="28"/>
+        </w:rPr>
+        <w:t>Chọn khoảng thời gian</w:t>
+      </w:r>
+    </w:p>
+    <w:p>
+      <w:pPr>
+        <w:pStyle w:val="ListParagraph"/>
+        <w:numPr>
+          <w:ilvl w:val="0"/>
+          <w:numId w:val="15"/>
+        </w:numPr>
+        <w:rPr>
+          <w:rFonts w:ascii="Arial" w:hAnsi="Arial" w:cs="Arial"/>
+          <w:sz w:val="28"/>
+          <w:szCs w:val="28"/>
+        </w:rPr>
+      </w:pPr>
+      <w:r>
+        <w:rPr>
+          <w:rFonts w:ascii="Arial" w:hAnsi="Arial" w:cs="Arial"/>
+          <w:sz w:val="28"/>
+          <w:szCs w:val="28"/>
+        </w:rPr>
+        <w:t>Truy vấn dữ liệu</w:t>
+      </w:r>
+    </w:p>
+    <w:p>
+      <w:pPr>
+        <w:pStyle w:val="ListParagraph"/>
+        <w:numPr>
+          <w:ilvl w:val="0"/>
+          <w:numId w:val="15"/>
+        </w:numPr>
+        <w:rPr>
+          <w:rFonts w:ascii="Arial" w:hAnsi="Arial" w:cs="Arial"/>
+          <w:sz w:val="28"/>
+          <w:szCs w:val="28"/>
+        </w:rPr>
+      </w:pPr>
+      <w:r>
+        <w:rPr>
+          <w:rFonts w:ascii="Arial" w:hAnsi="Arial" w:cs="Arial"/>
+          <w:sz w:val="28"/>
+          <w:szCs w:val="28"/>
+        </w:rPr>
+        <w:t>Tính toán</w:t>
+      </w:r>
+    </w:p>
+    <w:p>
+      <w:pPr>
+        <w:pStyle w:val="ListParagraph"/>
+        <w:numPr>
+          <w:ilvl w:val="0"/>
+          <w:numId w:val="15"/>
+        </w:numPr>
+        <w:rPr>
+          <w:rFonts w:ascii="Arial" w:hAnsi="Arial" w:cs="Arial"/>
+          <w:sz w:val="28"/>
+          <w:szCs w:val="28"/>
+        </w:rPr>
+      </w:pPr>
+      <w:r>
+        <w:rPr>
+          <w:rFonts w:ascii="Arial" w:hAnsi="Arial" w:cs="Arial"/>
+          <w:sz w:val="28"/>
+          <w:szCs w:val="28"/>
+        </w:rPr>
+        <w:t>Group dữ liệu</w:t>
+      </w:r>
+    </w:p>
+    <w:p>
+      <w:pPr>
+        <w:pStyle w:val="ListParagraph"/>
+        <w:numPr>
+          <w:ilvl w:val="0"/>
+          <w:numId w:val="15"/>
+        </w:numPr>
+        <w:rPr>
+          <w:rFonts w:ascii="Arial" w:hAnsi="Arial" w:cs="Arial"/>
+          <w:sz w:val="28"/>
+          <w:szCs w:val="28"/>
+        </w:rPr>
+      </w:pPr>
+      <w:r>
+        <w:rPr>
+          <w:rFonts w:ascii="Arial" w:hAnsi="Arial" w:cs="Arial"/>
+          <w:sz w:val="28"/>
+          <w:szCs w:val="28"/>
+        </w:rPr>
+        <w:t>Render biểu đồ, thống kê</w:t>
+      </w:r>
+    </w:p>
+    <w:p>
+      <w:pPr>
+        <w:rPr>
+          <w:rFonts w:ascii="Arial" w:hAnsi="Arial" w:cs="Arial"/>
+          <w:sz w:val="28"/>
+          <w:szCs w:val="28"/>
+        </w:rPr>
+      </w:pPr>
     </w:p>
     <w:p>
       <w:pPr>
@@ -15480,56 +18155,334 @@
           <w:sz w:val="28"/>
           <w:szCs w:val="28"/>
         </w:rPr>
-        <w:t xml:space="preserve"> </w:t>
-      </w:r>
-      <w:r>
-        <w:rPr>
-          <w:rFonts w:ascii="Arial" w:hAnsi="Arial" w:cs="Arial"/>
-          <w:b/>
-          <w:bCs/>
-          <w:sz w:val="28"/>
-          <w:szCs w:val="28"/>
-        </w:rPr>
-        <w:t>Quy Trình Nghiệp Vụ Cho</w:t>
-      </w:r>
-      <w:r>
-        <w:rPr>
-          <w:rFonts w:ascii="Arial" w:hAnsi="Arial" w:cs="Arial"/>
-          <w:b/>
-          <w:bCs/>
-          <w:sz w:val="28"/>
-          <w:szCs w:val="28"/>
-        </w:rPr>
-        <w:t xml:space="preserve"> Sao Lưu Và Khôi Phục</w:t>
-      </w:r>
-    </w:p>
-    <w:p>
-      <w:pPr>
-        <w:ind w:left="720"/>
-        <w:rPr>
-          <w:rFonts w:ascii="Arial" w:hAnsi="Arial" w:cs="Arial"/>
-          <w:b/>
-          <w:bCs/>
-          <w:sz w:val="28"/>
-          <w:szCs w:val="28"/>
-        </w:rPr>
-      </w:pPr>
-      <w:r>
-        <w:rPr>
-          <w:rFonts w:ascii="Arial" w:hAnsi="Arial" w:cs="Arial"/>
-          <w:sz w:val="28"/>
-          <w:szCs w:val="28"/>
-        </w:rPr>
-        <w:t>BP-</w:t>
-      </w:r>
-      <w:r>
-        <w:rPr>
-          <w:rFonts w:ascii="Arial" w:hAnsi="Arial" w:cs="Arial"/>
-          <w:sz w:val="28"/>
-          <w:szCs w:val="28"/>
-        </w:rPr>
-        <w:t>BUR-</w:t>
-      </w:r>
+        <w:t xml:space="preserve"> Quy Trình Nghiệp Vụ Cho Sao Lưu Và Khôi Phục</w:t>
+      </w:r>
+    </w:p>
+    <w:p>
+      <w:pPr>
+        <w:ind w:left="720"/>
+        <w:rPr>
+          <w:rFonts w:ascii="Arial" w:hAnsi="Arial" w:cs="Arial"/>
+          <w:sz w:val="28"/>
+          <w:szCs w:val="28"/>
+        </w:rPr>
+      </w:pPr>
+      <w:r>
+        <w:rPr>
+          <w:rFonts w:ascii="Arial" w:hAnsi="Arial" w:cs="Arial"/>
+          <w:sz w:val="28"/>
+          <w:szCs w:val="28"/>
+        </w:rPr>
+        <w:t>BP-BUR-</w:t>
+      </w:r>
+      <w:r>
+        <w:rPr>
+          <w:rFonts w:ascii="Arial" w:hAnsi="Arial" w:cs="Arial"/>
+          <w:sz w:val="28"/>
+          <w:szCs w:val="28"/>
+        </w:rPr>
+        <w:t>1. Quy trình Sao Lưu Dữ Liệu Đối Với Local</w:t>
+      </w:r>
+    </w:p>
+    <w:p>
+      <w:pPr>
+        <w:pStyle w:val="ListParagraph"/>
+        <w:numPr>
+          <w:ilvl w:val="0"/>
+          <w:numId w:val="15"/>
+        </w:numPr>
+        <w:rPr>
+          <w:rFonts w:ascii="Arial" w:hAnsi="Arial" w:cs="Arial"/>
+          <w:sz w:val="28"/>
+          <w:szCs w:val="28"/>
+        </w:rPr>
+      </w:pPr>
+      <w:r>
+        <w:rPr>
+          <w:rFonts w:ascii="Arial" w:hAnsi="Arial" w:cs="Arial"/>
+          <w:sz w:val="28"/>
+          <w:szCs w:val="28"/>
+        </w:rPr>
+        <w:t>Chọn sao lưu dữ liệu</w:t>
+      </w:r>
+    </w:p>
+    <w:p>
+      <w:pPr>
+        <w:pStyle w:val="ListParagraph"/>
+        <w:numPr>
+          <w:ilvl w:val="0"/>
+          <w:numId w:val="15"/>
+        </w:numPr>
+        <w:rPr>
+          <w:rFonts w:ascii="Arial" w:hAnsi="Arial" w:cs="Arial"/>
+          <w:sz w:val="28"/>
+          <w:szCs w:val="28"/>
+        </w:rPr>
+      </w:pPr>
+      <w:r>
+        <w:rPr>
+          <w:rFonts w:ascii="Arial" w:hAnsi="Arial" w:cs="Arial"/>
+          <w:sz w:val="28"/>
+          <w:szCs w:val="28"/>
+        </w:rPr>
+        <w:t>Xác thực dữ liệu</w:t>
+      </w:r>
+    </w:p>
+    <w:p>
+      <w:pPr>
+        <w:pStyle w:val="ListParagraph"/>
+        <w:numPr>
+          <w:ilvl w:val="0"/>
+          <w:numId w:val="15"/>
+        </w:numPr>
+        <w:rPr>
+          <w:rFonts w:ascii="Arial" w:hAnsi="Arial" w:cs="Arial"/>
+          <w:sz w:val="28"/>
+          <w:szCs w:val="28"/>
+        </w:rPr>
+      </w:pPr>
+      <w:r>
+        <w:rPr>
+          <w:rFonts w:ascii="Arial" w:hAnsi="Arial" w:cs="Arial"/>
+          <w:sz w:val="28"/>
+          <w:szCs w:val="28"/>
+        </w:rPr>
+        <w:t>Đánh số phiên bản trong dữ liệu</w:t>
+      </w:r>
+    </w:p>
+    <w:p>
+      <w:pPr>
+        <w:pStyle w:val="ListParagraph"/>
+        <w:numPr>
+          <w:ilvl w:val="0"/>
+          <w:numId w:val="15"/>
+        </w:numPr>
+        <w:rPr>
+          <w:rFonts w:ascii="Arial" w:hAnsi="Arial" w:cs="Arial"/>
+          <w:sz w:val="28"/>
+          <w:szCs w:val="28"/>
+        </w:rPr>
+      </w:pPr>
+      <w:r>
+        <w:rPr>
+          <w:rFonts w:ascii="Arial" w:hAnsi="Arial" w:cs="Arial"/>
+          <w:sz w:val="28"/>
+          <w:szCs w:val="28"/>
+        </w:rPr>
+        <w:t>Xuất dữ liệu thành db/file</w:t>
+      </w:r>
+    </w:p>
+    <w:p>
+      <w:pPr>
+        <w:pStyle w:val="ListParagraph"/>
+        <w:numPr>
+          <w:ilvl w:val="0"/>
+          <w:numId w:val="15"/>
+        </w:numPr>
+        <w:rPr>
+          <w:rFonts w:ascii="Arial" w:hAnsi="Arial" w:cs="Arial"/>
+          <w:sz w:val="28"/>
+          <w:szCs w:val="28"/>
+        </w:rPr>
+      </w:pPr>
+      <w:r>
+        <w:rPr>
+          <w:rFonts w:ascii="Arial" w:hAnsi="Arial" w:cs="Arial"/>
+          <w:sz w:val="28"/>
+          <w:szCs w:val="28"/>
+        </w:rPr>
+        <w:t>Thông báo thành công</w:t>
+      </w:r>
+    </w:p>
+    <w:p>
+      <w:pPr>
+        <w:rPr>
+          <w:rFonts w:ascii="Arial" w:hAnsi="Arial" w:cs="Arial"/>
+          <w:sz w:val="28"/>
+          <w:szCs w:val="28"/>
+        </w:rPr>
+      </w:pPr>
+    </w:p>
+    <w:p>
+      <w:pPr>
+        <w:ind w:left="720"/>
+        <w:rPr>
+          <w:rFonts w:ascii="Arial" w:hAnsi="Arial" w:cs="Arial"/>
+          <w:sz w:val="28"/>
+          <w:szCs w:val="28"/>
+        </w:rPr>
+      </w:pPr>
+      <w:r>
+        <w:rPr>
+          <w:rFonts w:ascii="Arial" w:hAnsi="Arial" w:cs="Arial"/>
+          <w:sz w:val="28"/>
+          <w:szCs w:val="28"/>
+        </w:rPr>
+        <w:t>BP-BUR-2. Quy trình Khôi Phục Dữ Liệu</w:t>
+      </w:r>
+    </w:p>
+    <w:p>
+      <w:pPr>
+        <w:pStyle w:val="ListParagraph"/>
+        <w:numPr>
+          <w:ilvl w:val="0"/>
+          <w:numId w:val="15"/>
+        </w:numPr>
+        <w:rPr>
+          <w:rFonts w:ascii="Arial" w:hAnsi="Arial" w:cs="Arial"/>
+          <w:sz w:val="28"/>
+          <w:szCs w:val="28"/>
+        </w:rPr>
+      </w:pPr>
+      <w:r>
+        <w:rPr>
+          <w:rFonts w:ascii="Arial" w:hAnsi="Arial" w:cs="Arial"/>
+          <w:sz w:val="28"/>
+          <w:szCs w:val="28"/>
+        </w:rPr>
+        <w:t>Chọn file sao lưu</w:t>
+      </w:r>
+    </w:p>
+    <w:p>
+      <w:pPr>
+        <w:pStyle w:val="ListParagraph"/>
+        <w:numPr>
+          <w:ilvl w:val="0"/>
+          <w:numId w:val="15"/>
+        </w:numPr>
+        <w:rPr>
+          <w:rFonts w:ascii="Arial" w:hAnsi="Arial" w:cs="Arial"/>
+          <w:sz w:val="28"/>
+          <w:szCs w:val="28"/>
+        </w:rPr>
+      </w:pPr>
+      <w:r>
+        <w:rPr>
+          <w:rFonts w:ascii="Arial" w:hAnsi="Arial" w:cs="Arial"/>
+          <w:sz w:val="28"/>
+          <w:szCs w:val="28"/>
+        </w:rPr>
+        <w:t>Xác thực định dạng</w:t>
+      </w:r>
+    </w:p>
+    <w:p>
+      <w:pPr>
+        <w:pStyle w:val="ListParagraph"/>
+        <w:numPr>
+          <w:ilvl w:val="0"/>
+          <w:numId w:val="15"/>
+        </w:numPr>
+        <w:rPr>
+          <w:rFonts w:ascii="Arial" w:hAnsi="Arial" w:cs="Arial"/>
+          <w:sz w:val="28"/>
+          <w:szCs w:val="28"/>
+        </w:rPr>
+      </w:pPr>
+      <w:r>
+        <w:rPr>
+          <w:rFonts w:ascii="Arial" w:hAnsi="Arial" w:cs="Arial"/>
+          <w:sz w:val="28"/>
+          <w:szCs w:val="28"/>
+        </w:rPr>
+        <w:t>Kiểm tra phiên bản, không các quá 1 phiên bản lớn (Ví dụ 1.x và 2.x)</w:t>
+      </w:r>
+    </w:p>
+    <w:p>
+      <w:pPr>
+        <w:pStyle w:val="ListParagraph"/>
+        <w:numPr>
+          <w:ilvl w:val="0"/>
+          <w:numId w:val="15"/>
+        </w:numPr>
+        <w:rPr>
+          <w:rFonts w:ascii="Arial" w:hAnsi="Arial" w:cs="Arial"/>
+          <w:sz w:val="28"/>
+          <w:szCs w:val="28"/>
+        </w:rPr>
+      </w:pPr>
+      <w:r>
+        <w:rPr>
+          <w:rFonts w:ascii="Arial" w:hAnsi="Arial" w:cs="Arial"/>
+          <w:sz w:val="28"/>
+          <w:szCs w:val="28"/>
+        </w:rPr>
+        <w:t>Xác nhận ghi đè</w:t>
+      </w:r>
+    </w:p>
+    <w:p>
+      <w:pPr>
+        <w:pStyle w:val="ListParagraph"/>
+        <w:numPr>
+          <w:ilvl w:val="0"/>
+          <w:numId w:val="15"/>
+        </w:numPr>
+        <w:rPr>
+          <w:rFonts w:ascii="Arial" w:hAnsi="Arial" w:cs="Arial"/>
+          <w:sz w:val="28"/>
+          <w:szCs w:val="28"/>
+        </w:rPr>
+      </w:pPr>
+      <w:r>
+        <w:rPr>
+          <w:rFonts w:ascii="Arial" w:hAnsi="Arial" w:cs="Arial"/>
+          <w:sz w:val="28"/>
+          <w:szCs w:val="28"/>
+        </w:rPr>
+        <w:t>Khôi phục dữ liệu</w:t>
+      </w:r>
+    </w:p>
+    <w:p>
+      <w:pPr>
+        <w:pStyle w:val="ListParagraph"/>
+        <w:numPr>
+          <w:ilvl w:val="0"/>
+          <w:numId w:val="15"/>
+        </w:numPr>
+        <w:rPr>
+          <w:rFonts w:ascii="Arial" w:hAnsi="Arial" w:cs="Arial"/>
+          <w:sz w:val="28"/>
+          <w:szCs w:val="28"/>
+        </w:rPr>
+      </w:pPr>
+      <w:r>
+        <w:rPr>
+          <w:rFonts w:ascii="Arial" w:hAnsi="Arial" w:cs="Arial"/>
+          <w:sz w:val="28"/>
+          <w:szCs w:val="28"/>
+        </w:rPr>
+        <w:t>Tải lại chương trình</w:t>
+      </w:r>
+    </w:p>
+    <w:p>
+      <w:pPr>
+        <w:pStyle w:val="ListParagraph"/>
+        <w:numPr>
+          <w:ilvl w:val="0"/>
+          <w:numId w:val="15"/>
+        </w:numPr>
+        <w:rPr>
+          <w:rFonts w:ascii="Arial" w:hAnsi="Arial" w:cs="Arial"/>
+          <w:sz w:val="28"/>
+          <w:szCs w:val="28"/>
+        </w:rPr>
+      </w:pPr>
+      <w:r>
+        <w:rPr>
+          <w:rFonts w:ascii="Arial" w:hAnsi="Arial" w:cs="Arial"/>
+          <w:sz w:val="28"/>
+          <w:szCs w:val="28"/>
+        </w:rPr>
+        <w:t>Thông báo hoàn tất</w:t>
+      </w:r>
+    </w:p>
+    <w:p>
+      <w:pPr>
+        <w:rPr>
+          <w:rFonts w:ascii="Arial" w:hAnsi="Arial" w:cs="Arial"/>
+          <w:sz w:val="28"/>
+          <w:szCs w:val="28"/>
+        </w:rPr>
+      </w:pPr>
     </w:p>
     <w:p>
       <w:pPr>
@@ -15554,17 +18507,7 @@
           <w:sz w:val="28"/>
           <w:szCs w:val="28"/>
         </w:rPr>
-        <w:t xml:space="preserve"> </w:t>
-      </w:r>
-      <w:r>
-        <w:rPr>
-          <w:rFonts w:ascii="Arial" w:hAnsi="Arial" w:cs="Arial"/>
-          <w:b/>
-          <w:bCs/>
-          <w:sz w:val="28"/>
-          <w:szCs w:val="28"/>
-        </w:rPr>
-        <w:t>Quy Trình Nghiệp Vụ Cho</w:t>
+        <w:t xml:space="preserve"> Quy Trình Nghiệp Vụ Cho</w:t>
       </w:r>
       <w:r>
         <w:rPr>
@@ -15579,6 +18522,199 @@
     </w:p>
     <w:p>
       <w:pPr>
+        <w:ind w:left="720"/>
+        <w:rPr>
+          <w:rFonts w:ascii="Arial" w:hAnsi="Arial" w:cs="Arial"/>
+          <w:b/>
+          <w:bCs/>
+          <w:sz w:val="28"/>
+          <w:szCs w:val="28"/>
+        </w:rPr>
+      </w:pPr>
+      <w:r>
+        <w:rPr>
+          <w:rFonts w:ascii="Arial" w:hAnsi="Arial" w:cs="Arial"/>
+          <w:b/>
+          <w:bCs/>
+          <w:sz w:val="28"/>
+          <w:szCs w:val="28"/>
+        </w:rPr>
+        <w:t>BP-</w:t>
+      </w:r>
+      <w:r>
+        <w:rPr>
+          <w:rFonts w:ascii="Arial" w:hAnsi="Arial" w:cs="Arial"/>
+          <w:b/>
+          <w:bCs/>
+          <w:sz w:val="28"/>
+          <w:szCs w:val="28"/>
+        </w:rPr>
+        <w:t>SD</w:t>
+      </w:r>
+      <w:r>
+        <w:rPr>
+          <w:rFonts w:ascii="Arial" w:hAnsi="Arial" w:cs="Arial"/>
+          <w:b/>
+          <w:bCs/>
+          <w:sz w:val="28"/>
+          <w:szCs w:val="28"/>
+        </w:rPr>
+        <w:t xml:space="preserve">-1. Quy trình </w:t>
+      </w:r>
+      <w:r>
+        <w:rPr>
+          <w:rFonts w:ascii="Arial" w:hAnsi="Arial" w:cs="Arial"/>
+          <w:b/>
+          <w:bCs/>
+          <w:sz w:val="28"/>
+          <w:szCs w:val="28"/>
+        </w:rPr>
+        <w:t>Xóa Mềm Một Giao Dịch</w:t>
+      </w:r>
+    </w:p>
+    <w:p>
+      <w:pPr>
+        <w:pStyle w:val="ListParagraph"/>
+        <w:numPr>
+          <w:ilvl w:val="0"/>
+          <w:numId w:val="15"/>
+        </w:numPr>
+        <w:rPr>
+          <w:rFonts w:ascii="Arial" w:hAnsi="Arial" w:cs="Arial"/>
+          <w:sz w:val="28"/>
+          <w:szCs w:val="28"/>
+        </w:rPr>
+      </w:pPr>
+      <w:r>
+        <w:rPr>
+          <w:rFonts w:ascii="Arial" w:hAnsi="Arial" w:cs="Arial"/>
+          <w:sz w:val="28"/>
+          <w:szCs w:val="28"/>
+        </w:rPr>
+        <w:t>Người dùng xóa một giao dịch bất kỳ</w:t>
+      </w:r>
+    </w:p>
+    <w:p>
+      <w:pPr>
+        <w:pStyle w:val="ListParagraph"/>
+        <w:numPr>
+          <w:ilvl w:val="0"/>
+          <w:numId w:val="15"/>
+        </w:numPr>
+        <w:rPr>
+          <w:rFonts w:ascii="Arial" w:hAnsi="Arial" w:cs="Arial"/>
+          <w:sz w:val="28"/>
+          <w:szCs w:val="28"/>
+        </w:rPr>
+      </w:pPr>
+      <w:r>
+        <w:rPr>
+          <w:rFonts w:ascii="Arial" w:hAnsi="Arial" w:cs="Arial"/>
+          <w:sz w:val="28"/>
+          <w:szCs w:val="28"/>
+        </w:rPr>
+        <w:t>Chuyển delete = true</w:t>
+      </w:r>
+    </w:p>
+    <w:p>
+      <w:pPr>
+        <w:pStyle w:val="ListParagraph"/>
+        <w:numPr>
+          <w:ilvl w:val="0"/>
+          <w:numId w:val="15"/>
+        </w:numPr>
+        <w:rPr>
+          <w:rFonts w:ascii="Arial" w:hAnsi="Arial" w:cs="Arial"/>
+          <w:sz w:val="28"/>
+          <w:szCs w:val="28"/>
+        </w:rPr>
+      </w:pPr>
+      <w:r>
+        <w:rPr>
+          <w:rFonts w:ascii="Arial" w:hAnsi="Arial" w:cs="Arial"/>
+          <w:sz w:val="28"/>
+          <w:szCs w:val="28"/>
+        </w:rPr>
+        <w:t>Cập nhật số dư của nguồn tiền</w:t>
+      </w:r>
+    </w:p>
+    <w:p>
+      <w:pPr>
+        <w:pStyle w:val="ListParagraph"/>
+        <w:numPr>
+          <w:ilvl w:val="0"/>
+          <w:numId w:val="15"/>
+        </w:numPr>
+        <w:rPr>
+          <w:rFonts w:ascii="Arial" w:hAnsi="Arial" w:cs="Arial"/>
+          <w:sz w:val="28"/>
+          <w:szCs w:val="28"/>
+        </w:rPr>
+      </w:pPr>
+      <w:r>
+        <w:rPr>
+          <w:rFonts w:ascii="Arial" w:hAnsi="Arial" w:cs="Arial"/>
+          <w:sz w:val="28"/>
+          <w:szCs w:val="28"/>
+        </w:rPr>
+        <w:t>Cập nhật số dư của ngân sách</w:t>
+      </w:r>
+    </w:p>
+    <w:p>
+      <w:pPr>
+        <w:pStyle w:val="ListParagraph"/>
+        <w:numPr>
+          <w:ilvl w:val="0"/>
+          <w:numId w:val="15"/>
+        </w:numPr>
+        <w:rPr>
+          <w:rFonts w:ascii="Arial" w:hAnsi="Arial" w:cs="Arial"/>
+          <w:sz w:val="28"/>
+          <w:szCs w:val="28"/>
+        </w:rPr>
+      </w:pPr>
+      <w:r>
+        <w:rPr>
+          <w:rFonts w:ascii="Arial" w:hAnsi="Arial" w:cs="Arial"/>
+          <w:sz w:val="28"/>
+          <w:szCs w:val="28"/>
+        </w:rPr>
+        <w:t>Chuyển đến recycle bin</w:t>
+      </w:r>
+    </w:p>
+    <w:p>
+      <w:pPr>
+        <w:pStyle w:val="ListParagraph"/>
+        <w:numPr>
+          <w:ilvl w:val="0"/>
+          <w:numId w:val="15"/>
+        </w:numPr>
+        <w:rPr>
+          <w:rFonts w:ascii="Arial" w:hAnsi="Arial" w:cs="Arial"/>
+          <w:sz w:val="28"/>
+          <w:szCs w:val="28"/>
+        </w:rPr>
+      </w:pPr>
+      <w:r>
+        <w:rPr>
+          <w:rFonts w:ascii="Arial" w:hAnsi="Arial" w:cs="Arial"/>
+          <w:sz w:val="28"/>
+          <w:szCs w:val="28"/>
+        </w:rPr>
+        <w:t>Gán thời hạn khôi phục là 30 ngày</w:t>
+      </w:r>
+    </w:p>
+    <w:p>
+      <w:pPr>
+        <w:rPr>
+          <w:rFonts w:ascii="Arial" w:hAnsi="Arial" w:cs="Arial"/>
+          <w:sz w:val="28"/>
+          <w:szCs w:val="28"/>
+        </w:rPr>
+      </w:pPr>
+    </w:p>
+    <w:p>
+      <w:pPr>
         <w:ind w:firstLine="720"/>
         <w:rPr>
           <w:rFonts w:ascii="Arial" w:hAnsi="Arial" w:cs="Arial"/>
@@ -15591,19 +18727,154 @@
       <w:r>
         <w:rPr>
           <w:rFonts w:ascii="Arial" w:hAnsi="Arial" w:cs="Arial"/>
-          <w:sz w:val="28"/>
-          <w:szCs w:val="28"/>
-        </w:rPr>
-        <w:t>BP-S</w:t>
-      </w:r>
-      <w:r>
-        <w:rPr>
-          <w:rFonts w:ascii="Arial" w:hAnsi="Arial" w:cs="Arial"/>
-          <w:sz w:val="28"/>
-          <w:szCs w:val="28"/>
-        </w:rPr>
-        <w:t>D-</w:t>
-      </w:r>
+          <w:b/>
+          <w:bCs/>
+          <w:sz w:val="28"/>
+          <w:szCs w:val="28"/>
+        </w:rPr>
+        <w:t>BP-SD-2. Quy trình Khôi Phục Một Giao Dịch</w:t>
+      </w:r>
+    </w:p>
+    <w:p>
+      <w:pPr>
+        <w:pStyle w:val="ListParagraph"/>
+        <w:numPr>
+          <w:ilvl w:val="0"/>
+          <w:numId w:val="15"/>
+        </w:numPr>
+        <w:rPr>
+          <w:rFonts w:ascii="Arial" w:hAnsi="Arial" w:cs="Arial"/>
+          <w:sz w:val="28"/>
+          <w:szCs w:val="28"/>
+        </w:rPr>
+      </w:pPr>
+      <w:r>
+        <w:rPr>
+          <w:rFonts w:ascii="Arial" w:hAnsi="Arial" w:cs="Arial"/>
+          <w:sz w:val="28"/>
+          <w:szCs w:val="28"/>
+        </w:rPr>
+        <w:t>Khôi phục giao dịch</w:t>
+      </w:r>
+    </w:p>
+    <w:p>
+      <w:pPr>
+        <w:pStyle w:val="ListParagraph"/>
+        <w:numPr>
+          <w:ilvl w:val="0"/>
+          <w:numId w:val="15"/>
+        </w:numPr>
+        <w:rPr>
+          <w:rFonts w:ascii="Arial" w:hAnsi="Arial" w:cs="Arial"/>
+          <w:sz w:val="28"/>
+          <w:szCs w:val="28"/>
+        </w:rPr>
+      </w:pPr>
+      <w:r>
+        <w:rPr>
+          <w:rFonts w:ascii="Arial" w:hAnsi="Arial" w:cs="Arial"/>
+          <w:sz w:val="28"/>
+          <w:szCs w:val="28"/>
+        </w:rPr>
+        <w:t>Kiểm tra còn giao dịch trong hệ thống hay không (Sau 30 ngày bị xóa khỏi database)</w:t>
+      </w:r>
+    </w:p>
+    <w:p>
+      <w:pPr>
+        <w:pStyle w:val="ListParagraph"/>
+        <w:numPr>
+          <w:ilvl w:val="0"/>
+          <w:numId w:val="15"/>
+        </w:numPr>
+        <w:rPr>
+          <w:rFonts w:ascii="Arial" w:hAnsi="Arial" w:cs="Arial"/>
+          <w:sz w:val="28"/>
+          <w:szCs w:val="28"/>
+        </w:rPr>
+      </w:pPr>
+      <w:r>
+        <w:rPr>
+          <w:rFonts w:ascii="Arial" w:hAnsi="Arial" w:cs="Arial"/>
+          <w:sz w:val="28"/>
+          <w:szCs w:val="28"/>
+        </w:rPr>
+        <w:t>Cập nhật deleted = false</w:t>
+      </w:r>
+    </w:p>
+    <w:p>
+      <w:pPr>
+        <w:pStyle w:val="ListParagraph"/>
+        <w:numPr>
+          <w:ilvl w:val="0"/>
+          <w:numId w:val="15"/>
+        </w:numPr>
+        <w:rPr>
+          <w:rFonts w:ascii="Arial" w:hAnsi="Arial" w:cs="Arial"/>
+          <w:sz w:val="28"/>
+          <w:szCs w:val="28"/>
+        </w:rPr>
+      </w:pPr>
+      <w:r>
+        <w:rPr>
+          <w:rFonts w:ascii="Arial" w:hAnsi="Arial" w:cs="Arial"/>
+          <w:sz w:val="28"/>
+          <w:szCs w:val="28"/>
+        </w:rPr>
+        <w:t>Tính toán lại số dự nguồn tiền tương ứng</w:t>
+      </w:r>
+    </w:p>
+    <w:p>
+      <w:pPr>
+        <w:pStyle w:val="ListParagraph"/>
+        <w:numPr>
+          <w:ilvl w:val="0"/>
+          <w:numId w:val="15"/>
+        </w:numPr>
+        <w:rPr>
+          <w:rFonts w:ascii="Arial" w:hAnsi="Arial" w:cs="Arial"/>
+          <w:sz w:val="28"/>
+          <w:szCs w:val="28"/>
+        </w:rPr>
+      </w:pPr>
+      <w:r>
+        <w:rPr>
+          <w:rFonts w:ascii="Arial" w:hAnsi="Arial" w:cs="Arial"/>
+          <w:sz w:val="28"/>
+          <w:szCs w:val="28"/>
+        </w:rPr>
+        <w:t>Tính toán lại số dư ngân sách tương ứng (Nếu được liên kết)</w:t>
+      </w:r>
+    </w:p>
+    <w:p>
+      <w:pPr>
+        <w:pStyle w:val="ListParagraph"/>
+        <w:numPr>
+          <w:ilvl w:val="0"/>
+          <w:numId w:val="15"/>
+        </w:numPr>
+        <w:rPr>
+          <w:rFonts w:ascii="Arial" w:hAnsi="Arial" w:cs="Arial"/>
+          <w:sz w:val="28"/>
+          <w:szCs w:val="28"/>
+        </w:rPr>
+      </w:pPr>
+      <w:r>
+        <w:rPr>
+          <w:rFonts w:ascii="Arial" w:hAnsi="Arial" w:cs="Arial"/>
+          <w:sz w:val="28"/>
+          <w:szCs w:val="28"/>
+        </w:rPr>
+        <w:t>Khôi phục lịch sử giao dịch</w:t>
+      </w:r>
+    </w:p>
+    <w:p>
+      <w:pPr>
+        <w:rPr>
+          <w:rFonts w:ascii="Arial" w:hAnsi="Arial" w:cs="Arial"/>
+          <w:sz w:val="28"/>
+          <w:szCs w:val="28"/>
+        </w:rPr>
+      </w:pPr>
     </w:p>
     <w:p>
       <w:pPr>
@@ -15628,55 +18899,38 @@
           <w:sz w:val="28"/>
           <w:szCs w:val="28"/>
         </w:rPr>
-        <w:t xml:space="preserve"> </w:t>
-      </w:r>
-      <w:r>
-        <w:rPr>
-          <w:rFonts w:ascii="Arial" w:hAnsi="Arial" w:cs="Arial"/>
-          <w:b/>
-          <w:bCs/>
-          <w:sz w:val="28"/>
-          <w:szCs w:val="28"/>
-        </w:rPr>
-        <w:t>Quy Trình Nghiệp Vụ Cho</w:t>
-      </w:r>
-      <w:r>
-        <w:rPr>
-          <w:rFonts w:ascii="Arial" w:hAnsi="Arial" w:cs="Arial"/>
-          <w:b/>
-          <w:bCs/>
-          <w:sz w:val="28"/>
-          <w:szCs w:val="28"/>
-        </w:rPr>
-        <w:t xml:space="preserve"> Lịch Sử Giao Dịch</w:t>
-      </w:r>
-    </w:p>
-    <w:p>
-      <w:pPr>
-        <w:ind w:left="720"/>
-        <w:rPr>
-          <w:rFonts w:ascii="Arial" w:hAnsi="Arial" w:cs="Arial"/>
-          <w:b/>
-          <w:bCs/>
-          <w:sz w:val="28"/>
-          <w:szCs w:val="28"/>
-        </w:rPr>
-      </w:pPr>
-      <w:r>
-        <w:rPr>
-          <w:rFonts w:ascii="Arial" w:hAnsi="Arial" w:cs="Arial"/>
-          <w:sz w:val="28"/>
-          <w:szCs w:val="28"/>
-        </w:rPr>
-        <w:t>BP-</w:t>
-      </w:r>
-      <w:r>
-        <w:rPr>
-          <w:rFonts w:ascii="Arial" w:hAnsi="Arial" w:cs="Arial"/>
-          <w:sz w:val="28"/>
-          <w:szCs w:val="28"/>
-        </w:rPr>
-        <w:t>HIS-</w:t>
+        <w:t xml:space="preserve"> Quy Trình Nghiệp Vụ Cho Lịch Sử Giao Dịch</w:t>
+      </w:r>
+    </w:p>
+    <w:p>
+      <w:pPr>
+        <w:tabs>
+          <w:tab w:val="left" w:pos="2187"/>
+        </w:tabs>
+        <w:ind w:left="720"/>
+        <w:rPr>
+          <w:rFonts w:ascii="Arial" w:hAnsi="Arial" w:cs="Arial"/>
+          <w:b/>
+          <w:bCs/>
+          <w:sz w:val="28"/>
+          <w:szCs w:val="28"/>
+        </w:rPr>
+      </w:pPr>
+      <w:r>
+        <w:rPr>
+          <w:rFonts w:ascii="Arial" w:hAnsi="Arial" w:cs="Arial"/>
+          <w:sz w:val="28"/>
+          <w:szCs w:val="28"/>
+        </w:rPr>
+        <w:t>BP-HIS-</w:t>
+      </w:r>
+      <w:r>
+        <w:rPr>
+          <w:rFonts w:ascii="Arial" w:hAnsi="Arial" w:cs="Arial"/>
+          <w:sz w:val="28"/>
+          <w:szCs w:val="28"/>
+        </w:rPr>
+        <w:t xml:space="preserve">1. </w:t>
       </w:r>
     </w:p>
     <w:p>
@@ -16930,7 +20184,7 @@
         <w:rFonts w:ascii="Courier New" w:hAnsi="Courier New" w:cs="Courier New" w:hint="default"/>
       </w:rPr>
     </w:lvl>
-    <w:lvl w:ilvl="2" w:tplc="04090005" w:tentative="1">
+    <w:lvl w:ilvl="2" w:tplc="04090005">
       <w:start w:val="1"/>
       <w:numFmt w:val="bullet"/>
       <w:lvlText w:val=""/>
@@ -16942,7 +20196,7 @@
         <w:rFonts w:ascii="Wingdings" w:hAnsi="Wingdings" w:hint="default"/>
       </w:rPr>
     </w:lvl>
-    <w:lvl w:ilvl="3" w:tplc="04090001" w:tentative="1">
+    <w:lvl w:ilvl="3" w:tplc="04090001">
       <w:start w:val="1"/>
       <w:numFmt w:val="bullet"/>
       <w:lvlText w:val=""/>
@@ -16954,7 +20208,7 @@
         <w:rFonts w:ascii="Symbol" w:hAnsi="Symbol" w:hint="default"/>
       </w:rPr>
     </w:lvl>
-    <w:lvl w:ilvl="4" w:tplc="04090003" w:tentative="1">
+    <w:lvl w:ilvl="4" w:tplc="04090003">
       <w:start w:val="1"/>
       <w:numFmt w:val="bullet"/>
       <w:lvlText w:val="o"/>
@@ -18395,6 +21649,7 @@
   <w:style w:type="character" w:default="1" w:styleId="DefaultParagraphFont">
     <w:name w:val="Default Paragraph Font"/>
     <w:uiPriority w:val="1"/>
+    <w:semiHidden/>
     <w:unhideWhenUsed/>
   </w:style>
   <w:style w:type="table" w:default="1" w:styleId="TableNormal">

</xml_diff>

<commit_message>
Hoàn thàn h Use Case Diagram
</commit_message>
<xml_diff>
--- a/Document/Expense Tracker SRS.docx
+++ b/Document/Expense Tracker SRS.docx
@@ -14697,15 +14697,7 @@
           <w:sz w:val="28"/>
           <w:szCs w:val="28"/>
         </w:rPr>
-        <w:t>BR-WRE-</w:t>
-      </w:r>
-      <w:r>
-        <w:rPr>
-          <w:rFonts w:ascii="Arial" w:hAnsi="Arial" w:cs="Arial"/>
-          <w:sz w:val="28"/>
-          <w:szCs w:val="28"/>
-        </w:rPr>
-        <w:t>4. Mỗi ngưỡng cảnh báo chỉ được gửi một lần trong cùng một</w:t>
+        <w:t>BR-WRE-4. Mỗi ngưỡng cảnh báo chỉ được gửi một lần trong cùng một</w:t>
       </w:r>
       <w:r>
         <w:rPr>
@@ -14739,15 +14731,7 @@
           <w:sz w:val="28"/>
           <w:szCs w:val="28"/>
         </w:rPr>
-        <w:t>BR-WRE-</w:t>
-      </w:r>
-      <w:r>
-        <w:rPr>
-          <w:rFonts w:ascii="Arial" w:hAnsi="Arial" w:cs="Arial"/>
-          <w:sz w:val="28"/>
-          <w:szCs w:val="28"/>
-        </w:rPr>
-        <w:t>5. Hệ thống phải gửi nhắc nhở khi giao dịch đến kỳ hạn theo cấu hình của người dùng (Liên kết BR-RE-7, BR-RE-14)</w:t>
+        <w:t>BR-WRE-5. Hệ thống phải gửi nhắc nhở khi giao dịch đến kỳ hạn theo cấu hình của người dùng (Liên kết BR-RE-7, BR-RE-14)</w:t>
       </w:r>
       <w:r>
         <w:rPr>
@@ -14773,15 +14757,7 @@
           <w:sz w:val="28"/>
           <w:szCs w:val="28"/>
         </w:rPr>
-        <w:t>BR-WRE-</w:t>
-      </w:r>
-      <w:r>
-        <w:rPr>
-          <w:rFonts w:ascii="Arial" w:hAnsi="Arial" w:cs="Arial"/>
-          <w:sz w:val="28"/>
-          <w:szCs w:val="28"/>
-        </w:rPr>
-        <w:t>6. Thông báo nhắc nhở chứa các thành phần</w:t>
+        <w:t>BR-WRE-6. Thông báo nhắc nhở chứa các thành phần</w:t>
       </w:r>
     </w:p>
     <w:p>
@@ -14875,15 +14851,7 @@
           <w:sz w:val="28"/>
           <w:szCs w:val="28"/>
         </w:rPr>
-        <w:t>BR-WRE-</w:t>
-      </w:r>
-      <w:r>
-        <w:rPr>
-          <w:rFonts w:ascii="Arial" w:hAnsi="Arial" w:cs="Arial"/>
-          <w:sz w:val="28"/>
-          <w:szCs w:val="28"/>
-        </w:rPr>
-        <w:t>7. Nếu giao dịch định kỳ đã được thanh toán hoặc xử lý, hệ thống không được tiếp tục gửi nhắc nhở cho kỳ hiện tại</w:t>
+        <w:t>BR-WRE-7. Nếu giao dịch định kỳ đã được thanh toán hoặc xử lý, hệ thống không được tiếp tục gửi nhắc nhở cho kỳ hiện tại</w:t>
       </w:r>
     </w:p>
     <w:p>
@@ -14901,15 +14869,7 @@
           <w:sz w:val="28"/>
           <w:szCs w:val="28"/>
         </w:rPr>
-        <w:t>BR-WRE-</w:t>
-      </w:r>
-      <w:r>
-        <w:rPr>
-          <w:rFonts w:ascii="Arial" w:hAnsi="Arial" w:cs="Arial"/>
-          <w:sz w:val="28"/>
-          <w:szCs w:val="28"/>
-        </w:rPr>
-        <w:t>8. Hệ thống có thể gửi cảnh báo khi số dư nguồn tiền thấp hơn ngưỡng tối thiểu do người dùng cấu hình.</w:t>
+        <w:t>BR-WRE-8. Hệ thống có thể gửi cảnh báo khi số dư nguồn tiền thấp hơn ngưỡng tối thiểu do người dùng cấu hình.</w:t>
       </w:r>
     </w:p>
     <w:p>
@@ -14927,15 +14887,7 @@
           <w:sz w:val="28"/>
           <w:szCs w:val="28"/>
         </w:rPr>
-        <w:t>BR-WRE-</w:t>
-      </w:r>
-      <w:r>
-        <w:rPr>
-          <w:rFonts w:ascii="Arial" w:hAnsi="Arial" w:cs="Arial"/>
-          <w:sz w:val="28"/>
-          <w:szCs w:val="28"/>
-        </w:rPr>
-        <w:t>9. Người dùng được phép cấu hình thời điểm nhắc nhở trước hạn</w:t>
+        <w:t>BR-WRE-9. Người dùng được phép cấu hình thời điểm nhắc nhở trước hạn</w:t>
       </w:r>
     </w:p>
     <w:p>
@@ -14953,15 +14905,7 @@
           <w:sz w:val="28"/>
           <w:szCs w:val="28"/>
         </w:rPr>
-        <w:t>BR-WRE-</w:t>
-      </w:r>
-      <w:r>
-        <w:rPr>
-          <w:rFonts w:ascii="Arial" w:hAnsi="Arial" w:cs="Arial"/>
-          <w:sz w:val="28"/>
-          <w:szCs w:val="28"/>
-        </w:rPr>
-        <w:t>10. Hệ thống không được gửi cảnh báo và nhắc nhở khi</w:t>
+        <w:t>BR-WRE-10. Hệ thống không được gửi cảnh báo và nhắc nhở khi</w:t>
       </w:r>
     </w:p>
     <w:p>
@@ -15056,15 +15000,7 @@
           <w:sz w:val="28"/>
           <w:szCs w:val="28"/>
         </w:rPr>
-        <w:t>BR-WRE-</w:t>
-      </w:r>
-      <w:r>
-        <w:rPr>
-          <w:rFonts w:ascii="Arial" w:hAnsi="Arial" w:cs="Arial"/>
-          <w:sz w:val="28"/>
-          <w:szCs w:val="28"/>
-        </w:rPr>
-        <w:t>11. Người dùng chỉ được nhận cảnh báo và nhắc nhở thuộc về tài khoản của chính mình</w:t>
+        <w:t>BR-WRE-11. Người dùng chỉ được nhận cảnh báo và nhắc nhở thuộc về tài khoản của chính mình</w:t>
       </w:r>
     </w:p>
     <w:p>
@@ -15082,15 +15018,7 @@
           <w:sz w:val="28"/>
           <w:szCs w:val="28"/>
         </w:rPr>
-        <w:t>BR-WRE-</w:t>
-      </w:r>
-      <w:r>
-        <w:rPr>
-          <w:rFonts w:ascii="Arial" w:hAnsi="Arial" w:cs="Arial"/>
-          <w:sz w:val="28"/>
-          <w:szCs w:val="28"/>
-        </w:rPr>
-        <w:t>12. Thông báo phải được sắp xếp theo thời gian mới nhất mặc định</w:t>
+        <w:t>BR-WRE-12. Thông báo phải được sắp xếp theo thời gian mới nhất mặc định</w:t>
       </w:r>
     </w:p>
     <w:p>
@@ -15108,15 +15036,7 @@
           <w:sz w:val="28"/>
           <w:szCs w:val="28"/>
         </w:rPr>
-        <w:t>BR-WRE-</w:t>
-      </w:r>
-      <w:r>
-        <w:rPr>
-          <w:rFonts w:ascii="Arial" w:hAnsi="Arial" w:cs="Arial"/>
-          <w:sz w:val="28"/>
-          <w:szCs w:val="28"/>
-        </w:rPr>
-        <w:t>13. Hệ thống phải lưu trạng thái đã đọc hoặc chưa đọc của thông báo</w:t>
+        <w:t>BR-WRE-13. Hệ thống phải lưu trạng thái đã đọc hoặc chưa đọc của thông báo</w:t>
       </w:r>
     </w:p>
     <w:p>
@@ -15134,15 +15054,7 @@
           <w:sz w:val="28"/>
           <w:szCs w:val="28"/>
         </w:rPr>
-        <w:t>BR-WRE-</w:t>
-      </w:r>
-      <w:r>
-        <w:rPr>
-          <w:rFonts w:ascii="Arial" w:hAnsi="Arial" w:cs="Arial"/>
-          <w:sz w:val="28"/>
-          <w:szCs w:val="28"/>
-        </w:rPr>
-        <w:t>14. Người dùng được phép đánh dấu thông báo là đã đọc hoặc xóa khỏi danh sách hiển thị</w:t>
+        <w:t>BR-WRE-14. Người dùng được phép đánh dấu thông báo là đã đọc hoặc xóa khỏi danh sách hiển thị</w:t>
       </w:r>
     </w:p>
     <w:p>
@@ -15160,15 +15072,7 @@
           <w:sz w:val="28"/>
           <w:szCs w:val="28"/>
         </w:rPr>
-        <w:t>BR-WRE-</w:t>
-      </w:r>
-      <w:r>
-        <w:rPr>
-          <w:rFonts w:ascii="Arial" w:hAnsi="Arial" w:cs="Arial"/>
-          <w:sz w:val="28"/>
-          <w:szCs w:val="28"/>
-        </w:rPr>
-        <w:t>15. Thông báo đã bị xóa khỏi danh sách hiển thị không làm ảnh hưởng đến nghiệp vụ gốc</w:t>
+        <w:t>BR-WRE-15. Thông báo đã bị xóa khỏi danh sách hiển thị không làm ảnh hưởng đến nghiệp vụ gốc</w:t>
       </w:r>
     </w:p>
     <w:p>
@@ -15186,15 +15090,7 @@
           <w:sz w:val="28"/>
           <w:szCs w:val="28"/>
         </w:rPr>
-        <w:t>BR-WRE-</w:t>
-      </w:r>
-      <w:r>
-        <w:rPr>
-          <w:rFonts w:ascii="Arial" w:hAnsi="Arial" w:cs="Arial"/>
-          <w:sz w:val="28"/>
-          <w:szCs w:val="28"/>
-        </w:rPr>
-        <w:t>16. Khi hệ thống đang ngoại tuyến (offline), các nhắc nhở cục bộ vẫn phải được xử lý nếu dữ liệu đã tồn tại trên thiết bị</w:t>
+        <w:t>BR-WRE-16. Khi hệ thống đang ngoại tuyến (offline), các nhắc nhở cục bộ vẫn phải được xử lý nếu dữ liệu đã tồn tại trên thiết bị</w:t>
       </w:r>
     </w:p>
     <w:p>
@@ -15212,15 +15108,7 @@
           <w:sz w:val="28"/>
           <w:szCs w:val="28"/>
         </w:rPr>
-        <w:t>BR-WRE-</w:t>
-      </w:r>
-      <w:r>
-        <w:rPr>
-          <w:rFonts w:ascii="Arial" w:hAnsi="Arial" w:cs="Arial"/>
-          <w:sz w:val="28"/>
-          <w:szCs w:val="28"/>
-        </w:rPr>
-        <w:t>17. Nếu nhiều cảnh báo xảy ra cùng lúc, hệ thống phải nhóm hoặc sắp xếp cảnh báo để tránh trùng lặp và gây nhiễu cho người dùng</w:t>
+        <w:t>BR-WRE-17. Nếu nhiều cảnh báo xảy ra cùng lúc, hệ thống phải nhóm hoặc sắp xếp cảnh báo để tránh trùng lặp và gây nhiễu cho người dùng</w:t>
       </w:r>
     </w:p>
     <w:p>
@@ -15303,15 +15191,7 @@
           <w:sz w:val="28"/>
           <w:szCs w:val="28"/>
         </w:rPr>
-        <w:t>BR-DASH-</w:t>
-      </w:r>
-      <w:r>
-        <w:rPr>
-          <w:rFonts w:ascii="Arial" w:hAnsi="Arial" w:cs="Arial"/>
-          <w:sz w:val="28"/>
-          <w:szCs w:val="28"/>
-        </w:rPr>
-        <w:t>2. Người dùng chỉ được phép xem Dashboard thuộc tài khoản của mình</w:t>
+        <w:t>BR-DASH-2. Người dùng chỉ được phép xem Dashboard thuộc tài khoản của mình</w:t>
       </w:r>
     </w:p>
     <w:p>
@@ -15329,15 +15209,7 @@
           <w:sz w:val="28"/>
           <w:szCs w:val="28"/>
         </w:rPr>
-        <w:t>BR-DASH-</w:t>
-      </w:r>
-      <w:r>
-        <w:rPr>
-          <w:rFonts w:ascii="Arial" w:hAnsi="Arial" w:cs="Arial"/>
-          <w:sz w:val="28"/>
-          <w:szCs w:val="28"/>
-        </w:rPr>
-        <w:t>3. Dashboard phải hiển thị</w:t>
+        <w:t>BR-DASH-3. Dashboard phải hiển thị</w:t>
       </w:r>
     </w:p>
     <w:p>
@@ -15432,15 +15304,7 @@
           <w:sz w:val="28"/>
           <w:szCs w:val="28"/>
         </w:rPr>
-        <w:t>BR-DASH-</w:t>
-      </w:r>
-      <w:r>
-        <w:rPr>
-          <w:rFonts w:ascii="Arial" w:hAnsi="Arial" w:cs="Arial"/>
-          <w:sz w:val="28"/>
-          <w:szCs w:val="28"/>
-        </w:rPr>
-        <w:t>4. Dashboard cần cập nhật tương ứng khi</w:t>
+        <w:t>BR-DASH-4. Dashboard cần cập nhật tương ứng khi</w:t>
       </w:r>
     </w:p>
     <w:p>
@@ -15553,15 +15417,7 @@
           <w:sz w:val="28"/>
           <w:szCs w:val="28"/>
         </w:rPr>
-        <w:t>BR-DASH-</w:t>
-      </w:r>
-      <w:r>
-        <w:rPr>
-          <w:rFonts w:ascii="Arial" w:hAnsi="Arial" w:cs="Arial"/>
-          <w:sz w:val="28"/>
-          <w:szCs w:val="28"/>
-        </w:rPr>
-        <w:t>5. Các giao dịch đã bị xóa mềm không được hiển thị trên Dashboard mặc định</w:t>
+        <w:t>BR-DASH-5. Các giao dịch đã bị xóa mềm không được hiển thị trên Dashboard mặc định</w:t>
       </w:r>
     </w:p>
     <w:p>
@@ -15579,15 +15435,7 @@
           <w:sz w:val="28"/>
           <w:szCs w:val="28"/>
         </w:rPr>
-        <w:t>BR-DASH-</w:t>
-      </w:r>
-      <w:r>
-        <w:rPr>
-          <w:rFonts w:ascii="Arial" w:hAnsi="Arial" w:cs="Arial"/>
-          <w:sz w:val="28"/>
-          <w:szCs w:val="28"/>
-        </w:rPr>
-        <w:t xml:space="preserve">6. Giao dịch chuyển tiền nội bộ không được tính vào </w:t>
+        <w:t xml:space="preserve">BR-DASH-6. Giao dịch chuyển tiền nội bộ không được tính vào </w:t>
       </w:r>
     </w:p>
     <w:p>
@@ -15643,15 +15491,7 @@
           <w:sz w:val="28"/>
           <w:szCs w:val="28"/>
         </w:rPr>
-        <w:t>BR-DASH-</w:t>
-      </w:r>
-      <w:r>
-        <w:rPr>
-          <w:rFonts w:ascii="Arial" w:hAnsi="Arial" w:cs="Arial"/>
-          <w:sz w:val="28"/>
-          <w:szCs w:val="28"/>
-        </w:rPr>
-        <w:t>7. Số dư hiện tại trên Dashboard phải được tính toán theo</w:t>
+        <w:t>BR-DASH-7. Số dư hiện tại trên Dashboard phải được tính toán theo</w:t>
       </w:r>
     </w:p>
     <w:p>
@@ -15707,15 +15547,7 @@
           <w:sz w:val="28"/>
           <w:szCs w:val="28"/>
         </w:rPr>
-        <w:t>BR-DASH-</w:t>
-      </w:r>
-      <w:r>
-        <w:rPr>
-          <w:rFonts w:ascii="Arial" w:hAnsi="Arial" w:cs="Arial"/>
-          <w:sz w:val="28"/>
-          <w:szCs w:val="28"/>
-        </w:rPr>
-        <w:t>8. Danh sách giao dịch gần đây phải được sắp xếp theo thời gian giảm dần mặc định</w:t>
+        <w:t>BR-DASH-8. Danh sách giao dịch gần đây phải được sắp xếp theo thời gian giảm dần mặc định</w:t>
       </w:r>
     </w:p>
     <w:p>
@@ -15733,15 +15565,7 @@
           <w:sz w:val="28"/>
           <w:szCs w:val="28"/>
         </w:rPr>
-        <w:t>BR-DASH-</w:t>
-      </w:r>
-      <w:r>
-        <w:rPr>
-          <w:rFonts w:ascii="Arial" w:hAnsi="Arial" w:cs="Arial"/>
-          <w:sz w:val="28"/>
-          <w:szCs w:val="28"/>
-        </w:rPr>
-        <w:t>9. Dashboard chỉ hiển thị các giao dịch còn hoạt động và thuộc tài khoản hiện tại</w:t>
+        <w:t>BR-DASH-9. Dashboard chỉ hiển thị các giao dịch còn hoạt động và thuộc tài khoản hiện tại</w:t>
       </w:r>
     </w:p>
     <w:p>
@@ -15759,15 +15583,7 @@
           <w:sz w:val="28"/>
           <w:szCs w:val="28"/>
         </w:rPr>
-        <w:t>BR-DASH-</w:t>
-      </w:r>
-      <w:r>
-        <w:rPr>
-          <w:rFonts w:ascii="Arial" w:hAnsi="Arial" w:cs="Arial"/>
-          <w:sz w:val="28"/>
-          <w:szCs w:val="28"/>
-        </w:rPr>
-        <w:t>10. Dashboard phải hỗ trợ làm mới dữ liệu khi có thay đổi trong hệ thống</w:t>
+        <w:t>BR-DASH-10. Dashboard phải hỗ trợ làm mới dữ liệu khi có thay đổi trong hệ thống</w:t>
       </w:r>
     </w:p>
     <w:p>
@@ -15785,15 +15601,7 @@
           <w:sz w:val="28"/>
           <w:szCs w:val="28"/>
         </w:rPr>
-        <w:t>BR-DASH-</w:t>
-      </w:r>
-      <w:r>
-        <w:rPr>
-          <w:rFonts w:ascii="Arial" w:hAnsi="Arial" w:cs="Arial"/>
-          <w:sz w:val="28"/>
-          <w:szCs w:val="28"/>
-        </w:rPr>
-        <w:t>11. Dashboard phải hiển thị dữ liệu theo khoảng thời gian mặc định của hệ thống</w:t>
+        <w:t>BR-DASH-11. Dashboard phải hiển thị dữ liệu theo khoảng thời gian mặc định của hệ thống</w:t>
       </w:r>
     </w:p>
     <w:p>
@@ -15812,15 +15620,7 @@
           <w:szCs w:val="28"/>
         </w:rPr>
         <w:lastRenderedPageBreak/>
-        <w:t>BR-DASH-</w:t>
-      </w:r>
-      <w:r>
-        <w:rPr>
-          <w:rFonts w:ascii="Arial" w:hAnsi="Arial" w:cs="Arial"/>
-          <w:sz w:val="28"/>
-          <w:szCs w:val="28"/>
-        </w:rPr>
-        <w:t>12. Người dùng được phép thay đổi khoảng thời gian hiển thị dữ liệu Dashboard</w:t>
+        <w:t>BR-DASH-12. Người dùng được phép thay đổi khoảng thời gian hiển thị dữ liệu Dashboard</w:t>
       </w:r>
     </w:p>
     <w:p>
@@ -15838,15 +15638,7 @@
           <w:sz w:val="28"/>
           <w:szCs w:val="28"/>
         </w:rPr>
-        <w:t>BR-DASH-</w:t>
-      </w:r>
-      <w:r>
-        <w:rPr>
-          <w:rFonts w:ascii="Arial" w:hAnsi="Arial" w:cs="Arial"/>
-          <w:sz w:val="28"/>
-          <w:szCs w:val="28"/>
-        </w:rPr>
-        <w:t>13. Các widget hoặc thành phần trên Dashboard phải phản ánh dữ liệu thống kê mới nhất</w:t>
+        <w:t>BR-DASH-13. Các widget hoặc thành phần trên Dashboard phải phản ánh dữ liệu thống kê mới nhất</w:t>
       </w:r>
     </w:p>
     <w:p>
@@ -15864,15 +15656,7 @@
           <w:sz w:val="28"/>
           <w:szCs w:val="28"/>
         </w:rPr>
-        <w:t>BR-DASH-</w:t>
-      </w:r>
-      <w:r>
-        <w:rPr>
-          <w:rFonts w:ascii="Arial" w:hAnsi="Arial" w:cs="Arial"/>
-          <w:sz w:val="28"/>
-          <w:szCs w:val="28"/>
-        </w:rPr>
-        <w:t>14. Dashboard phải hiển thị trạng thái ngân sách hiện tại nếu người dùng có ngân sách đang hoạt động</w:t>
+        <w:t>BR-DASH-14. Dashboard phải hiển thị trạng thái ngân sách hiện tại nếu người dùng có ngân sách đang hoạt động</w:t>
       </w:r>
     </w:p>
     <w:p>
@@ -15890,15 +15674,7 @@
           <w:sz w:val="28"/>
           <w:szCs w:val="28"/>
         </w:rPr>
-        <w:t>BR-DASH-</w:t>
-      </w:r>
-      <w:r>
-        <w:rPr>
-          <w:rFonts w:ascii="Arial" w:hAnsi="Arial" w:cs="Arial"/>
-          <w:sz w:val="28"/>
-          <w:szCs w:val="28"/>
-        </w:rPr>
-        <w:t>15. Nếu không có dữ liệu tài chính, Dashboard phải hiển thị trạng thái mặc định thay vì lỗi hệ thống</w:t>
+        <w:t>BR-DASH-15. Nếu không có dữ liệu tài chính, Dashboard phải hiển thị trạng thái mặc định thay vì lỗi hệ thống</w:t>
       </w:r>
     </w:p>
     <w:p>
@@ -26165,10 +25941,10 @@
         </w:rPr>
         <w:lastRenderedPageBreak/>
         <w:drawing>
-          <wp:inline distT="0" distB="0" distL="0" distR="0" wp14:anchorId="0DC7C69B" wp14:editId="6D5FEB84">
-            <wp:extent cx="5884015" cy="3248025"/>
-            <wp:effectExtent l="0" t="0" r="2540" b="0"/>
-            <wp:docPr id="959840028" name="Picture 1"/>
+          <wp:inline distT="0" distB="0" distL="0" distR="0" wp14:anchorId="0B797FB7" wp14:editId="4BAC3F06">
+            <wp:extent cx="5943600" cy="3277235"/>
+            <wp:effectExtent l="0" t="0" r="0" b="0"/>
+            <wp:docPr id="1111341085" name="Picture 2"/>
             <wp:cNvGraphicFramePr>
               <a:graphicFrameLocks xmlns:a="http://schemas.openxmlformats.org/drawingml/2006/main" noChangeAspect="1"/>
             </wp:cNvGraphicFramePr>
@@ -26176,7 +25952,7 @@
               <a:graphicData uri="http://schemas.openxmlformats.org/drawingml/2006/picture">
                 <pic:pic xmlns:pic="http://schemas.openxmlformats.org/drawingml/2006/picture">
                   <pic:nvPicPr>
-                    <pic:cNvPr id="959840028" name="Picture 1"/>
+                    <pic:cNvPr id="1111341085" name="Picture 1111341085"/>
                     <pic:cNvPicPr/>
                   </pic:nvPicPr>
                   <pic:blipFill>
@@ -26194,7 +25970,7 @@
                   <pic:spPr>
                     <a:xfrm>
                       <a:off x="0" y="0"/>
-                      <a:ext cx="5884015" cy="3248025"/>
+                      <a:ext cx="5943600" cy="3277235"/>
                     </a:xfrm>
                     <a:prstGeom prst="rect">
                       <a:avLst/>
@@ -26209,6 +25985,17 @@
     </w:p>
     <w:p>
       <w:pPr>
+        <w:rPr>
+          <w:rFonts w:ascii="Arial" w:hAnsi="Arial" w:cs="Arial"/>
+          <w:b/>
+          <w:bCs/>
+          <w:sz w:val="28"/>
+          <w:szCs w:val="28"/>
+        </w:rPr>
+      </w:pPr>
+    </w:p>
+    <w:p>
+      <w:pPr>
         <w:pStyle w:val="ListParagraph"/>
         <w:numPr>
           <w:ilvl w:val="2"/>
@@ -26284,11 +26071,12 @@
           <w:sz w:val="28"/>
           <w:szCs w:val="28"/>
         </w:rPr>
+        <w:lastRenderedPageBreak/>
         <w:drawing>
-          <wp:inline distT="0" distB="0" distL="0" distR="0" wp14:anchorId="7BF037D5" wp14:editId="141B4BC8">
+          <wp:inline distT="0" distB="0" distL="0" distR="0" wp14:anchorId="5A7F138F" wp14:editId="2CB550B6">
             <wp:extent cx="4486275" cy="3962400"/>
             <wp:effectExtent l="0" t="0" r="9525" b="0"/>
-            <wp:docPr id="351800612" name="Picture 1"/>
+            <wp:docPr id="1043959348" name="Picture 3"/>
             <wp:cNvGraphicFramePr>
               <a:graphicFrameLocks xmlns:a="http://schemas.openxmlformats.org/drawingml/2006/main" noChangeAspect="1"/>
             </wp:cNvGraphicFramePr>
@@ -26296,7 +26084,7 @@
               <a:graphicData uri="http://schemas.openxmlformats.org/drawingml/2006/picture">
                 <pic:pic xmlns:pic="http://schemas.openxmlformats.org/drawingml/2006/picture">
                   <pic:nvPicPr>
-                    <pic:cNvPr id="351800612" name="Picture 351800612"/>
+                    <pic:cNvPr id="1043959348" name="Picture 1043959348"/>
                     <pic:cNvPicPr/>
                   </pic:nvPicPr>
                   <pic:blipFill>
@@ -26389,11 +26177,12 @@
           <w:sz w:val="28"/>
           <w:szCs w:val="28"/>
         </w:rPr>
+        <w:lastRenderedPageBreak/>
         <w:drawing>
-          <wp:inline distT="0" distB="0" distL="0" distR="0" wp14:anchorId="3AF6823B" wp14:editId="5314465B">
+          <wp:inline distT="0" distB="0" distL="0" distR="0" wp14:anchorId="714CFB0D" wp14:editId="2FD69482">
             <wp:extent cx="5943600" cy="3644900"/>
             <wp:effectExtent l="0" t="0" r="0" b="0"/>
-            <wp:docPr id="1135701967" name="Picture 2"/>
+            <wp:docPr id="1986776093" name="Picture 4"/>
             <wp:cNvGraphicFramePr>
               <a:graphicFrameLocks xmlns:a="http://schemas.openxmlformats.org/drawingml/2006/main" noChangeAspect="1"/>
             </wp:cNvGraphicFramePr>
@@ -26401,7 +26190,7 @@
               <a:graphicData uri="http://schemas.openxmlformats.org/drawingml/2006/picture">
                 <pic:pic xmlns:pic="http://schemas.openxmlformats.org/drawingml/2006/picture">
                   <pic:nvPicPr>
-                    <pic:cNvPr id="1135701967" name="Picture 1135701967"/>
+                    <pic:cNvPr id="1986776093" name="Picture 1986776093"/>
                     <pic:cNvPicPr/>
                   </pic:nvPicPr>
                   <pic:blipFill>
@@ -26496,10 +26285,10 @@
         </w:rPr>
         <w:lastRenderedPageBreak/>
         <w:drawing>
-          <wp:inline distT="0" distB="0" distL="0" distR="0" wp14:anchorId="3126BB23" wp14:editId="11C5BDA8">
+          <wp:inline distT="0" distB="0" distL="0" distR="0" wp14:anchorId="515F0F7E" wp14:editId="203BBDA0">
             <wp:extent cx="5724525" cy="4343400"/>
             <wp:effectExtent l="0" t="0" r="9525" b="0"/>
-            <wp:docPr id="448904886" name="Picture 3"/>
+            <wp:docPr id="327113655" name="Picture 5"/>
             <wp:cNvGraphicFramePr>
               <a:graphicFrameLocks xmlns:a="http://schemas.openxmlformats.org/drawingml/2006/main" noChangeAspect="1"/>
             </wp:cNvGraphicFramePr>
@@ -26507,7 +26296,7 @@
               <a:graphicData uri="http://schemas.openxmlformats.org/drawingml/2006/picture">
                 <pic:pic xmlns:pic="http://schemas.openxmlformats.org/drawingml/2006/picture">
                   <pic:nvPicPr>
-                    <pic:cNvPr id="448904886" name="Picture 448904886"/>
+                    <pic:cNvPr id="327113655" name="Picture 327113655"/>
                     <pic:cNvPicPr/>
                   </pic:nvPicPr>
                   <pic:blipFill>
@@ -26591,6 +26380,58 @@
           <w:szCs w:val="28"/>
         </w:rPr>
       </w:pPr>
+      <w:r>
+        <w:rPr>
+          <w:rFonts w:ascii="Arial" w:hAnsi="Arial" w:cs="Arial"/>
+          <w:b/>
+          <w:bCs/>
+          <w:noProof/>
+          <w:sz w:val="28"/>
+          <w:szCs w:val="28"/>
+        </w:rPr>
+        <w:lastRenderedPageBreak/>
+        <w:drawing>
+          <wp:inline distT="0" distB="0" distL="0" distR="0" wp14:anchorId="6CD362FB" wp14:editId="0B942D7C">
+            <wp:extent cx="5943600" cy="4195445"/>
+            <wp:effectExtent l="0" t="0" r="0" b="0"/>
+            <wp:docPr id="1388793729" name="Picture 6"/>
+            <wp:cNvGraphicFramePr>
+              <a:graphicFrameLocks xmlns:a="http://schemas.openxmlformats.org/drawingml/2006/main" noChangeAspect="1"/>
+            </wp:cNvGraphicFramePr>
+            <a:graphic xmlns:a="http://schemas.openxmlformats.org/drawingml/2006/main">
+              <a:graphicData uri="http://schemas.openxmlformats.org/drawingml/2006/picture">
+                <pic:pic xmlns:pic="http://schemas.openxmlformats.org/drawingml/2006/picture">
+                  <pic:nvPicPr>
+                    <pic:cNvPr id="1388793729" name="Picture 1388793729"/>
+                    <pic:cNvPicPr/>
+                  </pic:nvPicPr>
+                  <pic:blipFill>
+                    <a:blip r:embed="rId10">
+                      <a:extLst>
+                        <a:ext uri="{28A0092B-C50C-407E-A947-70E740481C1C}">
+                          <a14:useLocalDpi xmlns:a14="http://schemas.microsoft.com/office/drawing/2010/main" val="0"/>
+                        </a:ext>
+                      </a:extLst>
+                    </a:blip>
+                    <a:stretch>
+                      <a:fillRect/>
+                    </a:stretch>
+                  </pic:blipFill>
+                  <pic:spPr>
+                    <a:xfrm>
+                      <a:off x="0" y="0"/>
+                      <a:ext cx="5943600" cy="4195445"/>
+                    </a:xfrm>
+                    <a:prstGeom prst="rect">
+                      <a:avLst/>
+                    </a:prstGeom>
+                  </pic:spPr>
+                </pic:pic>
+              </a:graphicData>
+            </a:graphic>
+          </wp:inline>
+        </w:drawing>
+      </w:r>
     </w:p>
     <w:p>
       <w:pPr>
@@ -26625,6 +26466,873 @@
         </w:rPr>
         <w:t>UCDD-</w:t>
       </w:r>
+      <w:r>
+        <w:rPr>
+          <w:rFonts w:ascii="Arial" w:hAnsi="Arial" w:cs="Arial"/>
+          <w:b/>
+          <w:bCs/>
+          <w:sz w:val="28"/>
+          <w:szCs w:val="28"/>
+        </w:rPr>
+        <w:t>CATI.</w:t>
+      </w:r>
+    </w:p>
+    <w:p>
+      <w:pPr>
+        <w:ind w:firstLine="720"/>
+        <w:rPr>
+          <w:rFonts w:ascii="Arial" w:hAnsi="Arial" w:cs="Arial"/>
+          <w:b/>
+          <w:bCs/>
+          <w:sz w:val="28"/>
+          <w:szCs w:val="28"/>
+        </w:rPr>
+      </w:pPr>
+      <w:r>
+        <w:rPr>
+          <w:rFonts w:ascii="Arial" w:hAnsi="Arial" w:cs="Arial"/>
+          <w:b/>
+          <w:bCs/>
+          <w:noProof/>
+          <w:sz w:val="28"/>
+          <w:szCs w:val="28"/>
+        </w:rPr>
+        <w:lastRenderedPageBreak/>
+        <w:drawing>
+          <wp:inline distT="0" distB="0" distL="0" distR="0" wp14:anchorId="620390C4" wp14:editId="491601B2">
+            <wp:extent cx="5657850" cy="3867150"/>
+            <wp:effectExtent l="0" t="0" r="0" b="0"/>
+            <wp:docPr id="206400123" name="Picture 7"/>
+            <wp:cNvGraphicFramePr>
+              <a:graphicFrameLocks xmlns:a="http://schemas.openxmlformats.org/drawingml/2006/main" noChangeAspect="1"/>
+            </wp:cNvGraphicFramePr>
+            <a:graphic xmlns:a="http://schemas.openxmlformats.org/drawingml/2006/main">
+              <a:graphicData uri="http://schemas.openxmlformats.org/drawingml/2006/picture">
+                <pic:pic xmlns:pic="http://schemas.openxmlformats.org/drawingml/2006/picture">
+                  <pic:nvPicPr>
+                    <pic:cNvPr id="206400123" name="Picture 206400123"/>
+                    <pic:cNvPicPr/>
+                  </pic:nvPicPr>
+                  <pic:blipFill>
+                    <a:blip r:embed="rId11">
+                      <a:extLst>
+                        <a:ext uri="{28A0092B-C50C-407E-A947-70E740481C1C}">
+                          <a14:useLocalDpi xmlns:a14="http://schemas.microsoft.com/office/drawing/2010/main" val="0"/>
+                        </a:ext>
+                      </a:extLst>
+                    </a:blip>
+                    <a:stretch>
+                      <a:fillRect/>
+                    </a:stretch>
+                  </pic:blipFill>
+                  <pic:spPr>
+                    <a:xfrm>
+                      <a:off x="0" y="0"/>
+                      <a:ext cx="5657850" cy="3867150"/>
+                    </a:xfrm>
+                    <a:prstGeom prst="rect">
+                      <a:avLst/>
+                    </a:prstGeom>
+                  </pic:spPr>
+                </pic:pic>
+              </a:graphicData>
+            </a:graphic>
+          </wp:inline>
+        </w:drawing>
+      </w:r>
+    </w:p>
+    <w:p>
+      <w:pPr>
+        <w:ind w:firstLine="720"/>
+        <w:rPr>
+          <w:rFonts w:ascii="Arial" w:hAnsi="Arial" w:cs="Arial"/>
+          <w:b/>
+          <w:bCs/>
+          <w:sz w:val="28"/>
+          <w:szCs w:val="28"/>
+        </w:rPr>
+      </w:pPr>
+    </w:p>
+    <w:p>
+      <w:pPr>
+        <w:ind w:firstLine="720"/>
+        <w:rPr>
+          <w:rFonts w:ascii="Arial" w:hAnsi="Arial" w:cs="Arial"/>
+          <w:b/>
+          <w:bCs/>
+          <w:sz w:val="28"/>
+          <w:szCs w:val="28"/>
+        </w:rPr>
+      </w:pPr>
+      <w:r>
+        <w:rPr>
+          <w:rFonts w:ascii="Arial" w:hAnsi="Arial" w:cs="Arial"/>
+          <w:b/>
+          <w:bCs/>
+          <w:sz w:val="28"/>
+          <w:szCs w:val="28"/>
+        </w:rPr>
+        <w:t>UCDD-SM.</w:t>
+      </w:r>
+    </w:p>
+    <w:p>
+      <w:pPr>
+        <w:ind w:firstLine="720"/>
+        <w:rPr>
+          <w:rFonts w:ascii="Arial" w:hAnsi="Arial" w:cs="Arial"/>
+          <w:b/>
+          <w:bCs/>
+          <w:sz w:val="28"/>
+          <w:szCs w:val="28"/>
+        </w:rPr>
+      </w:pPr>
+      <w:r>
+        <w:rPr>
+          <w:rFonts w:ascii="Arial" w:hAnsi="Arial" w:cs="Arial"/>
+          <w:b/>
+          <w:bCs/>
+          <w:noProof/>
+          <w:sz w:val="28"/>
+          <w:szCs w:val="28"/>
+        </w:rPr>
+        <w:drawing>
+          <wp:inline distT="0" distB="0" distL="0" distR="0" wp14:anchorId="6DD0AA65" wp14:editId="736FA9FE">
+            <wp:extent cx="5943600" cy="2597150"/>
+            <wp:effectExtent l="0" t="0" r="0" b="0"/>
+            <wp:docPr id="1338697597" name="Picture 8"/>
+            <wp:cNvGraphicFramePr>
+              <a:graphicFrameLocks xmlns:a="http://schemas.openxmlformats.org/drawingml/2006/main" noChangeAspect="1"/>
+            </wp:cNvGraphicFramePr>
+            <a:graphic xmlns:a="http://schemas.openxmlformats.org/drawingml/2006/main">
+              <a:graphicData uri="http://schemas.openxmlformats.org/drawingml/2006/picture">
+                <pic:pic xmlns:pic="http://schemas.openxmlformats.org/drawingml/2006/picture">
+                  <pic:nvPicPr>
+                    <pic:cNvPr id="1338697597" name="Picture 1338697597"/>
+                    <pic:cNvPicPr/>
+                  </pic:nvPicPr>
+                  <pic:blipFill>
+                    <a:blip r:embed="rId12">
+                      <a:extLst>
+                        <a:ext uri="{28A0092B-C50C-407E-A947-70E740481C1C}">
+                          <a14:useLocalDpi xmlns:a14="http://schemas.microsoft.com/office/drawing/2010/main" val="0"/>
+                        </a:ext>
+                      </a:extLst>
+                    </a:blip>
+                    <a:stretch>
+                      <a:fillRect/>
+                    </a:stretch>
+                  </pic:blipFill>
+                  <pic:spPr>
+                    <a:xfrm>
+                      <a:off x="0" y="0"/>
+                      <a:ext cx="5943600" cy="2597150"/>
+                    </a:xfrm>
+                    <a:prstGeom prst="rect">
+                      <a:avLst/>
+                    </a:prstGeom>
+                  </pic:spPr>
+                </pic:pic>
+              </a:graphicData>
+            </a:graphic>
+          </wp:inline>
+        </w:drawing>
+      </w:r>
+    </w:p>
+    <w:p>
+      <w:pPr>
+        <w:ind w:firstLine="720"/>
+        <w:rPr>
+          <w:rFonts w:ascii="Arial" w:hAnsi="Arial" w:cs="Arial"/>
+          <w:b/>
+          <w:bCs/>
+          <w:sz w:val="28"/>
+          <w:szCs w:val="28"/>
+        </w:rPr>
+      </w:pPr>
+    </w:p>
+    <w:p>
+      <w:pPr>
+        <w:ind w:firstLine="720"/>
+        <w:rPr>
+          <w:rFonts w:ascii="Arial" w:hAnsi="Arial" w:cs="Arial"/>
+          <w:b/>
+          <w:bCs/>
+          <w:sz w:val="28"/>
+          <w:szCs w:val="28"/>
+        </w:rPr>
+      </w:pPr>
+      <w:r>
+        <w:rPr>
+          <w:rFonts w:ascii="Arial" w:hAnsi="Arial" w:cs="Arial"/>
+          <w:b/>
+          <w:bCs/>
+          <w:sz w:val="28"/>
+          <w:szCs w:val="28"/>
+        </w:rPr>
+        <w:t>UCDD-BUD.</w:t>
+      </w:r>
+    </w:p>
+    <w:p>
+      <w:pPr>
+        <w:ind w:firstLine="720"/>
+        <w:rPr>
+          <w:rFonts w:ascii="Arial" w:hAnsi="Arial" w:cs="Arial"/>
+          <w:b/>
+          <w:bCs/>
+          <w:sz w:val="28"/>
+          <w:szCs w:val="28"/>
+        </w:rPr>
+      </w:pPr>
+      <w:r>
+        <w:rPr>
+          <w:rFonts w:ascii="Arial" w:hAnsi="Arial" w:cs="Arial"/>
+          <w:b/>
+          <w:bCs/>
+          <w:noProof/>
+          <w:sz w:val="28"/>
+          <w:szCs w:val="28"/>
+        </w:rPr>
+        <w:lastRenderedPageBreak/>
+        <w:drawing>
+          <wp:inline distT="0" distB="0" distL="0" distR="0" wp14:anchorId="2DFF3603" wp14:editId="56E58DEB">
+            <wp:extent cx="5943600" cy="4083685"/>
+            <wp:effectExtent l="0" t="0" r="0" b="0"/>
+            <wp:docPr id="1939413058" name="Picture 9"/>
+            <wp:cNvGraphicFramePr>
+              <a:graphicFrameLocks xmlns:a="http://schemas.openxmlformats.org/drawingml/2006/main" noChangeAspect="1"/>
+            </wp:cNvGraphicFramePr>
+            <a:graphic xmlns:a="http://schemas.openxmlformats.org/drawingml/2006/main">
+              <a:graphicData uri="http://schemas.openxmlformats.org/drawingml/2006/picture">
+                <pic:pic xmlns:pic="http://schemas.openxmlformats.org/drawingml/2006/picture">
+                  <pic:nvPicPr>
+                    <pic:cNvPr id="1939413058" name="Picture 1939413058"/>
+                    <pic:cNvPicPr/>
+                  </pic:nvPicPr>
+                  <pic:blipFill>
+                    <a:blip r:embed="rId13">
+                      <a:extLst>
+                        <a:ext uri="{28A0092B-C50C-407E-A947-70E740481C1C}">
+                          <a14:useLocalDpi xmlns:a14="http://schemas.microsoft.com/office/drawing/2010/main" val="0"/>
+                        </a:ext>
+                      </a:extLst>
+                    </a:blip>
+                    <a:stretch>
+                      <a:fillRect/>
+                    </a:stretch>
+                  </pic:blipFill>
+                  <pic:spPr>
+                    <a:xfrm>
+                      <a:off x="0" y="0"/>
+                      <a:ext cx="5943600" cy="4083685"/>
+                    </a:xfrm>
+                    <a:prstGeom prst="rect">
+                      <a:avLst/>
+                    </a:prstGeom>
+                  </pic:spPr>
+                </pic:pic>
+              </a:graphicData>
+            </a:graphic>
+          </wp:inline>
+        </w:drawing>
+      </w:r>
+    </w:p>
+    <w:p>
+      <w:pPr>
+        <w:ind w:firstLine="720"/>
+        <w:rPr>
+          <w:rFonts w:ascii="Arial" w:hAnsi="Arial" w:cs="Arial"/>
+          <w:b/>
+          <w:bCs/>
+          <w:sz w:val="28"/>
+          <w:szCs w:val="28"/>
+        </w:rPr>
+      </w:pPr>
+    </w:p>
+    <w:p>
+      <w:pPr>
+        <w:ind w:firstLine="720"/>
+        <w:rPr>
+          <w:rFonts w:ascii="Arial" w:hAnsi="Arial" w:cs="Arial"/>
+          <w:b/>
+          <w:bCs/>
+          <w:sz w:val="28"/>
+          <w:szCs w:val="28"/>
+        </w:rPr>
+      </w:pPr>
+      <w:r>
+        <w:rPr>
+          <w:rFonts w:ascii="Arial" w:hAnsi="Arial" w:cs="Arial"/>
+          <w:b/>
+          <w:bCs/>
+          <w:sz w:val="28"/>
+          <w:szCs w:val="28"/>
+        </w:rPr>
+        <w:t>UCDD-TF.</w:t>
+      </w:r>
+    </w:p>
+    <w:p>
+      <w:pPr>
+        <w:ind w:firstLine="720"/>
+        <w:rPr>
+          <w:rFonts w:ascii="Arial" w:hAnsi="Arial" w:cs="Arial"/>
+          <w:b/>
+          <w:bCs/>
+          <w:sz w:val="28"/>
+          <w:szCs w:val="28"/>
+        </w:rPr>
+      </w:pPr>
+      <w:r>
+        <w:rPr>
+          <w:rFonts w:ascii="Arial" w:hAnsi="Arial" w:cs="Arial"/>
+          <w:b/>
+          <w:bCs/>
+          <w:noProof/>
+          <w:sz w:val="28"/>
+          <w:szCs w:val="28"/>
+        </w:rPr>
+        <w:lastRenderedPageBreak/>
+        <w:drawing>
+          <wp:inline distT="0" distB="0" distL="0" distR="0" wp14:anchorId="4CFAE7AC" wp14:editId="66C855FD">
+            <wp:extent cx="5943600" cy="3673475"/>
+            <wp:effectExtent l="0" t="0" r="0" b="3175"/>
+            <wp:docPr id="1173520843" name="Picture 10"/>
+            <wp:cNvGraphicFramePr>
+              <a:graphicFrameLocks xmlns:a="http://schemas.openxmlformats.org/drawingml/2006/main" noChangeAspect="1"/>
+            </wp:cNvGraphicFramePr>
+            <a:graphic xmlns:a="http://schemas.openxmlformats.org/drawingml/2006/main">
+              <a:graphicData uri="http://schemas.openxmlformats.org/drawingml/2006/picture">
+                <pic:pic xmlns:pic="http://schemas.openxmlformats.org/drawingml/2006/picture">
+                  <pic:nvPicPr>
+                    <pic:cNvPr id="1173520843" name="Picture 1173520843"/>
+                    <pic:cNvPicPr/>
+                  </pic:nvPicPr>
+                  <pic:blipFill>
+                    <a:blip r:embed="rId14">
+                      <a:extLst>
+                        <a:ext uri="{28A0092B-C50C-407E-A947-70E740481C1C}">
+                          <a14:useLocalDpi xmlns:a14="http://schemas.microsoft.com/office/drawing/2010/main" val="0"/>
+                        </a:ext>
+                      </a:extLst>
+                    </a:blip>
+                    <a:stretch>
+                      <a:fillRect/>
+                    </a:stretch>
+                  </pic:blipFill>
+                  <pic:spPr>
+                    <a:xfrm>
+                      <a:off x="0" y="0"/>
+                      <a:ext cx="5943600" cy="3673475"/>
+                    </a:xfrm>
+                    <a:prstGeom prst="rect">
+                      <a:avLst/>
+                    </a:prstGeom>
+                  </pic:spPr>
+                </pic:pic>
+              </a:graphicData>
+            </a:graphic>
+          </wp:inline>
+        </w:drawing>
+      </w:r>
+    </w:p>
+    <w:p>
+      <w:pPr>
+        <w:ind w:firstLine="720"/>
+        <w:rPr>
+          <w:rFonts w:ascii="Arial" w:hAnsi="Arial" w:cs="Arial"/>
+          <w:b/>
+          <w:bCs/>
+          <w:sz w:val="28"/>
+          <w:szCs w:val="28"/>
+        </w:rPr>
+      </w:pPr>
+    </w:p>
+    <w:p>
+      <w:pPr>
+        <w:ind w:firstLine="720"/>
+        <w:rPr>
+          <w:rFonts w:ascii="Arial" w:hAnsi="Arial" w:cs="Arial"/>
+          <w:b/>
+          <w:bCs/>
+          <w:sz w:val="28"/>
+          <w:szCs w:val="28"/>
+        </w:rPr>
+      </w:pPr>
+      <w:r>
+        <w:rPr>
+          <w:rFonts w:ascii="Arial" w:hAnsi="Arial" w:cs="Arial"/>
+          <w:b/>
+          <w:bCs/>
+          <w:sz w:val="28"/>
+          <w:szCs w:val="28"/>
+        </w:rPr>
+        <w:t>UCDD-RE.</w:t>
+      </w:r>
+    </w:p>
+    <w:p>
+      <w:pPr>
+        <w:ind w:firstLine="720"/>
+        <w:rPr>
+          <w:rFonts w:ascii="Arial" w:hAnsi="Arial" w:cs="Arial"/>
+          <w:b/>
+          <w:bCs/>
+          <w:sz w:val="28"/>
+          <w:szCs w:val="28"/>
+        </w:rPr>
+      </w:pPr>
+      <w:r>
+        <w:rPr>
+          <w:rFonts w:ascii="Arial" w:hAnsi="Arial" w:cs="Arial"/>
+          <w:b/>
+          <w:bCs/>
+          <w:noProof/>
+          <w:sz w:val="28"/>
+          <w:szCs w:val="28"/>
+        </w:rPr>
+        <w:lastRenderedPageBreak/>
+        <w:drawing>
+          <wp:inline distT="0" distB="0" distL="0" distR="0" wp14:anchorId="46C8ABED" wp14:editId="40B5D424">
+            <wp:extent cx="5943600" cy="3830955"/>
+            <wp:effectExtent l="0" t="0" r="0" b="0"/>
+            <wp:docPr id="295223791" name="Picture 11"/>
+            <wp:cNvGraphicFramePr>
+              <a:graphicFrameLocks xmlns:a="http://schemas.openxmlformats.org/drawingml/2006/main" noChangeAspect="1"/>
+            </wp:cNvGraphicFramePr>
+            <a:graphic xmlns:a="http://schemas.openxmlformats.org/drawingml/2006/main">
+              <a:graphicData uri="http://schemas.openxmlformats.org/drawingml/2006/picture">
+                <pic:pic xmlns:pic="http://schemas.openxmlformats.org/drawingml/2006/picture">
+                  <pic:nvPicPr>
+                    <pic:cNvPr id="295223791" name="Picture 295223791"/>
+                    <pic:cNvPicPr/>
+                  </pic:nvPicPr>
+                  <pic:blipFill>
+                    <a:blip r:embed="rId15">
+                      <a:extLst>
+                        <a:ext uri="{28A0092B-C50C-407E-A947-70E740481C1C}">
+                          <a14:useLocalDpi xmlns:a14="http://schemas.microsoft.com/office/drawing/2010/main" val="0"/>
+                        </a:ext>
+                      </a:extLst>
+                    </a:blip>
+                    <a:stretch>
+                      <a:fillRect/>
+                    </a:stretch>
+                  </pic:blipFill>
+                  <pic:spPr>
+                    <a:xfrm>
+                      <a:off x="0" y="0"/>
+                      <a:ext cx="5943600" cy="3830955"/>
+                    </a:xfrm>
+                    <a:prstGeom prst="rect">
+                      <a:avLst/>
+                    </a:prstGeom>
+                  </pic:spPr>
+                </pic:pic>
+              </a:graphicData>
+            </a:graphic>
+          </wp:inline>
+        </w:drawing>
+      </w:r>
+    </w:p>
+    <w:p>
+      <w:pPr>
+        <w:ind w:firstLine="720"/>
+        <w:rPr>
+          <w:rFonts w:ascii="Arial" w:hAnsi="Arial" w:cs="Arial"/>
+          <w:b/>
+          <w:bCs/>
+          <w:sz w:val="28"/>
+          <w:szCs w:val="28"/>
+        </w:rPr>
+      </w:pPr>
+    </w:p>
+    <w:p>
+      <w:pPr>
+        <w:ind w:firstLine="720"/>
+        <w:rPr>
+          <w:rFonts w:ascii="Arial" w:hAnsi="Arial" w:cs="Arial"/>
+          <w:b/>
+          <w:bCs/>
+          <w:sz w:val="28"/>
+          <w:szCs w:val="28"/>
+        </w:rPr>
+      </w:pPr>
+      <w:r>
+        <w:rPr>
+          <w:rFonts w:ascii="Arial" w:hAnsi="Arial" w:cs="Arial"/>
+          <w:b/>
+          <w:bCs/>
+          <w:sz w:val="28"/>
+          <w:szCs w:val="28"/>
+        </w:rPr>
+        <w:t>UCDD-SRP.</w:t>
+      </w:r>
+    </w:p>
+    <w:p>
+      <w:pPr>
+        <w:ind w:firstLine="720"/>
+        <w:rPr>
+          <w:rFonts w:ascii="Arial" w:hAnsi="Arial" w:cs="Arial"/>
+          <w:b/>
+          <w:bCs/>
+          <w:sz w:val="28"/>
+          <w:szCs w:val="28"/>
+        </w:rPr>
+      </w:pPr>
+      <w:r>
+        <w:rPr>
+          <w:rFonts w:ascii="Arial" w:hAnsi="Arial" w:cs="Arial"/>
+          <w:b/>
+          <w:bCs/>
+          <w:noProof/>
+          <w:sz w:val="28"/>
+          <w:szCs w:val="28"/>
+        </w:rPr>
+        <w:drawing>
+          <wp:inline distT="0" distB="0" distL="0" distR="0" wp14:anchorId="2A817FF6" wp14:editId="4B89062C">
+            <wp:extent cx="5943600" cy="2162810"/>
+            <wp:effectExtent l="0" t="0" r="0" b="8890"/>
+            <wp:docPr id="1652348872" name="Picture 12"/>
+            <wp:cNvGraphicFramePr>
+              <a:graphicFrameLocks xmlns:a="http://schemas.openxmlformats.org/drawingml/2006/main" noChangeAspect="1"/>
+            </wp:cNvGraphicFramePr>
+            <a:graphic xmlns:a="http://schemas.openxmlformats.org/drawingml/2006/main">
+              <a:graphicData uri="http://schemas.openxmlformats.org/drawingml/2006/picture">
+                <pic:pic xmlns:pic="http://schemas.openxmlformats.org/drawingml/2006/picture">
+                  <pic:nvPicPr>
+                    <pic:cNvPr id="1652348872" name="Picture 1652348872"/>
+                    <pic:cNvPicPr/>
+                  </pic:nvPicPr>
+                  <pic:blipFill>
+                    <a:blip r:embed="rId16">
+                      <a:extLst>
+                        <a:ext uri="{28A0092B-C50C-407E-A947-70E740481C1C}">
+                          <a14:useLocalDpi xmlns:a14="http://schemas.microsoft.com/office/drawing/2010/main" val="0"/>
+                        </a:ext>
+                      </a:extLst>
+                    </a:blip>
+                    <a:stretch>
+                      <a:fillRect/>
+                    </a:stretch>
+                  </pic:blipFill>
+                  <pic:spPr>
+                    <a:xfrm>
+                      <a:off x="0" y="0"/>
+                      <a:ext cx="5943600" cy="2162810"/>
+                    </a:xfrm>
+                    <a:prstGeom prst="rect">
+                      <a:avLst/>
+                    </a:prstGeom>
+                  </pic:spPr>
+                </pic:pic>
+              </a:graphicData>
+            </a:graphic>
+          </wp:inline>
+        </w:drawing>
+      </w:r>
+    </w:p>
+    <w:p>
+      <w:pPr>
+        <w:ind w:firstLine="720"/>
+        <w:rPr>
+          <w:rFonts w:ascii="Arial" w:hAnsi="Arial" w:cs="Arial"/>
+          <w:b/>
+          <w:bCs/>
+          <w:sz w:val="28"/>
+          <w:szCs w:val="28"/>
+        </w:rPr>
+      </w:pPr>
+    </w:p>
+    <w:p>
+      <w:pPr>
+        <w:ind w:firstLine="720"/>
+        <w:rPr>
+          <w:rFonts w:ascii="Arial" w:hAnsi="Arial" w:cs="Arial"/>
+          <w:b/>
+          <w:bCs/>
+          <w:sz w:val="28"/>
+          <w:szCs w:val="28"/>
+        </w:rPr>
+      </w:pPr>
+      <w:r>
+        <w:rPr>
+          <w:rFonts w:ascii="Arial" w:hAnsi="Arial" w:cs="Arial"/>
+          <w:b/>
+          <w:bCs/>
+          <w:sz w:val="28"/>
+          <w:szCs w:val="28"/>
+        </w:rPr>
+        <w:t>UCDD-BUR.</w:t>
+      </w:r>
+    </w:p>
+    <w:p>
+      <w:pPr>
+        <w:ind w:firstLine="720"/>
+        <w:rPr>
+          <w:rFonts w:ascii="Arial" w:hAnsi="Arial" w:cs="Arial"/>
+          <w:b/>
+          <w:bCs/>
+          <w:sz w:val="28"/>
+          <w:szCs w:val="28"/>
+        </w:rPr>
+      </w:pPr>
+      <w:r>
+        <w:rPr>
+          <w:rFonts w:ascii="Arial" w:hAnsi="Arial" w:cs="Arial"/>
+          <w:b/>
+          <w:bCs/>
+          <w:noProof/>
+          <w:sz w:val="28"/>
+          <w:szCs w:val="28"/>
+        </w:rPr>
+        <w:lastRenderedPageBreak/>
+        <w:drawing>
+          <wp:inline distT="0" distB="0" distL="0" distR="0" wp14:anchorId="3DAB011C" wp14:editId="55F9ADFF">
+            <wp:extent cx="4772025" cy="2914650"/>
+            <wp:effectExtent l="0" t="0" r="9525" b="0"/>
+            <wp:docPr id="1051813145" name="Picture 13"/>
+            <wp:cNvGraphicFramePr>
+              <a:graphicFrameLocks xmlns:a="http://schemas.openxmlformats.org/drawingml/2006/main" noChangeAspect="1"/>
+            </wp:cNvGraphicFramePr>
+            <a:graphic xmlns:a="http://schemas.openxmlformats.org/drawingml/2006/main">
+              <a:graphicData uri="http://schemas.openxmlformats.org/drawingml/2006/picture">
+                <pic:pic xmlns:pic="http://schemas.openxmlformats.org/drawingml/2006/picture">
+                  <pic:nvPicPr>
+                    <pic:cNvPr id="1051813145" name="Picture 1051813145"/>
+                    <pic:cNvPicPr/>
+                  </pic:nvPicPr>
+                  <pic:blipFill>
+                    <a:blip r:embed="rId17">
+                      <a:extLst>
+                        <a:ext uri="{28A0092B-C50C-407E-A947-70E740481C1C}">
+                          <a14:useLocalDpi xmlns:a14="http://schemas.microsoft.com/office/drawing/2010/main" val="0"/>
+                        </a:ext>
+                      </a:extLst>
+                    </a:blip>
+                    <a:stretch>
+                      <a:fillRect/>
+                    </a:stretch>
+                  </pic:blipFill>
+                  <pic:spPr>
+                    <a:xfrm>
+                      <a:off x="0" y="0"/>
+                      <a:ext cx="4772025" cy="2914650"/>
+                    </a:xfrm>
+                    <a:prstGeom prst="rect">
+                      <a:avLst/>
+                    </a:prstGeom>
+                  </pic:spPr>
+                </pic:pic>
+              </a:graphicData>
+            </a:graphic>
+          </wp:inline>
+        </w:drawing>
+      </w:r>
+    </w:p>
+    <w:p>
+      <w:pPr>
+        <w:ind w:firstLine="720"/>
+        <w:rPr>
+          <w:rFonts w:ascii="Arial" w:hAnsi="Arial" w:cs="Arial"/>
+          <w:b/>
+          <w:bCs/>
+          <w:sz w:val="28"/>
+          <w:szCs w:val="28"/>
+        </w:rPr>
+      </w:pPr>
+    </w:p>
+    <w:p>
+      <w:pPr>
+        <w:ind w:firstLine="720"/>
+        <w:rPr>
+          <w:rFonts w:ascii="Arial" w:hAnsi="Arial" w:cs="Arial"/>
+          <w:b/>
+          <w:bCs/>
+          <w:sz w:val="28"/>
+          <w:szCs w:val="28"/>
+        </w:rPr>
+      </w:pPr>
+      <w:r>
+        <w:rPr>
+          <w:rFonts w:ascii="Arial" w:hAnsi="Arial" w:cs="Arial"/>
+          <w:b/>
+          <w:bCs/>
+          <w:sz w:val="28"/>
+          <w:szCs w:val="28"/>
+        </w:rPr>
+        <w:t>UCDD-DASH.</w:t>
+      </w:r>
+    </w:p>
+    <w:p>
+      <w:pPr>
+        <w:ind w:firstLine="720"/>
+        <w:rPr>
+          <w:rFonts w:ascii="Arial" w:hAnsi="Arial" w:cs="Arial"/>
+          <w:b/>
+          <w:bCs/>
+          <w:sz w:val="28"/>
+          <w:szCs w:val="28"/>
+        </w:rPr>
+      </w:pPr>
+      <w:r>
+        <w:rPr>
+          <w:rFonts w:ascii="Arial" w:hAnsi="Arial" w:cs="Arial"/>
+          <w:b/>
+          <w:bCs/>
+          <w:noProof/>
+          <w:sz w:val="28"/>
+          <w:szCs w:val="28"/>
+        </w:rPr>
+        <w:drawing>
+          <wp:inline distT="0" distB="0" distL="0" distR="0" wp14:anchorId="60026409" wp14:editId="71A6197F">
+            <wp:extent cx="4676775" cy="2247900"/>
+            <wp:effectExtent l="0" t="0" r="9525" b="0"/>
+            <wp:docPr id="921280598" name="Picture 14"/>
+            <wp:cNvGraphicFramePr>
+              <a:graphicFrameLocks xmlns:a="http://schemas.openxmlformats.org/drawingml/2006/main" noChangeAspect="1"/>
+            </wp:cNvGraphicFramePr>
+            <a:graphic xmlns:a="http://schemas.openxmlformats.org/drawingml/2006/main">
+              <a:graphicData uri="http://schemas.openxmlformats.org/drawingml/2006/picture">
+                <pic:pic xmlns:pic="http://schemas.openxmlformats.org/drawingml/2006/picture">
+                  <pic:nvPicPr>
+                    <pic:cNvPr id="921280598" name="Picture 921280598"/>
+                    <pic:cNvPicPr/>
+                  </pic:nvPicPr>
+                  <pic:blipFill>
+                    <a:blip r:embed="rId18">
+                      <a:extLst>
+                        <a:ext uri="{28A0092B-C50C-407E-A947-70E740481C1C}">
+                          <a14:useLocalDpi xmlns:a14="http://schemas.microsoft.com/office/drawing/2010/main" val="0"/>
+                        </a:ext>
+                      </a:extLst>
+                    </a:blip>
+                    <a:stretch>
+                      <a:fillRect/>
+                    </a:stretch>
+                  </pic:blipFill>
+                  <pic:spPr>
+                    <a:xfrm>
+                      <a:off x="0" y="0"/>
+                      <a:ext cx="4676775" cy="2247900"/>
+                    </a:xfrm>
+                    <a:prstGeom prst="rect">
+                      <a:avLst/>
+                    </a:prstGeom>
+                  </pic:spPr>
+                </pic:pic>
+              </a:graphicData>
+            </a:graphic>
+          </wp:inline>
+        </w:drawing>
+      </w:r>
+    </w:p>
+    <w:p>
+      <w:pPr>
+        <w:ind w:firstLine="720"/>
+        <w:rPr>
+          <w:rFonts w:ascii="Arial" w:hAnsi="Arial" w:cs="Arial"/>
+          <w:b/>
+          <w:bCs/>
+          <w:sz w:val="28"/>
+          <w:szCs w:val="28"/>
+        </w:rPr>
+      </w:pPr>
+    </w:p>
+    <w:p>
+      <w:pPr>
+        <w:ind w:firstLine="720"/>
+        <w:rPr>
+          <w:rFonts w:ascii="Arial" w:hAnsi="Arial" w:cs="Arial"/>
+          <w:b/>
+          <w:bCs/>
+          <w:sz w:val="28"/>
+          <w:szCs w:val="28"/>
+        </w:rPr>
+      </w:pPr>
+      <w:r>
+        <w:rPr>
+          <w:rFonts w:ascii="Arial" w:hAnsi="Arial" w:cs="Arial"/>
+          <w:b/>
+          <w:bCs/>
+          <w:sz w:val="28"/>
+          <w:szCs w:val="28"/>
+        </w:rPr>
+        <w:t>UCDD-WRE.</w:t>
+      </w:r>
+    </w:p>
+    <w:p>
+      <w:pPr>
+        <w:ind w:firstLine="720"/>
+        <w:rPr>
+          <w:rFonts w:ascii="Arial" w:hAnsi="Arial" w:cs="Arial"/>
+          <w:b/>
+          <w:bCs/>
+          <w:sz w:val="28"/>
+          <w:szCs w:val="28"/>
+        </w:rPr>
+      </w:pPr>
+      <w:r>
+        <w:rPr>
+          <w:rFonts w:ascii="Arial" w:hAnsi="Arial" w:cs="Arial"/>
+          <w:b/>
+          <w:bCs/>
+          <w:noProof/>
+          <w:sz w:val="28"/>
+          <w:szCs w:val="28"/>
+        </w:rPr>
+        <w:lastRenderedPageBreak/>
+        <w:drawing>
+          <wp:inline distT="0" distB="0" distL="0" distR="0" wp14:anchorId="4A06351F" wp14:editId="6D7180C2">
+            <wp:extent cx="5210175" cy="3962400"/>
+            <wp:effectExtent l="0" t="0" r="9525" b="0"/>
+            <wp:docPr id="70849465" name="Picture 15"/>
+            <wp:cNvGraphicFramePr>
+              <a:graphicFrameLocks xmlns:a="http://schemas.openxmlformats.org/drawingml/2006/main" noChangeAspect="1"/>
+            </wp:cNvGraphicFramePr>
+            <a:graphic xmlns:a="http://schemas.openxmlformats.org/drawingml/2006/main">
+              <a:graphicData uri="http://schemas.openxmlformats.org/drawingml/2006/picture">
+                <pic:pic xmlns:pic="http://schemas.openxmlformats.org/drawingml/2006/picture">
+                  <pic:nvPicPr>
+                    <pic:cNvPr id="70849465" name="Picture 70849465"/>
+                    <pic:cNvPicPr/>
+                  </pic:nvPicPr>
+                  <pic:blipFill>
+                    <a:blip r:embed="rId19">
+                      <a:extLst>
+                        <a:ext uri="{28A0092B-C50C-407E-A947-70E740481C1C}">
+                          <a14:useLocalDpi xmlns:a14="http://schemas.microsoft.com/office/drawing/2010/main" val="0"/>
+                        </a:ext>
+                      </a:extLst>
+                    </a:blip>
+                    <a:stretch>
+                      <a:fillRect/>
+                    </a:stretch>
+                  </pic:blipFill>
+                  <pic:spPr>
+                    <a:xfrm>
+                      <a:off x="0" y="0"/>
+                      <a:ext cx="5210175" cy="3962400"/>
+                    </a:xfrm>
+                    <a:prstGeom prst="rect">
+                      <a:avLst/>
+                    </a:prstGeom>
+                  </pic:spPr>
+                </pic:pic>
+              </a:graphicData>
+            </a:graphic>
+          </wp:inline>
+        </w:drawing>
+      </w:r>
+    </w:p>
+    <w:p>
+      <w:pPr>
+        <w:ind w:firstLine="720"/>
+        <w:rPr>
+          <w:rFonts w:ascii="Arial" w:hAnsi="Arial" w:cs="Arial"/>
+          <w:b/>
+          <w:bCs/>
+          <w:sz w:val="28"/>
+          <w:szCs w:val="28"/>
+        </w:rPr>
+      </w:pPr>
     </w:p>
     <w:p>
       <w:pPr>

</xml_diff>